<commit_message>
Update documents: modified and removed files
</commit_message>
<xml_diff>
--- a/Задача від 14.10.2026 переклад французька/1. Общие справки и систематизация материалов/20250625 Note sur la procedure penale ukrainienne.docx
+++ b/Задача від 14.10.2026 переклад французька/1. Общие справки и систематизация материалов/20250625 Note sur la procedure penale ukrainienne.docx
@@ -508,7 +508,7 @@
                 <w:rFonts w:ascii="Cambria" w:hAnsi="Cambria" w:cs="Cambria"/>
                 <w:sz w:val="22"/>
               </w:rPr>
-              <w:t>Boguslayev O.V. [AVB — Anton Boguslayev] (art. 209 al. 3 du CP)</w:t>
+              <w:t>Boguslayev O.V. [AVB — Oleksandr Boguslayev] (art. 209 al. 3 du CP)</w:t>
               <w:br/>
               <w:t>Boguslayev V.O. [VAB] (art. 191 al. 5, art. 209 al. 3 du CP)</w:t>
             </w:r>
@@ -9059,7 +9059,7 @@
         <w:spacing w:before="120" w:after="0" w:line="240" w:lineRule="auto"/>
       </w:pPr>
       <w:r>
-        <w:t>201 565 actions (9,69 %) — SARL « Motor-Intercoms », propriétaire de la société Croftdale Investments Limited, détenue depuis le 30/03/2015 par Calloway Finance Limited, UBO — AVB ;</w:t>
+        <w:t>201 565 actions (9,69 %) — SARL « Motor-Intercoms », dont le propriétaire est Croftdale Investments Limited, elle-même détenue depuis le 30/03/2015 par Calloway Finance Limited, UBO — AVB ;</w:t>
       </w:r>
     </w:p>
     <w:p>
@@ -13921,7 +13921,7 @@
         <w:spacing w:before="120" w:after="0" w:line="240" w:lineRule="auto"/>
       </w:pPr>
       <w:r>
-        <w:t>Le 30.02.2024, par ordonnance du tribunal de district Shevchenkivskyi, un accès temporaire aux pièces et documents en possession de l'établissement bancaire EFG Bank (Luxembourg) — ayant droit de la banque agent séquestre UBI Banca International SA — a été accordé.</w:t>
+        <w:t>Le 30.02.2024 [sic], par ordonnance du tribunal de district Shevchenkivskyi, un accès temporaire aux pièces et documents en possession de l'établissement bancaire EFG Bank (Luxembourg) — ayant droit de la banque agent séquestre UBI Banca International SA — a été accordé.</w:t>
       </w:r>
     </w:p>
     <w:p>

</xml_diff>

<commit_message>
Update repository files and documents
</commit_message>
<xml_diff>
--- a/Задача від 14.10.2026 переклад французька/1. Общие справки и систематизация материалов/20250625 Note sur la procedure penale ukrainienne.docx
+++ b/Задача від 14.10.2026 переклад французька/1. Общие справки и систематизация материалов/20250625 Note sur la procedure penale ukrainienne.docx
@@ -13,7 +13,7 @@
           <w:szCs w:val="22"/>
           <w:lang w:val="uk-UA"/>
         </w:rPr>
-        <w:spacing w:before="120" w:after="0" w:line="240" w:lineRule="auto"/>
+        <w:spacing w:before="120" w:after="0" w:line="276" w:lineRule="auto"/>
       </w:pPr>
       <w:bookmarkStart w:id="0" w:name="_Hlk171030646"/>
       <w:r>
@@ -95,7 +95,7 @@
           <w:szCs w:val="22"/>
           <w:lang w:val="uk-UA"/>
         </w:rPr>
-        <w:spacing w:before="120" w:after="0" w:line="240" w:lineRule="auto"/>
+        <w:spacing w:before="120" w:after="0" w:line="276" w:lineRule="auto"/>
       </w:pPr>
     </w:p>
     <w:tbl>
@@ -162,7 +162,7 @@
                 <w:szCs w:val="22"/>
                 <w:lang w:val="uk-UA"/>
               </w:rPr>
-              <w:t>N° 22017000000000272 du 06/07/2017</w:t>
+              <w:t>N° 22017000000000272 du 6 juillet 2017</w:t>
             </w:r>
           </w:p>
         </w:tc>
@@ -454,6 +454,7 @@
             <w:tcW w:w="4842" w:type="dxa"/>
           </w:tcPr>
           <w:p>
+            <w:pPr/>
             <w:r>
               <w:t>Art. 191 al. 5 du CP d'Ukraine (détournement d'actifs par abus de fonctions à une échelle particulièrement importante)</w:t>
               <w:br/>
@@ -525,7 +526,7 @@
           <w:szCs w:val="22"/>
           <w:lang w:val="uk-UA"/>
         </w:rPr>
-        <w:spacing w:before="120" w:after="0" w:line="240" w:lineRule="auto"/>
+        <w:spacing w:before="120" w:after="0" w:line="276" w:lineRule="auto"/>
       </w:pPr>
       <w:r>
         <w:rPr>
@@ -552,7 +553,7 @@
           <w:lang w:val="uk-UA"/>
         </w:rPr>
         <w:ind w:left="567" w:hanging="567"/>
-        <w:spacing w:before="120" w:after="0" w:line="240" w:lineRule="auto"/>
+        <w:spacing w:before="120" w:after="0" w:line="276" w:lineRule="auto"/>
       </w:pPr>
       <w:r>
         <w:t>Katran Ltd (société contrôlée par AVB) ;</w:t>
@@ -575,7 +576,7 @@
           <w:lang w:val="uk-UA"/>
         </w:rPr>
         <w:ind w:left="567" w:hanging="567"/>
-        <w:spacing w:before="120" w:after="0" w:line="240" w:lineRule="auto"/>
+        <w:spacing w:before="120" w:after="0" w:line="276" w:lineRule="auto"/>
       </w:pPr>
       <w:r>
         <w:rPr>
@@ -602,7 +603,7 @@
           <w:lang w:val="uk-UA"/>
         </w:rPr>
         <w:ind w:left="567" w:hanging="567"/>
-        <w:spacing w:before="120" w:after="0" w:line="240" w:lineRule="auto"/>
+        <w:spacing w:before="120" w:after="0" w:line="276" w:lineRule="auto"/>
       </w:pPr>
       <w:r>
         <w:rPr>
@@ -629,7 +630,7 @@
           <w:lang w:val="uk-UA"/>
         </w:rPr>
         <w:ind w:left="567" w:hanging="567"/>
-        <w:spacing w:before="120" w:after="0" w:line="240" w:lineRule="auto"/>
+        <w:spacing w:before="120" w:after="0" w:line="276" w:lineRule="auto"/>
       </w:pPr>
       <w:r>
         <w:rPr>
@@ -656,7 +657,7 @@
           <w:lang w:val="uk-UA"/>
         </w:rPr>
         <w:ind w:left="567" w:hanging="567"/>
-        <w:spacing w:before="120" w:after="0" w:line="240" w:lineRule="auto"/>
+        <w:spacing w:before="120" w:after="0" w:line="276" w:lineRule="auto"/>
       </w:pPr>
       <w:r>
         <w:rPr>
@@ -683,7 +684,7 @@
           <w:lang w:val="uk-UA"/>
         </w:rPr>
         <w:ind w:left="567" w:hanging="567"/>
-        <w:spacing w:before="120" w:after="0" w:line="240" w:lineRule="auto"/>
+        <w:spacing w:before="120" w:after="0" w:line="276" w:lineRule="auto"/>
       </w:pPr>
       <w:r>
         <w:rPr>
@@ -710,7 +711,7 @@
           <w:lang w:val="uk-UA"/>
         </w:rPr>
         <w:ind w:left="567" w:hanging="567"/>
-        <w:spacing w:before="120" w:after="0" w:line="240" w:lineRule="auto"/>
+        <w:spacing w:before="120" w:after="0" w:line="276" w:lineRule="auto"/>
       </w:pPr>
       <w:r>
         <w:rPr>
@@ -737,7 +738,7 @@
           <w:lang w:val="uk-UA"/>
         </w:rPr>
         <w:ind w:left="567" w:hanging="567"/>
-        <w:spacing w:before="120" w:after="0" w:line="240" w:lineRule="auto"/>
+        <w:spacing w:before="120" w:after="0" w:line="276" w:lineRule="auto"/>
       </w:pPr>
       <w:r>
         <w:rPr>
@@ -764,7 +765,7 @@
           <w:lang w:val="uk-UA"/>
         </w:rPr>
         <w:ind w:left="567" w:hanging="567"/>
-        <w:spacing w:before="120" w:after="0" w:line="240" w:lineRule="auto"/>
+        <w:spacing w:before="120" w:after="0" w:line="276" w:lineRule="auto"/>
       </w:pPr>
       <w:r>
         <w:rPr>
@@ -791,7 +792,7 @@
           <w:lang w:val="uk-UA"/>
         </w:rPr>
         <w:ind w:left="567" w:hanging="567"/>
-        <w:spacing w:before="120" w:after="0" w:line="240" w:lineRule="auto"/>
+        <w:spacing w:before="120" w:after="0" w:line="276" w:lineRule="auto"/>
       </w:pPr>
       <w:r>
         <w:rPr>
@@ -818,7 +819,7 @@
           <w:lang w:val="uk-UA"/>
         </w:rPr>
         <w:ind w:left="567" w:hanging="567"/>
-        <w:spacing w:before="120" w:after="0" w:line="240" w:lineRule="auto"/>
+        <w:spacing w:before="120" w:after="0" w:line="276" w:lineRule="auto"/>
       </w:pPr>
       <w:r>
         <w:rPr>
@@ -845,7 +846,7 @@
           <w:lang w:val="uk-UA"/>
         </w:rPr>
         <w:ind w:left="567" w:hanging="567"/>
-        <w:spacing w:before="120" w:after="0" w:line="240" w:lineRule="auto"/>
+        <w:spacing w:before="120" w:after="0" w:line="276" w:lineRule="auto"/>
       </w:pPr>
       <w:r>
         <w:rPr>
@@ -872,7 +873,7 @@
           <w:lang w:val="uk-UA"/>
         </w:rPr>
         <w:ind w:left="567" w:hanging="567"/>
-        <w:spacing w:before="120" w:after="0" w:line="240" w:lineRule="auto"/>
+        <w:spacing w:before="120" w:after="0" w:line="276" w:lineRule="auto"/>
       </w:pPr>
       <w:r>
         <w:rPr>
@@ -899,7 +900,7 @@
           <w:lang w:val="uk-UA"/>
         </w:rPr>
         <w:ind w:left="567" w:hanging="567"/>
-        <w:spacing w:before="120" w:after="0" w:line="240" w:lineRule="auto"/>
+        <w:spacing w:before="120" w:after="0" w:line="276" w:lineRule="auto"/>
       </w:pPr>
       <w:r>
         <w:rPr>
@@ -926,7 +927,7 @@
           <w:lang w:val="uk-UA"/>
         </w:rPr>
         <w:ind w:left="567" w:hanging="567"/>
-        <w:spacing w:before="120" w:after="0" w:line="240" w:lineRule="auto"/>
+        <w:spacing w:before="120" w:after="0" w:line="276" w:lineRule="auto"/>
       </w:pPr>
       <w:r>
         <w:rPr>
@@ -953,7 +954,7 @@
           <w:lang w:val="uk-UA"/>
         </w:rPr>
         <w:ind w:left="567" w:hanging="567"/>
-        <w:spacing w:before="120" w:after="0" w:line="240" w:lineRule="auto"/>
+        <w:spacing w:before="120" w:after="0" w:line="276" w:lineRule="auto"/>
       </w:pPr>
       <w:r>
         <w:rPr>
@@ -980,7 +981,7 @@
           <w:lang w:val="uk-UA"/>
         </w:rPr>
         <w:ind w:left="567" w:hanging="567"/>
-        <w:spacing w:before="120" w:after="0" w:line="240" w:lineRule="auto"/>
+        <w:spacing w:before="120" w:after="0" w:line="276" w:lineRule="auto"/>
       </w:pPr>
       <w:r>
         <w:rPr>
@@ -1006,7 +1007,7 @@
           <w:lang w:val="uk-UA"/>
         </w:rPr>
         <w:ind w:left="567" w:hanging="567"/>
-        <w:spacing w:before="120" w:after="0" w:line="240" w:lineRule="auto"/>
+        <w:spacing w:before="120" w:after="0" w:line="276" w:lineRule="auto"/>
       </w:pPr>
       <w:r>
         <w:rPr>
@@ -1032,7 +1033,7 @@
           <w:lang w:val="uk-UA"/>
         </w:rPr>
         <w:ind w:left="567" w:hanging="567"/>
-        <w:spacing w:before="120" w:after="0" w:line="240" w:lineRule="auto"/>
+        <w:spacing w:before="120" w:after="0" w:line="276" w:lineRule="auto"/>
       </w:pPr>
       <w:r>
         <w:rPr>
@@ -1058,7 +1059,7 @@
           <w:lang w:val="uk-UA"/>
         </w:rPr>
         <w:ind w:left="567" w:hanging="567"/>
-        <w:spacing w:before="120" w:after="0" w:line="240" w:lineRule="auto"/>
+        <w:spacing w:before="120" w:after="0" w:line="276" w:lineRule="auto"/>
       </w:pPr>
       <w:r>
         <w:rPr>
@@ -1084,7 +1085,7 @@
           <w:lang w:val="uk-UA"/>
         </w:rPr>
         <w:ind w:left="567" w:hanging="567"/>
-        <w:spacing w:before="120" w:after="0" w:line="240" w:lineRule="auto"/>
+        <w:spacing w:before="120" w:after="0" w:line="276" w:lineRule="auto"/>
       </w:pPr>
       <w:r>
         <w:rPr>
@@ -1110,7 +1111,7 @@
           <w:lang w:val="uk-UA"/>
         </w:rPr>
         <w:ind w:left="567" w:hanging="567"/>
-        <w:spacing w:before="120" w:after="0" w:line="240" w:lineRule="auto"/>
+        <w:spacing w:before="120" w:after="0" w:line="276" w:lineRule="auto"/>
       </w:pPr>
       <w:r>
         <w:rPr>
@@ -1136,7 +1137,7 @@
           <w:lang w:val="uk-UA"/>
         </w:rPr>
         <w:ind w:left="567" w:hanging="567"/>
-        <w:spacing w:before="120" w:after="0" w:line="240" w:lineRule="auto"/>
+        <w:spacing w:before="120" w:after="0" w:line="276" w:lineRule="auto"/>
       </w:pPr>
       <w:r>
         <w:rPr>
@@ -1162,7 +1163,7 @@
           <w:lang w:val="uk-UA"/>
         </w:rPr>
         <w:ind w:left="567" w:hanging="567"/>
-        <w:spacing w:before="120" w:after="0" w:line="240" w:lineRule="auto"/>
+        <w:spacing w:before="120" w:after="0" w:line="276" w:lineRule="auto"/>
       </w:pPr>
       <w:r>
         <w:rPr>
@@ -1188,7 +1189,7 @@
           <w:lang w:val="uk-UA"/>
         </w:rPr>
         <w:ind w:left="567" w:hanging="567"/>
-        <w:spacing w:before="120" w:after="0" w:line="240" w:lineRule="auto"/>
+        <w:spacing w:before="120" w:after="0" w:line="276" w:lineRule="auto"/>
       </w:pPr>
       <w:r>
         <w:rPr>
@@ -1214,7 +1215,7 @@
           <w:lang w:val="uk-UA"/>
         </w:rPr>
         <w:ind w:left="567" w:hanging="567"/>
-        <w:spacing w:before="120" w:after="0" w:line="240" w:lineRule="auto"/>
+        <w:spacing w:before="120" w:after="0" w:line="276" w:lineRule="auto"/>
       </w:pPr>
       <w:r>
         <w:rPr>
@@ -1240,7 +1241,7 @@
           <w:lang w:val="uk-UA"/>
         </w:rPr>
         <w:ind w:left="567" w:hanging="567"/>
-        <w:spacing w:before="120" w:after="0" w:line="240" w:lineRule="auto"/>
+        <w:spacing w:before="120" w:after="0" w:line="276" w:lineRule="auto"/>
       </w:pPr>
       <w:r>
         <w:rPr>
@@ -1266,7 +1267,7 @@
           <w:lang w:val="uk-UA"/>
         </w:rPr>
         <w:ind w:left="567" w:hanging="567"/>
-        <w:spacing w:before="120" w:after="0" w:line="240" w:lineRule="auto"/>
+        <w:spacing w:before="120" w:after="0" w:line="276" w:lineRule="auto"/>
       </w:pPr>
       <w:r>
         <w:rPr>
@@ -1292,7 +1293,7 @@
           <w:lang w:val="uk-UA"/>
         </w:rPr>
         <w:ind w:left="567" w:hanging="567"/>
-        <w:spacing w:before="120" w:after="0" w:line="240" w:lineRule="auto"/>
+        <w:spacing w:before="120" w:after="0" w:line="276" w:lineRule="auto"/>
       </w:pPr>
       <w:r>
         <w:rPr>
@@ -1318,7 +1319,7 @@
           <w:lang w:val="uk-UA"/>
         </w:rPr>
         <w:ind w:left="567" w:hanging="567"/>
-        <w:spacing w:before="120" w:after="0" w:line="240" w:lineRule="auto"/>
+        <w:spacing w:before="120" w:after="0" w:line="276" w:lineRule="auto"/>
       </w:pPr>
       <w:r>
         <w:rPr>
@@ -1343,7 +1344,7 @@
           <w:lang w:val="uk-UA"/>
         </w:rPr>
         <w:ind w:left="567" w:hanging="567"/>
-        <w:spacing w:before="120" w:after="0" w:line="240" w:lineRule="auto"/>
+        <w:spacing w:before="120" w:after="0" w:line="276" w:lineRule="auto"/>
       </w:pPr>
       <w:r>
         <w:rPr>
@@ -1368,7 +1369,7 @@
           <w:lang w:val="uk-UA"/>
         </w:rPr>
         <w:ind w:left="567" w:hanging="567"/>
-        <w:spacing w:before="120" w:after="0" w:line="240" w:lineRule="auto"/>
+        <w:spacing w:before="120" w:after="0" w:line="276" w:lineRule="auto"/>
       </w:pPr>
       <w:r>
         <w:rPr>
@@ -1393,7 +1394,7 @@
           <w:lang w:val="uk-UA"/>
         </w:rPr>
         <w:ind w:left="567" w:hanging="567"/>
-        <w:spacing w:before="120" w:after="0" w:line="240" w:lineRule="auto"/>
+        <w:spacing w:before="120" w:after="0" w:line="276" w:lineRule="auto"/>
       </w:pPr>
       <w:r>
         <w:rPr>
@@ -1418,7 +1419,7 @@
           <w:lang w:val="uk-UA"/>
         </w:rPr>
         <w:ind w:left="567" w:hanging="567"/>
-        <w:spacing w:before="120" w:after="0" w:line="240" w:lineRule="auto"/>
+        <w:spacing w:before="120" w:after="0" w:line="276" w:lineRule="auto"/>
       </w:pPr>
       <w:r>
         <w:rPr>
@@ -1443,7 +1444,7 @@
           <w:lang w:val="uk-UA"/>
         </w:rPr>
         <w:ind w:left="567" w:hanging="567"/>
-        <w:spacing w:before="120" w:after="0" w:line="240" w:lineRule="auto"/>
+        <w:spacing w:before="120" w:after="0" w:line="276" w:lineRule="auto"/>
       </w:pPr>
       <w:r>
         <w:rPr>
@@ -1468,7 +1469,7 @@
           <w:lang w:val="uk-UA"/>
         </w:rPr>
         <w:ind w:left="567" w:hanging="567"/>
-        <w:spacing w:before="120" w:after="0" w:line="240" w:lineRule="auto"/>
+        <w:spacing w:before="120" w:after="0" w:line="276" w:lineRule="auto"/>
       </w:pPr>
       <w:r>
         <w:rPr>
@@ -1493,7 +1494,7 @@
           <w:lang w:val="uk-UA"/>
         </w:rPr>
         <w:ind w:left="567" w:hanging="567"/>
-        <w:spacing w:before="120" w:after="0" w:line="240" w:lineRule="auto"/>
+        <w:spacing w:before="120" w:after="0" w:line="276" w:lineRule="auto"/>
       </w:pPr>
       <w:r>
         <w:rPr>
@@ -1518,7 +1519,7 @@
           <w:lang w:val="uk-UA"/>
         </w:rPr>
         <w:ind w:left="567" w:hanging="567"/>
-        <w:spacing w:before="120" w:after="0" w:line="240" w:lineRule="auto"/>
+        <w:spacing w:before="120" w:after="0" w:line="276" w:lineRule="auto"/>
       </w:pPr>
       <w:r>
         <w:rPr>
@@ -1543,7 +1544,7 @@
           <w:lang w:val="uk-UA"/>
         </w:rPr>
         <w:ind w:left="567" w:hanging="567"/>
-        <w:spacing w:before="120" w:after="0" w:line="240" w:lineRule="auto"/>
+        <w:spacing w:before="120" w:after="0" w:line="276" w:lineRule="auto"/>
       </w:pPr>
       <w:r>
         <w:rPr>
@@ -1560,7 +1561,7 @@
           <w:szCs w:val="22"/>
           <w:lang w:val="uk-UA"/>
         </w:rPr>
-        <w:spacing w:before="120" w:after="0" w:line="240" w:lineRule="auto"/>
+        <w:spacing w:before="120" w:after="0" w:line="276" w:lineRule="auto"/>
       </w:pPr>
     </w:p>
     <w:p>
@@ -1572,7 +1573,7 @@
           <w:szCs w:val="22"/>
           <w:lang w:val="uk-UA"/>
         </w:rPr>
-        <w:spacing w:before="120" w:after="0" w:line="240" w:lineRule="auto"/>
+        <w:spacing w:before="120" w:after="0" w:line="276" w:lineRule="auto"/>
       </w:pPr>
       <w:r>
         <w:rPr>
@@ -1611,7 +1612,7 @@
           <w:szCs w:val="22"/>
           <w:lang w:val="uk-UA"/>
         </w:rPr>
-        <w:spacing w:before="120" w:after="0" w:line="240" w:lineRule="auto"/>
+        <w:spacing w:before="120" w:after="0" w:line="276" w:lineRule="auto"/>
       </w:pPr>
       <w:r>
         <w:rPr>
@@ -1662,7 +1663,7 @@
           <w:szCs w:val="22"/>
           <w:lang w:val="uk-UA"/>
         </w:rPr>
-        <w:spacing w:before="120" w:after="0" w:line="240" w:lineRule="auto"/>
+        <w:spacing w:before="120" w:after="0" w:line="276" w:lineRule="auto"/>
       </w:pPr>
       <w:r>
         <w:rPr>
@@ -1681,7 +1682,7 @@
           <w:szCs w:val="22"/>
           <w:lang w:val="uk-UA"/>
         </w:rPr>
-        <w:spacing w:before="120" w:after="0" w:line="240" w:lineRule="auto"/>
+        <w:spacing w:before="120" w:after="0" w:line="276" w:lineRule="auto"/>
       </w:pPr>
       <w:r>
         <w:rPr>
@@ -1720,16 +1721,16 @@
           <w:szCs w:val="22"/>
           <w:lang w:val="uk-UA"/>
         </w:rPr>
-        <w:spacing w:before="120" w:after="0" w:line="240" w:lineRule="auto"/>
-      </w:pPr>
-    </w:p>
-    <w:p>
-      <w:pPr>
-        <w:jc w:val="both"/>
-        <w:rPr>
-          <w:lang w:val="uk-UA"/>
-        </w:rPr>
-        <w:spacing w:before="120" w:after="0" w:line="240" w:lineRule="auto"/>
+        <w:spacing w:before="120" w:after="0" w:line="276" w:lineRule="auto"/>
+      </w:pPr>
+    </w:p>
+    <w:p>
+      <w:pPr>
+        <w:jc w:val="both"/>
+        <w:rPr>
+          <w:lang w:val="uk-UA"/>
+        </w:rPr>
+        <w:spacing w:before="120" w:after="0" w:line="276" w:lineRule="auto"/>
       </w:pPr>
       <w:r>
         <w:rPr>
@@ -1893,7 +1894,7 @@
           <w:szCs w:val="22"/>
           <w:lang w:val="uk-UA"/>
         </w:rPr>
-        <w:spacing w:before="120" w:after="0" w:line="240" w:lineRule="auto"/>
+        <w:spacing w:before="120" w:after="0" w:line="276" w:lineRule="auto"/>
       </w:pPr>
       <w:r>
         <w:rPr>
@@ -2080,7 +2081,7 @@
           <w:szCs w:val="22"/>
           <w:lang w:val="uk-UA"/>
         </w:rPr>
-        <w:spacing w:before="120" w:after="0" w:line="240" w:lineRule="auto"/>
+        <w:spacing w:before="120" w:after="0" w:line="276" w:lineRule="auto"/>
       </w:pPr>
     </w:p>
     <w:p>
@@ -2092,7 +2093,7 @@
           <w:szCs w:val="22"/>
           <w:lang w:val="uk-UA"/>
         </w:rPr>
-        <w:spacing w:before="120" w:after="0" w:line="240" w:lineRule="auto"/>
+        <w:spacing w:before="120" w:after="0" w:line="276" w:lineRule="auto"/>
       </w:pPr>
       <w:r>
         <w:rPr>
@@ -2113,7 +2114,7 @@
           <w:szCs w:val="22"/>
           <w:lang w:val="uk-UA"/>
         </w:rPr>
-        <w:spacing w:before="120" w:after="0" w:line="240" w:lineRule="auto"/>
+        <w:spacing w:before="120" w:after="0" w:line="276" w:lineRule="auto"/>
       </w:pPr>
       <w:r>
         <w:rPr>
@@ -2236,7 +2237,7 @@
           <w:szCs w:val="22"/>
           <w:lang w:val="uk-UA"/>
         </w:rPr>
-        <w:spacing w:before="120" w:after="0" w:line="240" w:lineRule="auto"/>
+        <w:spacing w:before="120" w:after="0" w:line="276" w:lineRule="auto"/>
       </w:pPr>
       <w:r>
         <w:rPr>
@@ -2577,7 +2578,7 @@
           <w:szCs w:val="22"/>
           <w:lang w:val="uk-UA"/>
         </w:rPr>
-        <w:spacing w:before="120" w:after="0" w:line="240" w:lineRule="auto"/>
+        <w:spacing w:before="120" w:after="0" w:line="276" w:lineRule="auto"/>
       </w:pPr>
       <w:r>
         <w:rPr>
@@ -2720,7 +2721,7 @@
           <w:szCs w:val="22"/>
           <w:lang w:val="uk-UA"/>
         </w:rPr>
-        <w:spacing w:before="120" w:after="0" w:line="240" w:lineRule="auto"/>
+        <w:spacing w:before="120" w:after="0" w:line="276" w:lineRule="auto"/>
       </w:pPr>
       <w:r>
         <w:rPr>
@@ -2808,7 +2809,7 @@
           <w:szCs w:val="22"/>
           <w:lang w:val="uk-UA"/>
         </w:rPr>
-        <w:spacing w:before="120" w:after="0" w:line="240" w:lineRule="auto"/>
+        <w:spacing w:before="120" w:after="0" w:line="276" w:lineRule="auto"/>
       </w:pPr>
     </w:p>
     <w:p>
@@ -2820,7 +2821,7 @@
           <w:szCs w:val="22"/>
           <w:lang w:val="uk-UA"/>
         </w:rPr>
-        <w:spacing w:before="120" w:after="0" w:line="240" w:lineRule="auto"/>
+        <w:spacing w:before="120" w:after="0" w:line="276" w:lineRule="auto"/>
       </w:pPr>
     </w:p>
     <w:p>
@@ -2832,7 +2833,7 @@
           <w:szCs w:val="22"/>
           <w:lang w:val="uk-UA"/>
         </w:rPr>
-        <w:spacing w:before="120" w:after="0" w:line="240" w:lineRule="auto"/>
+        <w:spacing w:before="120" w:after="0" w:line="276" w:lineRule="auto"/>
       </w:pPr>
     </w:p>
     <w:p>
@@ -2844,7 +2845,7 @@
           <w:szCs w:val="22"/>
           <w:lang w:val="uk-UA"/>
         </w:rPr>
-        <w:spacing w:before="120" w:after="0" w:line="240" w:lineRule="auto"/>
+        <w:spacing w:before="120" w:after="0" w:line="276" w:lineRule="auto"/>
       </w:pPr>
     </w:p>
     <w:p>
@@ -2857,7 +2858,7 @@
           <w:szCs w:val="22"/>
           <w:lang w:val="uk-UA"/>
         </w:rPr>
-        <w:spacing w:before="120" w:after="0" w:line="240" w:lineRule="auto"/>
+        <w:spacing w:before="120" w:after="0" w:line="276" w:lineRule="auto"/>
       </w:pPr>
       <w:r>
         <w:rPr>
@@ -2882,7 +2883,7 @@
           <w:szCs w:val="22"/>
           <w:lang w:val="uk-UA"/>
         </w:rPr>
-        <w:spacing w:before="120" w:after="0" w:line="240" w:lineRule="auto"/>
+        <w:spacing w:before="120" w:after="0" w:line="276" w:lineRule="auto"/>
       </w:pPr>
       <w:r>
         <w:rPr>
@@ -2982,7 +2983,7 @@
           <w:szCs w:val="22"/>
           <w:lang w:val="uk-UA"/>
         </w:rPr>
-        <w:spacing w:before="120" w:after="0" w:line="240" w:lineRule="auto"/>
+        <w:spacing w:before="120" w:after="0" w:line="276" w:lineRule="auto"/>
       </w:pPr>
       <w:r>
         <w:rPr>
@@ -3040,7 +3041,7 @@
           <w:szCs w:val="22"/>
           <w:lang w:val="uk-UA"/>
         </w:rPr>
-        <w:spacing w:before="120" w:after="0" w:line="240" w:lineRule="auto"/>
+        <w:spacing w:before="120" w:after="0" w:line="276" w:lineRule="auto"/>
       </w:pPr>
       <w:r>
         <w:rPr>
@@ -3059,7 +3060,7 @@
           <w:szCs w:val="22"/>
           <w:lang w:val="uk-UA"/>
         </w:rPr>
-        <w:spacing w:before="120" w:after="0" w:line="240" w:lineRule="auto"/>
+        <w:spacing w:before="120" w:after="0" w:line="276" w:lineRule="auto"/>
       </w:pPr>
       <w:r>
         <w:rPr>
@@ -3085,7 +3086,7 @@
           <w:lang w:val="uk-UA"/>
         </w:rPr>
         <w:ind w:left="567" w:hanging="567"/>
-        <w:spacing w:before="120" w:after="0" w:line="240" w:lineRule="auto"/>
+        <w:spacing w:before="120" w:after="0" w:line="276" w:lineRule="auto"/>
       </w:pPr>
       <w:proofErr w:type="spellStart"/>
       <w:r>
@@ -3157,7 +3158,7 @@
           <w:lang w:val="uk-UA"/>
         </w:rPr>
         <w:ind w:left="567" w:hanging="567"/>
-        <w:spacing w:before="120" w:after="0" w:line="240" w:lineRule="auto"/>
+        <w:spacing w:before="120" w:after="0" w:line="276" w:lineRule="auto"/>
       </w:pPr>
       <w:r>
         <w:rPr>
@@ -3201,7 +3202,7 @@
           <w:lang w:val="uk-UA"/>
         </w:rPr>
         <w:ind w:left="567" w:hanging="567"/>
-        <w:spacing w:before="120" w:after="0" w:line="240" w:lineRule="auto"/>
+        <w:spacing w:before="120" w:after="0" w:line="276" w:lineRule="auto"/>
       </w:pPr>
       <w:r>
         <w:rPr>
@@ -3227,7 +3228,7 @@
           <w:lang w:val="uk-UA"/>
         </w:rPr>
         <w:ind w:left="567" w:hanging="567"/>
-        <w:spacing w:before="120" w:after="0" w:line="240" w:lineRule="auto"/>
+        <w:spacing w:before="120" w:after="0" w:line="276" w:lineRule="auto"/>
       </w:pPr>
       <w:proofErr w:type="spellStart"/>
       <w:r>
@@ -3281,7 +3282,7 @@
           <w:lang w:val="uk-UA"/>
         </w:rPr>
         <w:ind w:left="567" w:hanging="567"/>
-        <w:spacing w:before="120" w:after="0" w:line="240" w:lineRule="auto"/>
+        <w:spacing w:before="120" w:after="0" w:line="276" w:lineRule="auto"/>
       </w:pPr>
       <w:proofErr w:type="spellStart"/>
       <w:r>
@@ -3371,7 +3372,7 @@
           <w:lang w:val="uk-UA"/>
         </w:rPr>
         <w:ind w:left="567" w:hanging="567"/>
-        <w:spacing w:before="120" w:after="0" w:line="240" w:lineRule="auto"/>
+        <w:spacing w:before="120" w:after="0" w:line="276" w:lineRule="auto"/>
       </w:pPr>
       <w:proofErr w:type="spellStart"/>
       <w:r>
@@ -3438,7 +3439,7 @@
           <w:szCs w:val="22"/>
           <w:lang w:val="uk-UA"/>
         </w:rPr>
-        <w:spacing w:before="120" w:after="0" w:line="240" w:lineRule="auto"/>
+        <w:spacing w:before="120" w:after="0" w:line="276" w:lineRule="auto"/>
       </w:pPr>
       <w:r>
         <w:rPr>
@@ -3467,44 +3468,44 @@
           <w:szCs w:val="22"/>
           <w:lang w:val="uk-UA"/>
         </w:rPr>
-        <w:spacing w:before="120" w:after="0" w:line="240" w:lineRule="auto"/>
-      </w:pPr>
-      <w:r>
-        <w:rPr>
-          <w:rFonts w:ascii="Cambria" w:hAnsi="Cambria" w:cs="Cambria"/>
-          <w:sz w:val="22"/>
-          <w:szCs w:val="22"/>
-          <w:lang w:val="uk-UA"/>
-        </w:rPr>
-        <w:t>Pour mettre son dessein à exécution, V.O. Boguslayev a organisé la minoration du capital social par le défaut d'indexation des immobilisations corporelles, l'exclusion d'une partie des biens de l'évaluation et l'usage de son influence administrative, causant à l'État un préjudice de 18,05 milliards UAH (au 16/03/2021).</w:t>
-      </w:r>
-      <w:proofErr w:type="spellStart"/>
-      <w:r>
-        <w:rPr>
-          <w:rFonts w:ascii="Cambria" w:hAnsi="Cambria" w:cs="Cambria"/>
-          <w:sz w:val="22"/>
-          <w:szCs w:val="22"/>
-          <w:lang w:val="uk-UA"/>
-        </w:rPr>
-      </w:r>
-      <w:proofErr w:type="spellEnd"/>
-      <w:r>
-        <w:rPr>
-          <w:rFonts w:ascii="Cambria" w:hAnsi="Cambria" w:cs="Cambria"/>
-          <w:sz w:val="22"/>
-          <w:szCs w:val="22"/>
-          <w:lang w:val="uk-UA"/>
-        </w:rPr>
-      </w:r>
-    </w:p>
-    <w:p>
-      <w:pPr>
-        <w:jc w:val="both"/>
-        <w:rPr>
-          <w:szCs w:val="22"/>
-          <w:lang w:val="uk-UA"/>
-        </w:rPr>
-        <w:spacing w:before="120" w:after="0" w:line="240" w:lineRule="auto"/>
+        <w:spacing w:before="120" w:after="0" w:line="276" w:lineRule="auto"/>
+      </w:pPr>
+      <w:r>
+        <w:rPr>
+          <w:rFonts w:ascii="Cambria" w:hAnsi="Cambria" w:cs="Cambria"/>
+          <w:sz w:val="22"/>
+          <w:szCs w:val="22"/>
+          <w:lang w:val="uk-UA"/>
+        </w:rPr>
+        <w:t>Pour mettre son dessein à exécution, V.O. Boguslayev a organisé la minoration du capital social par le défaut d'indexation des immobilisations corporelles, l'exclusion d'une partie des biens de l'évaluation et l'usage de son influence administrative, causant à l'État un préjudice de 18,05 milliards UAH (au 16 mars 2021).</w:t>
+      </w:r>
+      <w:proofErr w:type="spellStart"/>
+      <w:r>
+        <w:rPr>
+          <w:rFonts w:ascii="Cambria" w:hAnsi="Cambria" w:cs="Cambria"/>
+          <w:sz w:val="22"/>
+          <w:szCs w:val="22"/>
+          <w:lang w:val="uk-UA"/>
+        </w:rPr>
+      </w:r>
+      <w:proofErr w:type="spellEnd"/>
+      <w:r>
+        <w:rPr>
+          <w:rFonts w:ascii="Cambria" w:hAnsi="Cambria" w:cs="Cambria"/>
+          <w:sz w:val="22"/>
+          <w:szCs w:val="22"/>
+          <w:lang w:val="uk-UA"/>
+        </w:rPr>
+      </w:r>
+    </w:p>
+    <w:p>
+      <w:pPr>
+        <w:jc w:val="both"/>
+        <w:rPr>
+          <w:szCs w:val="22"/>
+          <w:lang w:val="uk-UA"/>
+        </w:rPr>
+        <w:spacing w:before="120" w:after="0" w:line="276" w:lineRule="auto"/>
       </w:pPr>
       <w:r>
         <w:rPr>
@@ -3541,7 +3542,7 @@
           <w:szCs w:val="22"/>
           <w:lang w:val="uk-UA"/>
         </w:rPr>
-        <w:spacing w:before="120" w:after="0" w:line="240" w:lineRule="auto"/>
+        <w:spacing w:before="120" w:after="0" w:line="276" w:lineRule="auto"/>
       </w:pPr>
     </w:p>
     <w:p>
@@ -3554,7 +3555,7 @@
           <w:u w:val="single"/>
           <w:lang w:val="uk-UA"/>
         </w:rPr>
-        <w:spacing w:before="120" w:after="0" w:line="240" w:lineRule="auto"/>
+        <w:spacing w:before="120" w:after="0" w:line="276" w:lineRule="auto"/>
       </w:pPr>
       <w:r>
         <w:rPr>
@@ -3603,7 +3604,7 @@
           <w:lang w:val="uk-UA"/>
         </w:rPr>
         <w:ind w:left="0"/>
-        <w:spacing w:before="120" w:after="0" w:line="240" w:lineRule="auto"/>
+        <w:spacing w:before="120" w:after="0" w:line="276" w:lineRule="auto"/>
       </w:pPr>
       <w:r>
         <w:rPr>
@@ -3697,7 +3698,7 @@
           <w:lang w:val="uk-UA"/>
         </w:rPr>
         <w:ind w:left="0"/>
-        <w:spacing w:before="120" w:after="0" w:line="240" w:lineRule="auto"/>
+        <w:spacing w:before="120" w:after="0" w:line="276" w:lineRule="auto"/>
       </w:pPr>
       <w:r>
         <w:rPr>
@@ -3755,7 +3756,7 @@
           <w:lang w:val="uk-UA"/>
         </w:rPr>
         <w:ind w:left="0"/>
-        <w:spacing w:before="120" w:after="0" w:line="240" w:lineRule="auto"/>
+        <w:spacing w:before="120" w:after="0" w:line="276" w:lineRule="auto"/>
       </w:pPr>
       <w:r>
         <w:rPr>
@@ -3777,7 +3778,7 @@
           <w:lang w:val="uk-UA"/>
         </w:rPr>
         <w:ind w:left="0"/>
-        <w:spacing w:before="120" w:after="0" w:line="240" w:lineRule="auto"/>
+        <w:spacing w:before="120" w:after="0" w:line="276" w:lineRule="auto"/>
       </w:pPr>
     </w:p>
     <w:p>
@@ -3793,7 +3794,7 @@
           <w:lang w:val="uk-UA"/>
         </w:rPr>
         <w:ind w:left="0"/>
-        <w:spacing w:before="120" w:after="0" w:line="240" w:lineRule="auto"/>
+        <w:spacing w:before="120" w:after="0" w:line="276" w:lineRule="auto"/>
       </w:pPr>
       <w:r>
         <w:rPr>
@@ -3826,7 +3827,7 @@
           <w:lang w:val="uk-UA"/>
         </w:rPr>
         <w:ind w:left="0" w:hanging="567"/>
-        <w:spacing w:before="120" w:after="0" w:line="240" w:lineRule="auto"/>
+        <w:spacing w:before="120" w:after="0" w:line="276" w:lineRule="auto"/>
       </w:pPr>
       <w:r>
         <w:rPr>
@@ -3850,7 +3851,7 @@
           <w:szCs w:val="22"/>
           <w:lang w:val="uk-UA"/>
         </w:rPr>
-        <w:spacing w:before="120" w:after="0" w:line="240" w:lineRule="auto"/>
+        <w:spacing w:before="120" w:after="0" w:line="276" w:lineRule="auto"/>
       </w:pPr>
       <w:r>
         <w:rPr>
@@ -3892,7 +3893,7 @@
           <w:szCs w:val="22"/>
           <w:lang w:val="uk-UA"/>
         </w:rPr>
-        <w:spacing w:before="120" w:after="0" w:line="240" w:lineRule="auto"/>
+        <w:spacing w:before="120" w:after="0" w:line="276" w:lineRule="auto"/>
       </w:pPr>
       <w:r>
         <w:rPr>
@@ -3938,7 +3939,7 @@
           <w:lang w:val="uk-UA"/>
         </w:rPr>
         <w:ind w:left="567" w:hanging="567"/>
-        <w:spacing w:before="120" w:after="0" w:line="240" w:lineRule="auto"/>
+        <w:spacing w:before="120" w:after="0" w:line="276" w:lineRule="auto"/>
       </w:pPr>
       <w:r>
         <w:rPr>
@@ -3970,7 +3971,7 @@
           <w:lang w:val="uk-UA"/>
         </w:rPr>
         <w:ind w:left="567" w:hanging="567"/>
-        <w:spacing w:before="120" w:after="0" w:line="240" w:lineRule="auto"/>
+        <w:spacing w:before="120" w:after="0" w:line="276" w:lineRule="auto"/>
       </w:pPr>
       <w:r>
         <w:rPr>
@@ -4301,7 +4302,7 @@
           <w:lang w:val="uk-UA"/>
         </w:rPr>
         <w:ind w:left="1134" w:hanging="567"/>
-        <w:spacing w:before="120" w:after="0" w:line="240" w:lineRule="auto"/>
+        <w:spacing w:before="120" w:after="0" w:line="276" w:lineRule="auto"/>
       </w:pPr>
       <w:r>
         <w:rPr>
@@ -4385,7 +4386,7 @@
           <w:lang w:val="uk-UA"/>
         </w:rPr>
         <w:ind w:left="1134" w:hanging="567"/>
-        <w:spacing w:before="120" w:after="0" w:line="240" w:lineRule="auto"/>
+        <w:spacing w:before="120" w:after="0" w:line="276" w:lineRule="auto"/>
       </w:pPr>
       <w:r>
         <w:rPr>
@@ -4433,7 +4434,7 @@
           <w:lang w:val="uk-UA"/>
         </w:rPr>
         <w:ind w:left="1134" w:hanging="567"/>
-        <w:spacing w:before="120" w:after="0" w:line="240" w:lineRule="auto"/>
+        <w:spacing w:before="120" w:after="0" w:line="276" w:lineRule="auto"/>
       </w:pPr>
       <w:r>
         <w:rPr>
@@ -4471,7 +4472,7 @@
           <w:lang w:val="uk-UA"/>
         </w:rPr>
         <w:ind w:left="1134" w:hanging="567"/>
-        <w:spacing w:before="120" w:after="0" w:line="240" w:lineRule="auto"/>
+        <w:spacing w:before="120" w:after="0" w:line="276" w:lineRule="auto"/>
       </w:pPr>
       <w:r>
         <w:rPr>
@@ -4545,7 +4546,7 @@
           <w:lang w:val="uk-UA"/>
         </w:rPr>
         <w:ind w:left="1134" w:hanging="567"/>
-        <w:spacing w:before="120" w:after="0" w:line="240" w:lineRule="auto"/>
+        <w:spacing w:before="120" w:after="0" w:line="276" w:lineRule="auto"/>
       </w:pPr>
       <w:r>
         <w:rPr>
@@ -4655,7 +4656,7 @@
           <w:lang w:val="uk-UA"/>
         </w:rPr>
         <w:ind w:left="1134" w:hanging="567"/>
-        <w:spacing w:before="120" w:after="0" w:line="240" w:lineRule="auto"/>
+        <w:spacing w:before="120" w:after="0" w:line="276" w:lineRule="auto"/>
       </w:pPr>
       <w:r>
         <w:rPr>
@@ -4729,7 +4730,7 @@
           <w:szCs w:val="22"/>
           <w:lang w:val="uk-UA"/>
         </w:rPr>
-        <w:spacing w:before="120" w:after="0" w:line="240" w:lineRule="auto"/>
+        <w:spacing w:before="120" w:after="0" w:line="276" w:lineRule="auto"/>
       </w:pPr>
       <w:r>
         <w:rPr>
@@ -4757,7 +4758,7 @@
           <w:lang w:val="uk-UA"/>
         </w:rPr>
         <w:ind w:left="567" w:hanging="567"/>
-        <w:spacing w:before="120" w:after="0" w:line="240" w:lineRule="auto"/>
+        <w:spacing w:before="120" w:after="0" w:line="276" w:lineRule="auto"/>
       </w:pPr>
       <w:r>
         <w:rPr>
@@ -4820,7 +4821,7 @@
           <w:lang w:val="uk-UA"/>
         </w:rPr>
         <w:ind w:left="1134" w:hanging="567"/>
-        <w:spacing w:before="120" w:after="0" w:line="240" w:lineRule="auto"/>
+        <w:spacing w:before="120" w:after="0" w:line="276" w:lineRule="auto"/>
       </w:pPr>
       <w:proofErr w:type="spellStart"/>
       <w:r>
@@ -4967,7 +4968,7 @@
           <w:lang w:val="uk-UA"/>
         </w:rPr>
         <w:ind w:left="1134" w:hanging="567"/>
-        <w:spacing w:before="120" w:after="0" w:line="240" w:lineRule="auto"/>
+        <w:spacing w:before="120" w:after="0" w:line="276" w:lineRule="auto"/>
       </w:pPr>
       <w:proofErr w:type="spellStart"/>
       <w:r>
@@ -5266,7 +5267,7 @@
           <w:lang w:val="uk-UA"/>
         </w:rPr>
         <w:ind w:left="1134" w:hanging="567"/>
-        <w:spacing w:before="120" w:after="0" w:line="240" w:lineRule="auto"/>
+        <w:spacing w:before="120" w:after="0" w:line="276" w:lineRule="auto"/>
       </w:pPr>
       <w:proofErr w:type="spellStart"/>
       <w:r>
@@ -5445,7 +5446,7 @@
           <w:lang w:val="uk-UA"/>
         </w:rPr>
         <w:ind w:left="567" w:hanging="567"/>
-        <w:spacing w:before="120" w:after="0" w:line="240" w:lineRule="auto"/>
+        <w:spacing w:before="120" w:after="0" w:line="276" w:lineRule="auto"/>
       </w:pPr>
       <w:r>
         <w:rPr>
@@ -5546,7 +5547,7 @@
           <w:szCs w:val="22"/>
           <w:lang w:val="uk-UA"/>
         </w:rPr>
-        <w:spacing w:before="120" w:after="0" w:line="240" w:lineRule="auto"/>
+        <w:spacing w:before="120" w:after="0" w:line="276" w:lineRule="auto"/>
       </w:pPr>
       <w:r>
         <w:rPr>
@@ -5587,7 +5588,7 @@
           <w:szCs w:val="22"/>
           <w:lang w:val="uk-UA"/>
         </w:rPr>
-        <w:spacing w:before="120" w:after="0" w:line="240" w:lineRule="auto"/>
+        <w:spacing w:before="120" w:after="0" w:line="276" w:lineRule="auto"/>
       </w:pPr>
       <w:r>
         <w:rPr>
@@ -5612,7 +5613,7 @@
           <w:lang w:val="uk-UA"/>
         </w:rPr>
         <w:ind w:left="567" w:hanging="567"/>
-        <w:spacing w:before="120" w:after="0" w:line="240" w:lineRule="auto"/>
+        <w:spacing w:before="120" w:after="0" w:line="276" w:lineRule="auto"/>
       </w:pPr>
       <w:r>
         <w:rPr>
@@ -5640,7 +5641,7 @@
           <w:lang w:val="uk-UA"/>
         </w:rPr>
         <w:ind w:left="567" w:hanging="567"/>
-        <w:spacing w:before="120" w:after="0" w:line="240" w:lineRule="auto"/>
+        <w:spacing w:before="120" w:after="0" w:line="276" w:lineRule="auto"/>
       </w:pPr>
       <w:r>
         <w:rPr>
@@ -5661,7 +5662,7 @@
           <w:szCs w:val="22"/>
           <w:lang w:val="uk-UA"/>
         </w:rPr>
-        <w:spacing w:before="120" w:after="0" w:line="240" w:lineRule="auto"/>
+        <w:spacing w:before="120" w:after="0" w:line="276" w:lineRule="auto"/>
       </w:pPr>
       <w:r>
         <w:rPr>
@@ -5681,7 +5682,7 @@
           <w:szCs w:val="22"/>
           <w:lang w:val="uk-UA"/>
         </w:rPr>
-        <w:spacing w:before="120" w:after="0" w:line="240" w:lineRule="auto"/>
+        <w:spacing w:before="120" w:after="0" w:line="276" w:lineRule="auto"/>
       </w:pPr>
     </w:p>
     <w:p>
@@ -5701,7 +5702,7 @@
           <w:lang w:val="uk-UA"/>
         </w:rPr>
         <w:ind w:left="0" w:hanging="567"/>
-        <w:spacing w:before="120" w:after="0" w:line="240" w:lineRule="auto"/>
+        <w:spacing w:before="120" w:after="0" w:line="276" w:lineRule="auto"/>
       </w:pPr>
       <w:r>
         <w:rPr>
@@ -5737,7 +5738,7 @@
           <w:szCs w:val="22"/>
           <w:lang w:val="uk-UA"/>
         </w:rPr>
-        <w:spacing w:before="120" w:after="0" w:line="240" w:lineRule="auto"/>
+        <w:spacing w:before="120" w:after="0" w:line="276" w:lineRule="auto"/>
       </w:pPr>
       <w:r>
         <w:rPr>
@@ -5767,7 +5768,7 @@
           <w:szCs w:val="22"/>
           <w:lang w:val="uk-UA"/>
         </w:rPr>
-        <w:spacing w:before="120" w:after="0" w:line="240" w:lineRule="auto"/>
+        <w:spacing w:before="120" w:after="0" w:line="276" w:lineRule="auto"/>
       </w:pPr>
       <w:r>
         <w:rPr>
@@ -5794,7 +5795,7 @@
           <w:lang w:val="uk-UA"/>
         </w:rPr>
         <w:ind w:left="567" w:hanging="567"/>
-        <w:spacing w:before="120" w:after="0" w:line="240" w:lineRule="auto"/>
+        <w:spacing w:before="120" w:after="0" w:line="276" w:lineRule="auto"/>
       </w:pPr>
       <w:r>
         <w:rPr>
@@ -5855,7 +5856,7 @@
           <w:lang w:val="uk-UA"/>
         </w:rPr>
         <w:ind w:left="567" w:hanging="567"/>
-        <w:spacing w:before="120" w:after="0" w:line="240" w:lineRule="auto"/>
+        <w:spacing w:before="120" w:after="0" w:line="276" w:lineRule="auto"/>
       </w:pPr>
       <w:r>
         <w:rPr>
@@ -5909,7 +5910,7 @@
           <w:szCs w:val="22"/>
           <w:lang w:val="uk-UA"/>
         </w:rPr>
-        <w:spacing w:before="120" w:after="0" w:line="240" w:lineRule="auto"/>
+        <w:spacing w:before="120" w:after="0" w:line="276" w:lineRule="auto"/>
       </w:pPr>
       <w:r>
         <w:rPr>
@@ -6008,7 +6009,7 @@
           <w:szCs w:val="22"/>
           <w:lang w:val="uk-UA"/>
         </w:rPr>
-        <w:spacing w:before="120" w:after="0" w:line="240" w:lineRule="auto"/>
+        <w:spacing w:before="120" w:after="0" w:line="276" w:lineRule="auto"/>
       </w:pPr>
       <w:r>
         <w:rPr>
@@ -6029,7 +6030,7 @@
           <w:szCs w:val="22"/>
           <w:lang w:val="uk-UA"/>
         </w:rPr>
-        <w:spacing w:before="120" w:after="0" w:line="240" w:lineRule="auto"/>
+        <w:spacing w:before="120" w:after="0" w:line="276" w:lineRule="auto"/>
       </w:pPr>
       <w:r>
         <w:rPr>
@@ -6075,7 +6076,7 @@
           <w:lang w:val="uk-UA"/>
         </w:rPr>
         <w:ind w:left="567" w:hanging="567"/>
-        <w:spacing w:before="120" w:after="0" w:line="240" w:lineRule="auto"/>
+        <w:spacing w:before="120" w:after="0" w:line="276" w:lineRule="auto"/>
       </w:pPr>
       <w:r>
         <w:rPr>
@@ -6103,7 +6104,7 @@
           <w:lang w:val="uk-UA"/>
         </w:rPr>
         <w:ind w:left="567" w:hanging="567"/>
-        <w:spacing w:before="120" w:after="0" w:line="240" w:lineRule="auto"/>
+        <w:spacing w:before="120" w:after="0" w:line="276" w:lineRule="auto"/>
       </w:pPr>
       <w:r>
         <w:rPr>
@@ -6163,7 +6164,7 @@
           <w:szCs w:val="22"/>
           <w:lang w:val="uk-UA"/>
         </w:rPr>
-        <w:spacing w:before="120" w:after="0" w:line="240" w:lineRule="auto"/>
+        <w:spacing w:before="120" w:after="0" w:line="276" w:lineRule="auto"/>
       </w:pPr>
     </w:p>
     <w:p>
@@ -6175,7 +6176,7 @@
           <w:szCs w:val="22"/>
           <w:lang w:val="uk-UA"/>
         </w:rPr>
-        <w:spacing w:before="120" w:after="0" w:line="240" w:lineRule="auto"/>
+        <w:spacing w:before="120" w:after="0" w:line="276" w:lineRule="auto"/>
       </w:pPr>
       <w:r>
         <w:rPr>
@@ -6208,7 +6209,7 @@
           <w:lang w:val="uk-UA"/>
         </w:rPr>
         <w:ind w:left="0" w:hanging="567"/>
-        <w:spacing w:before="120" w:after="0" w:line="240" w:lineRule="auto"/>
+        <w:spacing w:before="120" w:after="0" w:line="276" w:lineRule="auto"/>
       </w:pPr>
       <w:r>
         <w:rPr>
@@ -6270,7 +6271,7 @@
           <w:lang w:val="uk-UA"/>
         </w:rPr>
         <w:ind w:left="0" w:hanging="567"/>
-        <w:spacing w:before="120" w:after="0" w:line="240" w:lineRule="auto"/>
+        <w:spacing w:before="120" w:after="0" w:line="276" w:lineRule="auto"/>
       </w:pPr>
       <w:r>
         <w:rPr>
@@ -6290,7 +6291,7 @@
           <w:szCs w:val="22"/>
           <w:lang w:val="uk-UA"/>
         </w:rPr>
-        <w:spacing w:before="120" w:after="0" w:line="240" w:lineRule="auto"/>
+        <w:spacing w:before="120" w:after="0" w:line="276" w:lineRule="auto"/>
       </w:pPr>
       <w:r>
         <w:rPr>
@@ -6325,7 +6326,7 @@
           <w:szCs w:val="22"/>
           <w:lang w:val="uk-UA"/>
         </w:rPr>
-        <w:spacing w:before="120" w:after="0" w:line="240" w:lineRule="auto"/>
+        <w:spacing w:before="120" w:after="0" w:line="276" w:lineRule="auto"/>
       </w:pPr>
       <w:r>
         <w:rPr>
@@ -6344,7 +6345,7 @@
           <w:szCs w:val="22"/>
           <w:lang w:val="uk-UA"/>
         </w:rPr>
-        <w:spacing w:before="120" w:after="0" w:line="240" w:lineRule="auto"/>
+        <w:spacing w:before="120" w:after="0" w:line="276" w:lineRule="auto"/>
       </w:pPr>
       <w:r>
         <w:rPr>
@@ -6363,7 +6364,7 @@
           <w:szCs w:val="22"/>
           <w:lang w:val="uk-UA"/>
         </w:rPr>
-        <w:spacing w:before="120" w:after="0" w:line="240" w:lineRule="auto"/>
+        <w:spacing w:before="120" w:after="0" w:line="276" w:lineRule="auto"/>
       </w:pPr>
       <w:r>
         <w:rPr>
@@ -6408,7 +6409,7 @@
           <w:szCs w:val="22"/>
           <w:lang w:val="uk-UA"/>
         </w:rPr>
-        <w:spacing w:before="120" w:after="0" w:line="240" w:lineRule="auto"/>
+        <w:spacing w:before="120" w:after="0" w:line="276" w:lineRule="auto"/>
       </w:pPr>
       <w:r>
         <w:rPr>
@@ -6436,7 +6437,7 @@
           <w:lang w:val="uk-UA"/>
         </w:rPr>
         <w:ind w:left="567" w:hanging="567"/>
-        <w:spacing w:before="120" w:after="0" w:line="240" w:lineRule="auto"/>
+        <w:spacing w:before="120" w:after="0" w:line="276" w:lineRule="auto"/>
       </w:pPr>
       <w:proofErr w:type="spellStart"/>
       <w:r>
@@ -6474,7 +6475,7 @@
           <w:lang w:val="uk-UA"/>
         </w:rPr>
         <w:ind w:left="567" w:hanging="567"/>
-        <w:spacing w:before="120" w:after="0" w:line="240" w:lineRule="auto"/>
+        <w:spacing w:before="120" w:after="0" w:line="276" w:lineRule="auto"/>
       </w:pPr>
       <w:proofErr w:type="spellStart"/>
       <w:r>
@@ -6512,7 +6513,7 @@
           <w:lang w:val="uk-UA"/>
         </w:rPr>
         <w:ind w:left="567" w:hanging="567"/>
-        <w:spacing w:before="120" w:after="0" w:line="240" w:lineRule="auto"/>
+        <w:spacing w:before="120" w:after="0" w:line="276" w:lineRule="auto"/>
       </w:pPr>
       <w:r>
         <w:rPr>
@@ -6531,7 +6532,7 @@
           <w:szCs w:val="22"/>
           <w:lang w:val="uk-UA"/>
         </w:rPr>
-        <w:spacing w:before="120" w:after="0" w:line="240" w:lineRule="auto"/>
+        <w:spacing w:before="120" w:after="0" w:line="276" w:lineRule="auto"/>
       </w:pPr>
       <w:r>
         <w:rPr>
@@ -6550,7 +6551,7 @@
           <w:szCs w:val="22"/>
           <w:lang w:val="uk-UA"/>
         </w:rPr>
-        <w:spacing w:before="120" w:after="0" w:line="240" w:lineRule="auto"/>
+        <w:spacing w:before="120" w:after="0" w:line="276" w:lineRule="auto"/>
       </w:pPr>
       <w:r>
         <w:rPr>
@@ -6592,7 +6593,7 @@
           <w:lang w:val="uk-UA"/>
         </w:rPr>
         <w:ind w:left="567" w:hanging="567"/>
-        <w:spacing w:before="120" w:after="0" w:line="240" w:lineRule="auto"/>
+        <w:spacing w:before="120" w:after="0" w:line="276" w:lineRule="auto"/>
       </w:pPr>
       <w:r>
         <w:rPr>
@@ -6618,7 +6619,7 @@
           <w:lang w:val="uk-UA"/>
         </w:rPr>
         <w:ind w:left="567" w:hanging="567"/>
-        <w:spacing w:before="120" w:after="0" w:line="240" w:lineRule="auto"/>
+        <w:spacing w:before="120" w:after="0" w:line="276" w:lineRule="auto"/>
       </w:pPr>
       <w:r>
         <w:rPr>
@@ -6644,7 +6645,7 @@
           <w:lang w:val="uk-UA"/>
         </w:rPr>
         <w:ind w:left="567" w:hanging="567"/>
-        <w:spacing w:before="120" w:after="0" w:line="240" w:lineRule="auto"/>
+        <w:spacing w:before="120" w:after="0" w:line="276" w:lineRule="auto"/>
       </w:pPr>
       <w:r>
         <w:rPr>
@@ -6670,7 +6671,7 @@
           <w:lang w:val="uk-UA"/>
         </w:rPr>
         <w:ind w:left="567" w:hanging="567"/>
-        <w:spacing w:before="120" w:after="0" w:line="240" w:lineRule="auto"/>
+        <w:spacing w:before="120" w:after="0" w:line="276" w:lineRule="auto"/>
       </w:pPr>
       <w:r>
         <w:rPr>
@@ -6696,7 +6697,7 @@
           <w:lang w:val="uk-UA"/>
         </w:rPr>
         <w:ind w:left="567" w:hanging="567"/>
-        <w:spacing w:before="120" w:after="0" w:line="240" w:lineRule="auto"/>
+        <w:spacing w:before="120" w:after="0" w:line="276" w:lineRule="auto"/>
       </w:pPr>
       <w:r>
         <w:rPr>
@@ -6715,7 +6716,7 @@
           <w:szCs w:val="22"/>
           <w:lang w:val="uk-UA"/>
         </w:rPr>
-        <w:spacing w:before="120" w:after="0" w:line="240" w:lineRule="auto"/>
+        <w:spacing w:before="120" w:after="0" w:line="276" w:lineRule="auto"/>
       </w:pPr>
       <w:r>
         <w:rPr>
@@ -6741,7 +6742,7 @@
           <w:lang w:val="uk-UA"/>
         </w:rPr>
         <w:ind w:left="567" w:hanging="567"/>
-        <w:spacing w:before="120" w:after="0" w:line="240" w:lineRule="auto"/>
+        <w:spacing w:before="120" w:after="0" w:line="276" w:lineRule="auto"/>
       </w:pPr>
       <w:r>
         <w:rPr>
@@ -6767,7 +6768,7 @@
           <w:lang w:val="uk-UA"/>
         </w:rPr>
         <w:ind w:left="567" w:hanging="567"/>
-        <w:spacing w:before="120" w:after="0" w:line="240" w:lineRule="auto"/>
+        <w:spacing w:before="120" w:after="0" w:line="276" w:lineRule="auto"/>
       </w:pPr>
       <w:r>
         <w:rPr>
@@ -6811,7 +6812,7 @@
           <w:lang w:val="uk-UA"/>
         </w:rPr>
         <w:ind w:left="567" w:hanging="567"/>
-        <w:spacing w:before="120" w:after="0" w:line="240" w:lineRule="auto"/>
+        <w:spacing w:before="120" w:after="0" w:line="276" w:lineRule="auto"/>
       </w:pPr>
       <w:r>
         <w:rPr>
@@ -6830,7 +6831,7 @@
           <w:szCs w:val="22"/>
           <w:lang w:val="uk-UA"/>
         </w:rPr>
-        <w:spacing w:before="120" w:after="0" w:line="240" w:lineRule="auto"/>
+        <w:spacing w:before="120" w:after="0" w:line="276" w:lineRule="auto"/>
       </w:pPr>
       <w:r>
         <w:rPr>
@@ -6888,7 +6889,7 @@
           <w:lang w:val="uk-UA"/>
         </w:rPr>
         <w:ind w:left="0" w:hanging="567"/>
-        <w:spacing w:before="120" w:after="0" w:line="240" w:lineRule="auto"/>
+        <w:spacing w:before="120" w:after="0" w:line="276" w:lineRule="auto"/>
       </w:pPr>
       <w:r>
         <w:rPr>
@@ -6908,7 +6909,7 @@
           <w:szCs w:val="22"/>
           <w:lang w:val="uk-UA"/>
         </w:rPr>
-        <w:spacing w:before="120" w:after="0" w:line="240" w:lineRule="auto"/>
+        <w:spacing w:before="120" w:after="0" w:line="276" w:lineRule="auto"/>
       </w:pPr>
       <w:r>
         <w:rPr>
@@ -6975,7 +6976,7 @@
           <w:szCs w:val="22"/>
           <w:lang w:val="uk-UA"/>
         </w:rPr>
-        <w:spacing w:before="120" w:after="0" w:line="240" w:lineRule="auto"/>
+        <w:spacing w:before="120" w:after="0" w:line="276" w:lineRule="auto"/>
       </w:pPr>
       <w:r>
         <w:rPr>
@@ -6997,7 +6998,7 @@
           <w:szCs w:val="22"/>
           <w:lang w:val="uk-UA"/>
         </w:rPr>
-        <w:spacing w:before="120" w:after="0" w:line="240" w:lineRule="auto"/>
+        <w:spacing w:before="120" w:after="0" w:line="276" w:lineRule="auto"/>
       </w:pPr>
       <w:r>
         <w:rPr>
@@ -7043,7 +7044,7 @@
           <w:lang w:val="uk-UA"/>
         </w:rPr>
         <w:ind w:left="0" w:hanging="567"/>
-        <w:spacing w:before="120" w:after="0" w:line="240" w:lineRule="auto"/>
+        <w:spacing w:before="120" w:after="0" w:line="276" w:lineRule="auto"/>
       </w:pPr>
       <w:r>
         <w:rPr>
@@ -7087,7 +7088,7 @@
           <w:lang w:val="uk-UA"/>
         </w:rPr>
         <w:ind w:left="0"/>
-        <w:spacing w:before="120" w:after="0" w:line="240" w:lineRule="auto"/>
+        <w:spacing w:before="120" w:after="0" w:line="276" w:lineRule="auto"/>
       </w:pPr>
       <w:r>
         <w:rPr>
@@ -7144,7 +7145,7 @@
           <w:lang w:val="uk-UA"/>
         </w:rPr>
         <w:ind w:left="0"/>
-        <w:spacing w:before="120" w:after="0" w:line="240" w:lineRule="auto"/>
+        <w:spacing w:before="120" w:after="0" w:line="276" w:lineRule="auto"/>
       </w:pPr>
       <w:r>
         <w:rPr>
@@ -7169,7 +7170,7 @@
           <w:lang w:val="uk-UA"/>
         </w:rPr>
         <w:ind w:left="0"/>
-        <w:spacing w:before="120" w:after="0" w:line="240" w:lineRule="auto"/>
+        <w:spacing w:before="120" w:after="0" w:line="276" w:lineRule="auto"/>
       </w:pPr>
       <w:r>
         <w:rPr>
@@ -7194,7 +7195,7 @@
           <w:lang w:val="uk-UA"/>
         </w:rPr>
         <w:ind w:left="0"/>
-        <w:spacing w:before="120" w:after="0" w:line="240" w:lineRule="auto"/>
+        <w:spacing w:before="120" w:after="0" w:line="276" w:lineRule="auto"/>
       </w:pPr>
       <w:r>
         <w:rPr>
@@ -7224,7 +7225,7 @@
           <w:lang w:val="uk-UA"/>
         </w:rPr>
         <w:ind w:left="0" w:hanging="567"/>
-        <w:spacing w:before="120" w:after="0" w:line="240" w:lineRule="auto"/>
+        <w:spacing w:before="120" w:after="0" w:line="276" w:lineRule="auto"/>
       </w:pPr>
       <w:r>
         <w:rPr>
@@ -7247,7 +7248,7 @@
           <w:szCs w:val="22"/>
           <w:lang w:val="uk-UA"/>
         </w:rPr>
-        <w:spacing w:before="120" w:after="0" w:line="240" w:lineRule="auto"/>
+        <w:spacing w:before="120" w:after="0" w:line="276" w:lineRule="auto"/>
       </w:pPr>
       <w:r>
         <w:rPr>
@@ -7269,7 +7270,7 @@
           <w:szCs w:val="22"/>
           <w:lang w:val="uk-UA"/>
         </w:rPr>
-        <w:spacing w:before="120" w:after="0" w:line="240" w:lineRule="auto"/>
+        <w:spacing w:before="120" w:after="0" w:line="276" w:lineRule="auto"/>
       </w:pPr>
       <w:r>
         <w:rPr>
@@ -7291,7 +7292,7 @@
           <w:szCs w:val="22"/>
           <w:lang w:val="uk-UA"/>
         </w:rPr>
-        <w:spacing w:before="120" w:after="0" w:line="240" w:lineRule="auto"/>
+        <w:spacing w:before="120" w:after="0" w:line="276" w:lineRule="auto"/>
       </w:pPr>
       <w:r>
         <w:rPr>
@@ -7361,7 +7362,7 @@
           <w:szCs w:val="22"/>
           <w:lang w:val="uk-UA"/>
         </w:rPr>
-        <w:spacing w:before="120" w:after="0" w:line="240" w:lineRule="auto"/>
+        <w:spacing w:before="120" w:after="0" w:line="276" w:lineRule="auto"/>
       </w:pPr>
       <w:r>
         <w:rPr>
@@ -7418,7 +7419,7 @@
           <w:lang w:val="uk-UA"/>
         </w:rPr>
         <w:ind w:left="0"/>
-        <w:spacing w:before="120" w:after="0" w:line="240" w:lineRule="auto"/>
+        <w:spacing w:before="120" w:after="0" w:line="276" w:lineRule="auto"/>
       </w:pPr>
       <w:r>
         <w:rPr>
@@ -7443,7 +7444,7 @@
           <w:lang w:val="uk-UA"/>
         </w:rPr>
         <w:ind w:left="0"/>
-        <w:spacing w:before="120" w:after="0" w:line="240" w:lineRule="auto"/>
+        <w:spacing w:before="120" w:after="0" w:line="276" w:lineRule="auto"/>
       </w:pPr>
       <w:r>
         <w:rPr>
@@ -7534,7 +7535,7 @@
           <w:lang w:val="uk-UA"/>
         </w:rPr>
         <w:ind w:left="0"/>
-        <w:spacing w:before="120" w:after="0" w:line="240" w:lineRule="auto"/>
+        <w:spacing w:before="120" w:after="0" w:line="276" w:lineRule="auto"/>
       </w:pPr>
       <w:r>
         <w:rPr>
@@ -7559,7 +7560,7 @@
           <w:lang w:val="uk-UA"/>
         </w:rPr>
         <w:ind w:left="0"/>
-        <w:spacing w:before="120" w:after="0" w:line="240" w:lineRule="auto"/>
+        <w:spacing w:before="120" w:after="0" w:line="276" w:lineRule="auto"/>
       </w:pPr>
       <w:r>
         <w:rPr>
@@ -7645,7 +7646,7 @@
           <w:lang w:val="uk-UA"/>
         </w:rPr>
         <w:ind w:left="0" w:hanging="567"/>
-        <w:spacing w:before="120" w:after="0" w:line="240" w:lineRule="auto"/>
+        <w:spacing w:before="120" w:after="0" w:line="276" w:lineRule="auto"/>
       </w:pPr>
       <w:r>
         <w:rPr>
@@ -7671,7 +7672,7 @@
           <w:lang w:val="uk-UA"/>
         </w:rPr>
         <w:ind w:left="0"/>
-        <w:spacing w:before="120" w:after="0" w:line="240" w:lineRule="auto"/>
+        <w:spacing w:before="120" w:after="0" w:line="276" w:lineRule="auto"/>
       </w:pPr>
       <w:r>
         <w:rPr>
@@ -7728,7 +7729,7 @@
           <w:lang w:val="uk-UA"/>
         </w:rPr>
         <w:ind w:left="0"/>
-        <w:spacing w:before="120" w:after="0" w:line="240" w:lineRule="auto"/>
+        <w:spacing w:before="120" w:after="0" w:line="276" w:lineRule="auto"/>
       </w:pPr>
       <w:r>
         <w:rPr>
@@ -7812,7 +7813,7 @@
           <w:lang w:val="uk-UA"/>
         </w:rPr>
         <w:ind w:left="0"/>
-        <w:spacing w:before="120" w:after="0" w:line="240" w:lineRule="auto"/>
+        <w:spacing w:before="120" w:after="0" w:line="276" w:lineRule="auto"/>
       </w:pPr>
       <w:r>
         <w:rPr>
@@ -7858,7 +7859,7 @@
           <w:lang w:val="uk-UA"/>
         </w:rPr>
         <w:ind w:left="0" w:hanging="567"/>
-        <w:spacing w:before="120" w:after="0" w:line="240" w:lineRule="auto"/>
+        <w:spacing w:before="120" w:after="0" w:line="276" w:lineRule="auto"/>
       </w:pPr>
       <w:r>
         <w:rPr>
@@ -7896,7 +7897,7 @@
           <w:szCs w:val="22"/>
           <w:lang w:val="uk-UA"/>
         </w:rPr>
-        <w:spacing w:before="120" w:after="0" w:line="240" w:lineRule="auto"/>
+        <w:spacing w:before="120" w:after="0" w:line="276" w:lineRule="auto"/>
       </w:pPr>
       <w:r>
         <w:rPr>
@@ -8013,7 +8014,7 @@
           <w:szCs w:val="22"/>
           <w:lang w:val="uk-UA"/>
         </w:rPr>
-        <w:spacing w:before="120" w:after="0" w:line="240" w:lineRule="auto"/>
+        <w:spacing w:before="120" w:after="0" w:line="276" w:lineRule="auto"/>
       </w:pPr>
       <w:r>
         <w:rPr>
@@ -8094,7 +8095,7 @@
           <w:szCs w:val="22"/>
           <w:lang w:val="uk-UA"/>
         </w:rPr>
-        <w:spacing w:before="120" w:after="0" w:line="240" w:lineRule="auto"/>
+        <w:spacing w:before="120" w:after="0" w:line="276" w:lineRule="auto"/>
       </w:pPr>
       <w:r>
         <w:rPr>
@@ -8174,7 +8175,7 @@
           <w:lang w:val="uk-UA"/>
         </w:rPr>
         <w:ind w:left="567" w:hanging="567"/>
-        <w:spacing w:before="120" w:after="0" w:line="240" w:lineRule="auto"/>
+        <w:spacing w:before="120" w:after="0" w:line="276" w:lineRule="auto"/>
       </w:pPr>
       <w:proofErr w:type="spellStart"/>
       <w:r>
@@ -8246,7 +8247,7 @@
           <w:lang w:val="uk-UA"/>
         </w:rPr>
         <w:ind w:left="567" w:hanging="567"/>
-        <w:spacing w:before="120" w:after="0" w:line="240" w:lineRule="auto"/>
+        <w:spacing w:before="120" w:after="0" w:line="276" w:lineRule="auto"/>
       </w:pPr>
       <w:r>
         <w:rPr>
@@ -8290,7 +8291,7 @@
           <w:lang w:val="uk-UA"/>
         </w:rPr>
         <w:ind w:left="567" w:hanging="567"/>
-        <w:spacing w:before="120" w:after="0" w:line="240" w:lineRule="auto"/>
+        <w:spacing w:before="120" w:after="0" w:line="276" w:lineRule="auto"/>
       </w:pPr>
       <w:r>
         <w:rPr>
@@ -8316,7 +8317,7 @@
           <w:lang w:val="uk-UA"/>
         </w:rPr>
         <w:ind w:left="567" w:hanging="567"/>
-        <w:spacing w:before="120" w:after="0" w:line="240" w:lineRule="auto"/>
+        <w:spacing w:before="120" w:after="0" w:line="276" w:lineRule="auto"/>
       </w:pPr>
       <w:r>
         <w:rPr>
@@ -8353,7 +8354,7 @@
           <w:szCs w:val="22"/>
           <w:lang w:val="uk-UA"/>
         </w:rPr>
-        <w:spacing w:before="120" w:after="0" w:line="240" w:lineRule="auto"/>
+        <w:spacing w:before="120" w:after="0" w:line="276" w:lineRule="auto"/>
       </w:pPr>
       <w:r>
         <w:rPr>
@@ -8460,7 +8461,7 @@
           <w:szCs w:val="22"/>
           <w:lang w:val="uk-UA"/>
         </w:rPr>
-        <w:spacing w:before="120" w:after="0" w:line="240" w:lineRule="auto"/>
+        <w:spacing w:before="120" w:after="0" w:line="276" w:lineRule="auto"/>
       </w:pPr>
       <w:r>
         <w:rPr>
@@ -8526,7 +8527,7 @@
           <w:lang w:val="uk-UA"/>
         </w:rPr>
         <w:ind w:left="567" w:hanging="567"/>
-        <w:spacing w:before="120" w:after="0" w:line="240" w:lineRule="auto"/>
+        <w:spacing w:before="120" w:after="0" w:line="276" w:lineRule="auto"/>
       </w:pPr>
       <w:proofErr w:type="spellStart"/>
       <w:r>
@@ -8598,7 +8599,7 @@
           <w:lang w:val="uk-UA"/>
         </w:rPr>
         <w:ind w:left="567" w:hanging="567"/>
-        <w:spacing w:before="120" w:after="0" w:line="240" w:lineRule="auto"/>
+        <w:spacing w:before="120" w:after="0" w:line="276" w:lineRule="auto"/>
       </w:pPr>
       <w:r>
         <w:rPr>
@@ -8642,7 +8643,7 @@
           <w:lang w:val="uk-UA"/>
         </w:rPr>
         <w:ind w:left="567" w:hanging="567"/>
-        <w:spacing w:before="120" w:after="0" w:line="240" w:lineRule="auto"/>
+        <w:spacing w:before="120" w:after="0" w:line="276" w:lineRule="auto"/>
       </w:pPr>
       <w:r>
         <w:rPr>
@@ -8684,7 +8685,7 @@
           <w:lang w:val="uk-UA"/>
         </w:rPr>
         <w:ind w:left="567" w:hanging="567"/>
-        <w:spacing w:before="120" w:after="0" w:line="240" w:lineRule="auto"/>
+        <w:spacing w:before="120" w:after="0" w:line="276" w:lineRule="auto"/>
       </w:pPr>
       <w:proofErr w:type="spellStart"/>
       <w:r>
@@ -8738,7 +8739,7 @@
           <w:lang w:val="uk-UA"/>
         </w:rPr>
         <w:ind w:left="567" w:hanging="567"/>
-        <w:spacing w:before="120" w:after="0" w:line="240" w:lineRule="auto"/>
+        <w:spacing w:before="120" w:after="0" w:line="276" w:lineRule="auto"/>
       </w:pPr>
       <w:proofErr w:type="spellStart"/>
       <w:r>
@@ -8828,7 +8829,7 @@
           <w:lang w:val="uk-UA"/>
         </w:rPr>
         <w:ind w:left="567" w:hanging="567"/>
-        <w:spacing w:before="120" w:after="0" w:line="240" w:lineRule="auto"/>
+        <w:spacing w:before="120" w:after="0" w:line="276" w:lineRule="auto"/>
       </w:pPr>
       <w:proofErr w:type="spellStart"/>
       <w:r>
@@ -8896,7 +8897,7 @@
           <w:lang w:val="uk-UA"/>
         </w:rPr>
         <w:pStyle w:val="a"/>
-        <w:spacing w:before="120" w:after="0" w:line="240" w:lineRule="auto"/>
+        <w:spacing w:before="120" w:after="0" w:line="276" w:lineRule="auto"/>
       </w:pPr>
       <w:r>
         <w:t>Ce bloc d'actions, combiné aux 15 % d'actions appartenant directement à Boguslayev V., assurait le contrôle de 65 % des actions de l'entreprise.</w:t>
@@ -8912,7 +8913,7 @@
           <w:lang w:val="uk-UA"/>
         </w:rPr>
         <w:pStyle w:val="a"/>
-        <w:spacing w:before="120" w:after="0" w:line="240" w:lineRule="auto"/>
+        <w:spacing w:before="120" w:after="0" w:line="276" w:lineRule="auto"/>
       </w:pPr>
       <w:r/>
     </w:p>
@@ -8933,7 +8934,7 @@
           <w:lang w:val="uk-UA"/>
         </w:rPr>
         <w:ind w:left="0" w:hanging="567"/>
-        <w:spacing w:before="120" w:after="0" w:line="240" w:lineRule="auto"/>
+        <w:spacing w:before="120" w:after="0" w:line="276" w:lineRule="auto"/>
       </w:pPr>
       <w:r>
         <w:rPr>
@@ -8954,7 +8955,7 @@
           <w:szCs w:val="22"/>
           <w:lang w:val="uk-UA"/>
         </w:rPr>
-        <w:spacing w:before="120" w:after="0" w:line="240" w:lineRule="auto"/>
+        <w:spacing w:before="120" w:after="0" w:line="276" w:lineRule="auto"/>
       </w:pPr>
       <w:r>
         <w:t>Le contrôle de l'activité économique de JSC « Motor Sich » était exercé par Boguslayev V. et AVB :</w:t>
@@ -8978,7 +8979,7 @@
           <w:lang w:val="uk-UA"/>
         </w:rPr>
         <w:ind w:left="567" w:hanging="567"/>
-        <w:spacing w:before="120" w:after="0" w:line="240" w:lineRule="auto"/>
+        <w:spacing w:before="120" w:after="0" w:line="276" w:lineRule="auto"/>
       </w:pPr>
       <w:r>
         <w:t>Boguslayev V. en tant que personne physique détenait 15,83 % des actions.</w:t>
@@ -9004,7 +9005,7 @@
           <w:lang w:val="uk-UA"/>
         </w:rPr>
         <w:ind w:left="567" w:hanging="567"/>
-        <w:spacing w:before="120" w:after="0" w:line="240" w:lineRule="auto"/>
+        <w:spacing w:before="120" w:after="0" w:line="276" w:lineRule="auto"/>
       </w:pPr>
       <w:r>
         <w:t>AVB détenait indirectement 49,7 % des actions par l'intermédiaire d'une série de sociétés contrôlées :</w:t>
@@ -9030,10 +9031,10 @@
           <w:lang w:val="uk-UA"/>
         </w:rPr>
         <w:ind w:left="1134" w:hanging="567"/>
-        <w:spacing w:before="120" w:after="0" w:line="240" w:lineRule="auto"/>
-      </w:pPr>
-      <w:r>
-        <w:t>359 727 actions (17,3113 %) — Business House Helena A.G., propriétaire depuis le 22/07/2014 Katran Ltd, UBO — Vnukov Ye. ;</w:t>
+        <w:spacing w:before="120" w:after="0" w:line="276" w:lineRule="auto"/>
+      </w:pPr>
+      <w:r>
+        <w:t>359 727 actions (17,3113 %) — Business House Helena A.G., propriétaire depuis le 22 juillet 2014 Katran Ltd, UBO — Vnukov Ye. ;</w:t>
       </w:r>
     </w:p>
     <w:p>
@@ -9056,10 +9057,10 @@
           <w:lang w:val="uk-UA"/>
         </w:rPr>
         <w:ind w:left="1134" w:hanging="567"/>
-        <w:spacing w:before="120" w:after="0" w:line="240" w:lineRule="auto"/>
-      </w:pPr>
-      <w:r>
-        <w:t>201 565 actions (9,69 %) — SARL « Motor-Intercoms », dont le propriétaire est Croftdale Investments Limited, elle-même détenue depuis le 30/03/2015 par Calloway Finance Limited, UBO — AVB ;</w:t>
+        <w:spacing w:before="120" w:after="0" w:line="276" w:lineRule="auto"/>
+      </w:pPr>
+      <w:r>
+        <w:t>201 565 actions (9,69 %) — SARL « Motor-Intercoms », dont le propriétaire est Croftdale Investments Limited, elle-même détenue depuis le 30 mars 2015 par Calloway Finance Limited, UBO — AVB ;</w:t>
       </w:r>
     </w:p>
     <w:p>
@@ -9080,10 +9081,10 @@
           <w:lang w:val="uk-UA"/>
         </w:rPr>
         <w:ind w:left="1134" w:hanging="567"/>
-        <w:spacing w:before="120" w:after="0" w:line="240" w:lineRule="auto"/>
-      </w:pPr>
-      <w:r>
-        <w:t>193 220 actions (9,2984 %) — PrAT « TD Olena », propriétaire Montagne Ltd, détenue depuis le 30/03/2015 par Longwizard Corp, UBO — Kononenko A. ;</w:t>
+        <w:spacing w:before="120" w:after="0" w:line="276" w:lineRule="auto"/>
+      </w:pPr>
+      <w:r>
+        <w:t>193 220 actions (9,2984 %) — PrAT « TD Olena », propriétaire Montagne Ltd, détenue depuis le 30 mars 2015 par Longwizard Corp, UBO — Kononenko A. ;</w:t>
       </w:r>
     </w:p>
     <w:p>
@@ -9106,10 +9107,10 @@
           <w:lang w:val="uk-UA"/>
         </w:rPr>
         <w:ind w:left="1134" w:hanging="567"/>
-        <w:spacing w:before="120" w:after="0" w:line="240" w:lineRule="auto"/>
-      </w:pPr>
-      <w:r>
-        <w:t>192 665 actions (9,2717 %) — Granum Corporation, détenue depuis le 22/07/2014 par Laterson Management Group Ltd, UBO — Sushchenko L. ;</w:t>
+        <w:spacing w:before="120" w:after="0" w:line="276" w:lineRule="auto"/>
+      </w:pPr>
+      <w:r>
+        <w:t>192 665 actions (9,2717 %) — Granum Corporation, détenue depuis le 22 juillet 2014 par Laterson Management Group Ltd, UBO — Sushchenko L. ;</w:t>
       </w:r>
     </w:p>
     <w:p>
@@ -9130,10 +9131,10 @@
           <w:lang w:val="uk-UA"/>
         </w:rPr>
         <w:ind w:left="1134" w:hanging="567"/>
-        <w:spacing w:before="120" w:after="0" w:line="240" w:lineRule="auto"/>
-      </w:pPr>
-      <w:r>
-        <w:t>64 733 actions (3,1152 %) — Enfields Trade &amp; Capital Corp, détenue depuis le 22/07/2014 par Stamio Investments Ltd, UBO — AVB ;</w:t>
+        <w:spacing w:before="120" w:after="0" w:line="276" w:lineRule="auto"/>
+      </w:pPr>
+      <w:r>
+        <w:t>64 733 actions (3,1152 %) — Enfields Trade &amp; Capital Corp, détenue depuis le 22 juillet 2014 par Stamio Investments Ltd, UBO — AVB ;</w:t>
       </w:r>
     </w:p>
     <w:p>
@@ -9154,10 +9155,10 @@
           <w:lang w:val="uk-UA"/>
         </w:rPr>
         <w:ind w:left="1134" w:hanging="567"/>
-        <w:spacing w:before="120" w:after="0" w:line="240" w:lineRule="auto"/>
-      </w:pPr>
-      <w:r>
-        <w:t>27 086 actions (1,3035 %) — Waldo Trade Ltd, détenue depuis le 13/06/2014 par Taladin Limited, UBO — Trufanova L.S. ;</w:t>
+        <w:spacing w:before="120" w:after="0" w:line="276" w:lineRule="auto"/>
+      </w:pPr>
+      <w:r>
+        <w:t>27 086 actions (1,3035 %) — Waldo Trade Ltd, détenue depuis le 13 juin 2014 par Taladin Limited, UBO — Trufanova L.S. ;</w:t>
       </w:r>
     </w:p>
     <w:p>
@@ -9180,10 +9181,10 @@
           <w:lang w:val="uk-UA"/>
         </w:rPr>
         <w:ind w:left="1134" w:hanging="567"/>
-        <w:spacing w:before="120" w:after="0" w:line="240" w:lineRule="auto"/>
-      </w:pPr>
-      <w:r>
-        <w:t>16 425 actions (0,7904 %) — Tabernus Corp., propriétaire depuis le 17/02/2016 Addison Business Ltd, UBO — AVB, Sushchenko L.</w:t>
+        <w:spacing w:before="120" w:after="0" w:line="276" w:lineRule="auto"/>
+      </w:pPr>
+      <w:r>
+        <w:t>16 425 actions (0,7904 %) — Tabernus Corp., propriétaire depuis le 17 février 2016 Addison Business Ltd, UBO — AVB, Sushchenko L.</w:t>
       </w:r>
     </w:p>
     <w:p>
@@ -9200,7 +9201,7 @@
           <w:lang w:val="uk-UA"/>
         </w:rPr>
         <w:ind w:left="0" w:hanging="567"/>
-        <w:spacing w:before="120" w:after="0" w:line="240" w:lineRule="auto"/>
+        <w:spacing w:before="120" w:after="0" w:line="276" w:lineRule="auto"/>
       </w:pPr>
       <w:r>
         <w:t>Le 19 décembre 2014, signature d'un contrat de séquestre (Escrow Agreement) d'un montant de 25 millions USD entre :</w:t>
@@ -9223,7 +9224,7 @@
           <w:lang w:val="uk-UA"/>
         </w:rPr>
         <w:ind w:left="567" w:hanging="567"/>
-        <w:spacing w:before="120" w:after="0" w:line="240" w:lineRule="auto"/>
+        <w:spacing w:before="120" w:after="0" w:line="276" w:lineRule="auto"/>
       </w:pPr>
       <w:r>
         <w:t>Skyrizon Aircraft Holdings Limited — Acquéreur, filiale de Hong Kong Skyrizon Holding Limited, propriété de Beijing Skyrizon Aviation Industry Investment Co., Ltd. du ressortissant de la RPC Wang Jing ;</w:t>
@@ -9246,7 +9247,7 @@
           <w:lang w:val="uk-UA"/>
         </w:rPr>
         <w:ind w:left="567" w:hanging="567"/>
-        <w:spacing w:before="120" w:after="0" w:line="240" w:lineRule="auto"/>
+        <w:spacing w:before="120" w:after="0" w:line="276" w:lineRule="auto"/>
       </w:pPr>
       <w:r>
         <w:t>Laterson Management Group Ltd. — Vendeur, sous le contrôle d'AVB ;</w:t>
@@ -9269,7 +9270,7 @@
           <w:lang w:val="uk-UA"/>
         </w:rPr>
         <w:ind w:left="567" w:hanging="567"/>
-        <w:spacing w:before="120" w:after="0" w:line="240" w:lineRule="auto"/>
+        <w:spacing w:before="120" w:after="0" w:line="276" w:lineRule="auto"/>
       </w:pPr>
       <w:r>
         <w:t>UBI Banca International S.A. — Agent séquestre (Escrow Agent).</w:t>
@@ -9286,7 +9287,7 @@
           <w:szCs w:val="22"/>
           <w:lang w:val="uk-UA"/>
         </w:rPr>
-        <w:spacing w:before="120" w:after="0" w:line="240" w:lineRule="auto"/>
+        <w:spacing w:before="120" w:after="0" w:line="276" w:lineRule="auto"/>
       </w:pPr>
       <w:r>
         <w:t>Aux termes du contrat, la somme séquestrée s'élève à 25 millions USD, déposée par l'acquéreur sur le compte séquestre dédié, et qui n'est transférée au vendeur qu'après notification de l'exécution de toutes les stipulations contractuelles entre acheteur et vendeur.</w:t>
@@ -9306,7 +9307,7 @@
           <w:lang w:val="uk-UA"/>
         </w:rPr>
         <w:ind w:left="0" w:hanging="709"/>
-        <w:spacing w:before="120" w:after="0" w:line="240" w:lineRule="auto"/>
+        <w:spacing w:before="120" w:after="0" w:line="276" w:lineRule="auto"/>
       </w:pPr>
       <w:r>
         <w:t>Le 29 décembre 2014, Skyrizon Aircraft Holdings Limited (RPC) a viré 25 millions USD sur le compte séquestre n° 986949 (titulaire — SKYRIZON/LATERSON ESCROW ACCOUNT, IBAN : LU68 3010 9869 49US D001) auprès d'UBI Banca International S.A.</w:t>
@@ -9326,7 +9327,7 @@
           <w:lang w:val="uk-UA"/>
         </w:rPr>
         <w:ind w:left="0" w:hanging="709"/>
-        <w:spacing w:before="120" w:after="0" w:line="240" w:lineRule="auto"/>
+        <w:spacing w:before="120" w:after="0" w:line="276" w:lineRule="auto"/>
       </w:pPr>
       <w:r>
         <w:t>Le 13 janvier 2015, ouverture du compte n° 987012 auprès d'UBI Banca International S.A. pour Laterson Management Group Ltd., dont l'UBO est AVB.</w:t>
@@ -9340,7 +9341,7 @@
           <w:lang w:val="uk-UA"/>
         </w:rPr>
         <w:pStyle w:val="a"/>
-        <w:spacing w:before="120" w:after="0" w:line="240" w:lineRule="auto"/>
+        <w:spacing w:before="120" w:after="0" w:line="276" w:lineRule="auto"/>
       </w:pPr>
       <w:r>
         <w:t>Le 18 mai 2015, UBI Banca International S.A. ouvre des comptes pour les entités dont l'UBO est AVB :</w:t>
@@ -9363,7 +9364,7 @@
           <w:lang w:val="uk-UA"/>
         </w:rPr>
         <w:ind w:left="567" w:hanging="567"/>
-        <w:spacing w:before="120" w:after="0" w:line="240" w:lineRule="auto"/>
+        <w:spacing w:before="120" w:after="0" w:line="276" w:lineRule="auto"/>
       </w:pPr>
       <w:r>
         <w:t>Katran Ltd. — compte n° 987113,</w:t>
@@ -9386,7 +9387,7 @@
           <w:lang w:val="uk-UA"/>
         </w:rPr>
         <w:ind w:left="567" w:hanging="567"/>
-        <w:spacing w:before="120" w:after="0" w:line="240" w:lineRule="auto"/>
+        <w:spacing w:before="120" w:after="0" w:line="276" w:lineRule="auto"/>
       </w:pPr>
       <w:r>
         <w:t>Stamio Investments Ltd. — compte n° 987116,</w:t>
@@ -9409,7 +9410,7 @@
           <w:lang w:val="uk-UA"/>
         </w:rPr>
         <w:ind w:left="567" w:hanging="567"/>
-        <w:spacing w:before="120" w:after="0" w:line="240" w:lineRule="auto"/>
+        <w:spacing w:before="120" w:after="0" w:line="276" w:lineRule="auto"/>
       </w:pPr>
       <w:r>
         <w:t>Taladin Limited — compte n° 987114,</w:t>
@@ -9432,7 +9433,7 @@
           <w:lang w:val="uk-UA"/>
         </w:rPr>
         <w:ind w:left="567" w:hanging="567"/>
-        <w:spacing w:before="120" w:after="0" w:line="240" w:lineRule="auto"/>
+        <w:spacing w:before="120" w:after="0" w:line="276" w:lineRule="auto"/>
       </w:pPr>
       <w:r>
         <w:t>Calloway Finance Limited — compte n° 987115.</w:t>
@@ -9452,10 +9453,10 @@
           <w:lang w:val="uk-UA"/>
         </w:rPr>
         <w:ind w:left="0" w:hanging="709"/>
-        <w:spacing w:before="120" w:after="0" w:line="240" w:lineRule="auto"/>
-      </w:pPr>
-      <w:r>
-        <w:t>Le 29 mai 2015, signature de la convention-cadre (« Framework Agreement ») aux termes de laquelle les Vendeurs cèdent 100 % des droits sociaux sur les sociétés non-résidentes qui détiennent directement ou indirectement 49,97 % des actions de JSC « Motor Sich », contre paiement par les Acquéreurs de 500 millions USD (dont 25 millions USD versés le 29/12/2014 sur compte séquestre), entre :</w:t>
+        <w:spacing w:before="120" w:after="0" w:line="276" w:lineRule="auto"/>
+      </w:pPr>
+      <w:r>
+        <w:t>Le 29 mai 2015, signature de la convention-cadre (« Framework Agreement ») aux termes de laquelle les Vendeurs cèdent 100 % des droits sociaux sur les sociétés non-résidentes qui détiennent directement ou indirectement 49,97 % des actions de JSC « Motor Sich », contre paiement par les Acquéreurs de 500 millions USD (dont 25 millions USD versés le 29 décembre 2014 sur compte séquestre), entre :</w:t>
       </w:r>
     </w:p>
     <w:p>
@@ -9472,7 +9473,7 @@
           <w:lang w:val="uk-UA"/>
         </w:rPr>
         <w:ind w:left="567" w:hanging="567"/>
-        <w:spacing w:before="120" w:after="0" w:line="240" w:lineRule="auto"/>
+        <w:spacing w:before="120" w:after="0" w:line="276" w:lineRule="auto"/>
       </w:pPr>
       <w:r>
         <w:t>les Vendeurs — Katran Ltd., Calloway Finance Limited, Longwizard Corp., Laterson Management Group Ltd., Stamio Investments Ltd., Taladin Limited (sociétés d'O. Boguslayev) ;</w:t>
@@ -9492,7 +9493,7 @@
           <w:lang w:val="uk-UA"/>
         </w:rPr>
         <w:ind w:left="567" w:hanging="567"/>
-        <w:spacing w:before="120" w:after="0" w:line="240" w:lineRule="auto"/>
+        <w:spacing w:before="120" w:after="0" w:line="276" w:lineRule="auto"/>
       </w:pPr>
       <w:r>
         <w:t>les Acquéreurs — Reckoner Investments Holdings Limited, Argio Investment Holdings Limited, Skyrizon Aircraft Holdings Limited (sociétés affiliées à Wang Jing).</w:t>
@@ -9512,7 +9513,7 @@
           <w:lang w:val="uk-UA"/>
         </w:rPr>
         <w:ind w:left="0" w:hanging="709"/>
-        <w:spacing w:before="120" w:after="0" w:line="240" w:lineRule="auto"/>
+        <w:spacing w:before="120" w:after="0" w:line="276" w:lineRule="auto"/>
       </w:pPr>
       <w:r>
         <w:t>Le 21 décembre 2015, conclusion de la convention de séquestre (« Escrow Agreement ») entre :</w:t>
@@ -9534,7 +9535,7 @@
           <w:lang w:val="uk-UA" w:eastAsia="uk-UA"/>
         </w:rPr>
         <w:ind w:left="567" w:hanging="567"/>
-        <w:spacing w:before="120" w:after="0" w:line="240" w:lineRule="auto"/>
+        <w:spacing w:before="120" w:after="0" w:line="276" w:lineRule="auto"/>
       </w:pPr>
       <w:r>
         <w:t>Skyrizon Aircraft Holdings Limited (Acquéreur 1), Reckoner Investments Holdings Limited (Acquéreur 2), Argio Investment Holdings Limited (Acquéreur 3) et</w:t>
@@ -9556,7 +9557,7 @@
           <w:lang w:val="uk-UA" w:eastAsia="uk-UA"/>
         </w:rPr>
         <w:ind w:left="567" w:hanging="567"/>
-        <w:spacing w:before="120" w:after="0" w:line="240" w:lineRule="auto"/>
+        <w:spacing w:before="120" w:after="0" w:line="276" w:lineRule="auto"/>
       </w:pPr>
       <w:r>
         <w:t>Laterson Management Group LTD (Vendeur 1 représenté par O. Boguslayev) — 9,27 % des actions ; Katran LTD (Vendeur 2 représenté par O. Boguslayev) — 17,31 % des actions ; Stamio Investments LTD (Vendeur 3 représenté par O. Boguslayev) — 3,11 % des actions ; Taladin Limited (Vendeur 4 représenté par O. Boguslayev) — 1,3 % des actions ; Calloway Finance Limited (Vendeur 5 représenté par O. Boguslayev) — 9,69 % des actions ; Longwizard Corp (Vendeur 6 représenté par O. Boguslayev) — 9,29 % des actions.</w:t>
@@ -9572,7 +9573,7 @@
           <w:szCs w:val="22"/>
           <w:lang w:val="uk-UA" w:eastAsia="uk-UA"/>
         </w:rPr>
-        <w:spacing w:before="120" w:after="0" w:line="240" w:lineRule="auto"/>
+        <w:spacing w:before="120" w:after="0" w:line="276" w:lineRule="auto"/>
       </w:pPr>
       <w:r>
         <w:t>AVB agissait en qualité de mandataire habilité avec droit de signature des actes de cession de 49,97 % des actions au nom des 6 cédants.</w:t>
@@ -9593,10 +9594,10 @@
           <w:lang w:val="uk-UA"/>
         </w:rPr>
         <w:ind w:left="0" w:hanging="709"/>
-        <w:spacing w:before="120" w:after="0" w:line="240" w:lineRule="auto"/>
-      </w:pPr>
-      <w:r>
-        <w:t>Le 21 décembre 2015, signature d'un avenant refondant la convention-cadre du 29/05/2015, fixant la valeur globale du contrat à 607 millions USD, comprenant :</w:t>
+        <w:spacing w:before="120" w:after="0" w:line="276" w:lineRule="auto"/>
+      </w:pPr>
+      <w:r>
+        <w:t>Le 21 décembre 2015, signature d'un avenant refondant la convention-cadre du 29 mai 2015, fixant la valeur globale du contrat à 607 millions USD, comprenant :</w:t>
       </w:r>
     </w:p>
     <w:p>
@@ -9614,10 +9615,10 @@
           <w:lang w:val="uk-UA"/>
         </w:rPr>
         <w:ind w:left="567"/>
-        <w:spacing w:before="120" w:after="0" w:line="240" w:lineRule="auto"/>
-      </w:pPr>
-      <w:r>
-        <w:t>25 millions USD déjà libérés aux termes de la convention de séquestre du 19/12/2014 ;</w:t>
+        <w:spacing w:before="120" w:after="0" w:line="276" w:lineRule="auto"/>
+      </w:pPr>
+      <w:r>
+        <w:t>25 millions USD déjà libérés aux termes de la convention de séquestre du 19 décembre 2014 ;</w:t>
       </w:r>
     </w:p>
     <w:p>
@@ -9635,7 +9636,7 @@
           <w:lang w:val="uk-UA"/>
         </w:rPr>
         <w:ind w:left="567"/>
-        <w:spacing w:before="120" w:after="0" w:line="240" w:lineRule="auto"/>
+        <w:spacing w:before="120" w:after="0" w:line="276" w:lineRule="auto"/>
       </w:pPr>
       <w:r>
         <w:t>le solde de 582 millions USD à verser sur le nouveau compte séquestre conformément aux termes de la nouvelle convention de séquestre.</w:t>
@@ -9651,7 +9652,7 @@
           <w:szCs w:val="22"/>
           <w:lang w:val="uk-UA" w:eastAsia="uk-UA"/>
         </w:rPr>
-        <w:spacing w:before="120" w:after="0" w:line="240" w:lineRule="auto"/>
+        <w:spacing w:before="120" w:after="0" w:line="276" w:lineRule="auto"/>
       </w:pPr>
       <w:r>
         <w:t>En exécution de cette convention-cadre, les opérations suivantes sont réalisées :</w:t>
@@ -9673,7 +9674,7 @@
           <w:lang w:val="uk-UA" w:eastAsia="uk-UA"/>
         </w:rPr>
         <w:ind w:left="567" w:hanging="567"/>
-        <w:spacing w:before="120" w:after="0" w:line="240" w:lineRule="auto"/>
+        <w:spacing w:before="120" w:after="0" w:line="276" w:lineRule="auto"/>
       </w:pPr>
       <w:r>
         <w:t>Katran Ltd. cède 100 % du capital social de Business House Helena A.G. à Reckoner Investments Holdings Limited pour 211,52 millions USD, conférant à Reckoner 17,31 % des actions de JSC « Motor Sich » ;</w:t>
@@ -9695,7 +9696,7 @@
           <w:lang w:val="uk-UA" w:eastAsia="uk-UA"/>
         </w:rPr>
         <w:ind w:left="567" w:hanging="567"/>
-        <w:spacing w:before="120" w:after="0" w:line="240" w:lineRule="auto"/>
+        <w:spacing w:before="120" w:after="0" w:line="276" w:lineRule="auto"/>
       </w:pPr>
       <w:r>
         <w:t>Calloway Finance Limited cède 100 % du capital social de Croftdale Investments Limited à Argio Investment Holdings Limited pour 118,40 millions USD, conférant à Argio 9,69 % des actions de JSC « Motor Sich ».</w:t>
@@ -9713,7 +9714,7 @@
           <w:lang w:val="uk-UA" w:eastAsia="uk-UA"/>
         </w:rPr>
         <w:ind w:left="567"/>
-        <w:spacing w:before="120" w:after="0" w:line="240" w:lineRule="auto"/>
+        <w:spacing w:before="120" w:after="0" w:line="276" w:lineRule="auto"/>
       </w:pPr>
       <w:r>
         <w:t>À son tour, Croftdale Investments Limited détient 100 % du capital social de la SARL « Motor-Intercoms », actionnaire direct des actions de JSC « Motor Sich » ;</w:t>
@@ -9735,7 +9736,7 @@
           <w:lang w:val="uk-UA" w:eastAsia="uk-UA"/>
         </w:rPr>
         <w:ind w:left="567" w:hanging="567"/>
-        <w:spacing w:before="120" w:after="0" w:line="240" w:lineRule="auto"/>
+        <w:spacing w:before="120" w:after="0" w:line="276" w:lineRule="auto"/>
       </w:pPr>
       <w:r>
         <w:t>Longwizard Corp cède 100 % du capital social de Montagne Ltd. à Argio Investment Holdings Limited pour 114,40 millions USD, conférant à Argio 9,29 % des actions de JSC « Motor Sich ».</w:t>
@@ -9753,7 +9754,7 @@
           <w:lang w:val="uk-UA" w:eastAsia="uk-UA"/>
         </w:rPr>
         <w:ind w:left="567"/>
-        <w:spacing w:before="120" w:after="0" w:line="240" w:lineRule="auto"/>
+        <w:spacing w:before="120" w:after="0" w:line="276" w:lineRule="auto"/>
       </w:pPr>
       <w:r>
         <w:t>À son tour, Montagne Ltd. détient 100 % du capital social de JSC « TD Olena », actionnaire direct des actions de JSC « Motor Sich » ;</w:t>
@@ -9775,7 +9776,7 @@
           <w:lang w:val="uk-UA" w:eastAsia="uk-UA"/>
         </w:rPr>
         <w:ind w:left="567" w:hanging="567"/>
-        <w:spacing w:before="120" w:after="0" w:line="240" w:lineRule="auto"/>
+        <w:spacing w:before="120" w:after="0" w:line="276" w:lineRule="auto"/>
       </w:pPr>
       <w:r>
         <w:t>Laterson Management Group Ltd. cède 100 % du capital social de Granum Corporation à Skyrizon Aircraft Holdings Limited pour 82,98 millions USD, conférant à Skyrizon 9,27 % des actions de JSC « Motor Sich » ;</w:t>
@@ -9797,7 +9798,7 @@
           <w:lang w:val="uk-UA" w:eastAsia="uk-UA"/>
         </w:rPr>
         <w:ind w:left="567" w:hanging="567"/>
-        <w:spacing w:before="120" w:after="0" w:line="240" w:lineRule="auto"/>
+        <w:spacing w:before="120" w:after="0" w:line="276" w:lineRule="auto"/>
       </w:pPr>
       <w:r>
         <w:t>Stamio Investments Ltd. cède 100 % du capital social d'Enfields Trade &amp; Capital Corp. à Reckoner Investments Holdings Limited pour 38,49 millions USD, conférant à Reckoner 3,11 % des actions de JSC « Motor Sich » ;</w:t>
@@ -9819,7 +9820,7 @@
           <w:lang w:val="uk-UA" w:eastAsia="uk-UA"/>
         </w:rPr>
         <w:ind w:left="567" w:hanging="567"/>
-        <w:spacing w:before="120" w:after="0" w:line="240" w:lineRule="auto"/>
+        <w:spacing w:before="120" w:after="0" w:line="276" w:lineRule="auto"/>
       </w:pPr>
       <w:r>
         <w:t>Taladin Limited cède 100 % du capital social de Waldo Trade Ltd. à Reckoner Investments Holdings Limited pour 16,21 millions USD, conférant à Reckoner 1,3 % des actions de JSC « Motor Sich » ;</w:t>
@@ -9840,7 +9841,7 @@
           <w:lang w:val="uk-UA"/>
         </w:rPr>
         <w:ind w:left="0" w:hanging="709"/>
-        <w:spacing w:before="120" w:after="0" w:line="240" w:lineRule="auto"/>
+        <w:spacing w:before="120" w:after="0" w:line="276" w:lineRule="auto"/>
       </w:pPr>
       <w:r>
         <w:t>Le 21 décembre 2015, signature de la convention-cadre entre Boguslayev V. et Likatron Enterprises Limited pour la cession de 15 % des actions de JSC « Motor Sich » (311 699 actions) pour 43 millions USD ;</w:t>
@@ -9861,7 +9862,7 @@
           <w:lang w:val="uk-UA"/>
         </w:rPr>
         <w:ind w:left="0" w:hanging="709"/>
-        <w:spacing w:before="120" w:after="0" w:line="240" w:lineRule="auto"/>
+        <w:spacing w:before="120" w:after="0" w:line="276" w:lineRule="auto"/>
       </w:pPr>
       <w:r>
         <w:t>Le 21 décembre 2015, signature de la convention de séquestre (« Escrow Agreement ») entre Boguslayev V., Likatron Enterprises Limited et UBI Banca International S.A. pour garantir la transaction de 43 millions USD.</w:t>
@@ -9882,7 +9883,7 @@
           <w:lang w:val="uk-UA"/>
         </w:rPr>
         <w:ind w:left="0" w:hanging="709"/>
-        <w:spacing w:before="120" w:after="0" w:line="240" w:lineRule="auto"/>
+        <w:spacing w:before="120" w:after="0" w:line="276" w:lineRule="auto"/>
       </w:pPr>
       <w:r>
         <w:t>Le 29 décembre 2015, ont été virés :</w:t>
@@ -9902,7 +9903,7 @@
           <w:lang w:val="uk-UA"/>
         </w:rPr>
         <w:ind w:left="567" w:hanging="567"/>
-        <w:spacing w:before="120" w:after="0" w:line="240" w:lineRule="auto"/>
+        <w:spacing w:before="120" w:after="0" w:line="276" w:lineRule="auto"/>
       </w:pPr>
       <w:r>
         <w:t>582 millions USD sur le compte séquestre n° 987141 (titulaire — Project Zoom Escrow Account, IBAN EUR : LU09 3010 9871 41EU R001, IBAN USD : LU61 3010 9871 41US D001) auprès d'UBI Banca International S.A. ;</w:t>
@@ -9922,7 +9923,7 @@
           <w:lang w:val="uk-UA"/>
         </w:rPr>
         <w:ind w:left="567" w:hanging="567"/>
-        <w:spacing w:before="120" w:after="0" w:line="240" w:lineRule="auto"/>
+        <w:spacing w:before="120" w:after="0" w:line="276" w:lineRule="auto"/>
       </w:pPr>
       <w:r>
         <w:t>43 millions USD sur le compte séquestre n° 987220 (titulaire — Project Zoom II Escrow Account, IBAN EUR : LU09 3010 9871 41EU R001, IBAN USD : LU61 3010 9871 41US D001) pour la transaction avec Boguslayev V.</w:t>
@@ -9943,7 +9944,7 @@
           <w:lang w:val="uk-UA"/>
         </w:rPr>
         <w:ind w:left="0" w:hanging="567"/>
-        <w:spacing w:before="120" w:after="0" w:line="240" w:lineRule="auto"/>
+        <w:spacing w:before="120" w:after="0" w:line="276" w:lineRule="auto"/>
       </w:pPr>
       <w:r>
         <w:t>Le 14 avril 2016, ouverture du compte n° 987112 auprès d'UBI Banca International S.A. pour Longwizard Corp. (société d'O. Boguslayev).</w:t>
@@ -9964,7 +9965,7 @@
           <w:lang w:val="uk-UA"/>
         </w:rPr>
         <w:ind w:left="0" w:hanging="567"/>
-        <w:spacing w:before="120" w:after="0" w:line="240" w:lineRule="auto"/>
+        <w:spacing w:before="120" w:after="0" w:line="276" w:lineRule="auto"/>
       </w:pPr>
       <w:r>
         <w:t>Du 22 février au 1er juin 2016, après exécution des conditions des conventions-cadres, l'agent séquestre UBI Banca International S.A. a débloqué :</w:t>
@@ -9987,7 +9988,7 @@
           <w:lang w:val="uk-UA"/>
         </w:rPr>
         <w:ind w:left="567" w:hanging="567"/>
-        <w:spacing w:before="120" w:after="0" w:line="240" w:lineRule="auto"/>
+        <w:spacing w:before="120" w:after="0" w:line="276" w:lineRule="auto"/>
       </w:pPr>
       <w:r>
         <w:t>607 millions USD depuis les comptes séquestres n° 986949 et n° 987141 vers les comptes des sociétés offshore sous le contrôle d'AVB — comprenant Business House Helena, Enfields Trade &amp; Capital Corp., Waldo Trade Ltd., Granum Corporation, Likatron Enterprises Limited ;</w:t>
@@ -10010,7 +10011,7 @@
           <w:lang w:val="uk-UA"/>
         </w:rPr>
         <w:ind w:left="567" w:hanging="567"/>
-        <w:spacing w:before="120" w:after="0" w:line="240" w:lineRule="auto"/>
+        <w:spacing w:before="120" w:after="0" w:line="276" w:lineRule="auto"/>
       </w:pPr>
       <w:r>
         <w:t>43 millions USD depuis le compte séquestre n° 987220 vers les comptes bancaires personnels de Boguslayev V.O. ;</w:t>
@@ -10024,7 +10025,7 @@
           <w:lang w:val="uk-UA"/>
         </w:rPr>
         <w:pStyle w:val="a"/>
-        <w:spacing w:before="120" w:after="0" w:line="240" w:lineRule="auto"/>
+        <w:spacing w:before="120" w:after="0" w:line="276" w:lineRule="auto"/>
       </w:pPr>
       <w:r>
         <w:t>Ces virements présentaient un caractère synchronisé après l'enregistrement des transferts de droits sociaux et la confirmation émise par les acquéreurs de la RPC.</w:t>
@@ -10044,7 +10045,7 @@
           <w:lang w:val="uk-UA"/>
         </w:rPr>
         <w:ind w:left="0" w:hanging="709"/>
-        <w:spacing w:before="120" w:after="0" w:line="240" w:lineRule="auto"/>
+        <w:spacing w:before="120" w:after="0" w:line="276" w:lineRule="auto"/>
       </w:pPr>
       <w:r>
         <w:t>Le 9 juin 2017, Skyrizon Aircraft Holdings Limited et JSC « Motor Sich » ont déposé auprès de l'AMKU la demande n° 15-10/317-EKk sollicitant l'agrément de concentration, précisant l'actionnariat suivant :</w:t>
@@ -10064,7 +10065,7 @@
           <w:lang w:val="uk-UA"/>
         </w:rPr>
         <w:ind w:left="567" w:hanging="567"/>
-        <w:spacing w:before="120" w:after="0" w:line="240" w:lineRule="auto"/>
+        <w:spacing w:before="120" w:after="0" w:line="276" w:lineRule="auto"/>
       </w:pPr>
       <w:r>
         <w:t>Skyrizon Aircraft Holdings Limited — 9,9992 % ;</w:t>
@@ -10084,7 +10085,7 @@
           <w:lang w:val="uk-UA"/>
         </w:rPr>
         <w:ind w:left="567" w:hanging="567"/>
-        <w:spacing w:before="120" w:after="0" w:line="240" w:lineRule="auto"/>
+        <w:spacing w:before="120" w:after="0" w:line="276" w:lineRule="auto"/>
       </w:pPr>
       <w:r>
         <w:t>Business House Helena, AG — 17,3113 % ;</w:t>
@@ -10104,7 +10105,7 @@
           <w:lang w:val="uk-UA"/>
         </w:rPr>
         <w:ind w:left="567" w:hanging="567"/>
-        <w:spacing w:before="120" w:after="0" w:line="240" w:lineRule="auto"/>
+        <w:spacing w:before="120" w:after="0" w:line="276" w:lineRule="auto"/>
       </w:pPr>
       <w:r>
         <w:t>Enfields Trade &amp; Capital Corp. — 3,1152 % ;</w:t>
@@ -10124,7 +10125,7 @@
           <w:lang w:val="uk-UA"/>
         </w:rPr>
         <w:ind w:left="567" w:hanging="567"/>
-        <w:spacing w:before="120" w:after="0" w:line="240" w:lineRule="auto"/>
+        <w:spacing w:before="120" w:after="0" w:line="276" w:lineRule="auto"/>
       </w:pPr>
       <w:r>
         <w:t>Waldo Trade Ltd. — 1,3035 % ;</w:t>
@@ -10144,7 +10145,7 @@
           <w:lang w:val="uk-UA"/>
         </w:rPr>
         <w:ind w:left="567" w:hanging="567"/>
-        <w:spacing w:before="120" w:after="0" w:line="240" w:lineRule="auto"/>
+        <w:spacing w:before="120" w:after="0" w:line="276" w:lineRule="auto"/>
       </w:pPr>
       <w:r>
         <w:t>Granum Corporation — 9,2717 % ;</w:t>
@@ -10164,7 +10165,7 @@
           <w:lang w:val="uk-UA"/>
         </w:rPr>
         <w:ind w:left="567" w:hanging="567"/>
-        <w:spacing w:before="120" w:after="0" w:line="240" w:lineRule="auto"/>
+        <w:spacing w:before="120" w:after="0" w:line="276" w:lineRule="auto"/>
       </w:pPr>
       <w:r>
         <w:t>Likatron Enterprises Limited — 9,99 % ;</w:t>
@@ -10184,7 +10185,7 @@
           <w:lang w:val="uk-UA"/>
         </w:rPr>
         <w:ind w:left="567" w:hanging="567"/>
-        <w:spacing w:before="120" w:after="0" w:line="240" w:lineRule="auto"/>
+        <w:spacing w:before="120" w:after="0" w:line="276" w:lineRule="auto"/>
       </w:pPr>
       <w:r>
         <w:t>Wang Xinlei — 5,01 %.</w:t>
@@ -10204,7 +10205,7 @@
           <w:lang w:val="uk-UA"/>
         </w:rPr>
         <w:ind w:left="0" w:hanging="567"/>
-        <w:spacing w:before="120" w:after="0" w:line="240" w:lineRule="auto"/>
+        <w:spacing w:before="120" w:after="0" w:line="276" w:lineRule="auto"/>
       </w:pPr>
       <w:r>
         <w:t>Le 12 juillet 2017, l'AMKU a notifié une violation de la législation sur la protection de la concurrence économique en raison de la prise de contrôle indirecte sur 56,009 % des actions de JSC « Motor Sich » sans agrément préalable de l'AMKU.</w:t>
@@ -10224,7 +10225,7 @@
           <w:lang w:val="uk-UA"/>
         </w:rPr>
         <w:ind w:left="0" w:hanging="567"/>
-        <w:spacing w:before="120" w:after="0" w:line="240" w:lineRule="auto"/>
+        <w:spacing w:before="120" w:after="0" w:line="276" w:lineRule="auto"/>
       </w:pPr>
       <w:r>
         <w:t>Le 1er mars 2018, le RNBO a adopté la décision « Sur les mesures urgentes visant la protection des intérêts nationaux de l'État dans le domaine de la construction de moteurs d'aviation ».</w:t>
@@ -10244,10 +10245,10 @@
           <w:lang w:val="uk-UA"/>
         </w:rPr>
         <w:ind w:left="0" w:hanging="567"/>
-        <w:spacing w:before="120" w:after="0" w:line="240" w:lineRule="auto"/>
-      </w:pPr>
-      <w:r>
-        <w:t>Le 6 mars 2018, par Décret du Président de l'Ukraine, a été mise en application la décision du RNBO du 01.03.2018 « Sur les mesures urgentes visant la protection des intérêts nationaux de l'État dans le domaine de la construction de moteurs d'aviation ».</w:t>
+        <w:spacing w:before="120" w:after="0" w:line="276" w:lineRule="auto"/>
+      </w:pPr>
+      <w:r>
+        <w:t>Le 6 mars 2018, par Décret du Président de l'Ukraine, a été mise en application la décision du RNBO du 1er mars 2018 « Sur les mesures urgentes visant la protection des intérêts nationaux de l'État dans le domaine de la construction de moteurs d'aviation ».</w:t>
       </w:r>
     </w:p>
     <w:p>
@@ -10264,7 +10265,7 @@
           <w:lang w:val="uk-UA"/>
         </w:rPr>
         <w:ind w:left="0" w:hanging="567"/>
-        <w:spacing w:before="120" w:after="0" w:line="240" w:lineRule="auto"/>
+        <w:spacing w:before="120" w:after="0" w:line="276" w:lineRule="auto"/>
       </w:pPr>
       <w:r>
         <w:t>Le 19 avril 2018, en exécution dudit décret présidentiel, le Comité gouvernemental pour la politique économique, financière et juridique a adopté une décision visant à conclure un accord de coopération entre le consortium public « Ukroboronprom », la société « Skyrizon Aircraft Holdings Limited » et la société « Beijing Xinwei Telecom Technology Group Co., Ltd ».</w:t>
@@ -10284,7 +10285,7 @@
           <w:lang w:val="uk-UA"/>
         </w:rPr>
         <w:ind w:left="0" w:hanging="567"/>
-        <w:spacing w:before="120" w:after="0" w:line="240" w:lineRule="auto"/>
+        <w:spacing w:before="120" w:after="0" w:line="276" w:lineRule="auto"/>
       </w:pPr>
       <w:r>
         <w:t>Le 27 avril 2018, un accord de coopération a été conclu entre « Ukroboronprom » et Skyrizon Aircraft Holdings Limited, aux termes duquel Skyrizon s'engageait à céder à titre gratuit 25,0002 % des actions de JSC « Motor Sich » à Ukroboronprom.</w:t>
@@ -10301,7 +10302,7 @@
           <w:lang w:val="uk-UA"/>
         </w:rPr>
         <w:ind w:left="0"/>
-        <w:spacing w:before="120" w:after="0" w:line="240" w:lineRule="auto"/>
+        <w:spacing w:before="120" w:after="0" w:line="276" w:lineRule="auto"/>
       </w:pPr>
       <w:r>
         <w:t>À ce jour, ledit accord n'a pas été exécuté.</w:t>
@@ -10318,7 +10319,7 @@
           <w:lang w:val="uk-UA"/>
         </w:rPr>
         <w:ind w:left="0"/>
-        <w:spacing w:before="120" w:after="0" w:line="240" w:lineRule="auto"/>
+        <w:spacing w:before="120" w:after="0" w:line="276" w:lineRule="auto"/>
       </w:pPr>
       <w:r/>
     </w:p>
@@ -10339,7 +10340,7 @@
           <w:lang w:val="uk-UA"/>
         </w:rPr>
         <w:ind w:left="0" w:hanging="425"/>
-        <w:spacing w:before="120" w:after="0" w:line="240" w:lineRule="auto"/>
+        <w:spacing w:before="120" w:after="0" w:line="276" w:lineRule="auto"/>
       </w:pPr>
       <w:r>
         <w:rPr>
@@ -10387,16 +10388,16 @@
           <w:lang w:val="uk-UA"/>
         </w:rPr>
         <w:ind w:left="0" w:hanging="567"/>
-        <w:spacing w:before="120" w:after="0" w:line="240" w:lineRule="auto"/>
-      </w:pPr>
-      <w:r>
-        <w:rPr>
-          <w:rFonts w:ascii="Cambria" w:hAnsi="Cambria" w:cs="Cambria"/>
-          <w:sz w:val="22"/>
-          <w:szCs w:val="22"/>
-          <w:lang w:val="uk-UA"/>
-        </w:rPr>
-        <w:t>Après l'exécution des conditions des conventions-cadres de cession de droits sociaux entre le 22/02/2016 et le 01/06/2016, l'agent séquestre UBI Banca International S.A. (Luxembourg) a transféré depuis les comptes séquestres spéciaux n° 986949 et n° 987141 des fonds à hauteur de 607 millions USD sur les comptes de sociétés sous le contrôle d'AVB.</w:t>
+        <w:spacing w:before="120" w:after="0" w:line="276" w:lineRule="auto"/>
+      </w:pPr>
+      <w:r>
+        <w:rPr>
+          <w:rFonts w:ascii="Cambria" w:hAnsi="Cambria" w:cs="Cambria"/>
+          <w:sz w:val="22"/>
+          <w:szCs w:val="22"/>
+          <w:lang w:val="uk-UA"/>
+        </w:rPr>
+        <w:t>Après l'exécution des conditions des conventions-cadres de cession de droits sociaux entre le 22 février 2016 et le 1er juin 2016, l'agent séquestre UBI Banca International S.A. (Luxembourg) a transféré depuis les comptes séquestres spéciaux n° 986949 et n° 987141 des fonds à hauteur de 607 millions USD sur les comptes de sociétés sous le contrôle d'AVB.</w:t>
       </w:r>
       <w:r>
         <w:rPr>
@@ -10535,7 +10536,7 @@
           <w:lang w:val="uk-UA"/>
         </w:rPr>
         <w:ind w:left="0" w:hanging="567"/>
-        <w:spacing w:before="120" w:after="0" w:line="240" w:lineRule="auto"/>
+        <w:spacing w:before="120" w:after="0" w:line="276" w:lineRule="auto"/>
       </w:pPr>
       <w:r>
         <w:rPr>
@@ -10595,7 +10596,7 @@
           <w:lang w:val="uk-UA"/>
         </w:rPr>
         <w:ind w:left="0" w:hanging="567"/>
-        <w:spacing w:before="120" w:after="0" w:line="240" w:lineRule="auto"/>
+        <w:spacing w:before="120" w:after="0" w:line="276" w:lineRule="auto"/>
       </w:pPr>
       <w:r>
         <w:rPr>
@@ -10769,7 +10770,7 @@
           <w:lang w:val="uk-UA"/>
         </w:rPr>
         <w:ind w:left="567" w:hanging="567"/>
-        <w:spacing w:before="120" w:after="0" w:line="240" w:lineRule="auto"/>
+        <w:spacing w:before="120" w:after="0" w:line="276" w:lineRule="auto"/>
       </w:pPr>
       <w:proofErr w:type="spellStart"/>
       <w:r>
@@ -10824,7 +10825,7 @@
           <w:lang w:val="uk-UA"/>
         </w:rPr>
         <w:ind w:left="1134" w:hanging="567"/>
-        <w:spacing w:before="120" w:after="0" w:line="240" w:lineRule="auto"/>
+        <w:spacing w:before="120" w:after="0" w:line="276" w:lineRule="auto"/>
       </w:pPr>
       <w:r>
         <w:rPr>
@@ -10924,16 +10925,16 @@
           <w:lang w:val="uk-UA"/>
         </w:rPr>
         <w:ind w:left="1134" w:hanging="567"/>
-        <w:spacing w:before="120" w:after="0" w:line="240" w:lineRule="auto"/>
-      </w:pPr>
-      <w:r>
-        <w:rPr>
-          <w:rFonts w:ascii="Cambria" w:hAnsi="Cambria" w:cs="Cambria"/>
-          <w:sz w:val="22"/>
-          <w:szCs w:val="22"/>
-          <w:lang w:val="uk-UA"/>
-        </w:rPr>
-        <w:t>Compte récepteur : n° 3042421, ouvert le 20/06/2018, clôturé le 25/07/2018</w:t>
+        <w:spacing w:before="120" w:after="0" w:line="276" w:lineRule="auto"/>
+      </w:pPr>
+      <w:r>
+        <w:rPr>
+          <w:rFonts w:ascii="Cambria" w:hAnsi="Cambria" w:cs="Cambria"/>
+          <w:sz w:val="22"/>
+          <w:szCs w:val="22"/>
+          <w:lang w:val="uk-UA"/>
+        </w:rPr>
+        <w:t>Compte récepteur : n° 3042421, ouvert le 20 juin 2018, clôturé le 25 juillet 2018</w:t>
       </w:r>
       <w:r>
         <w:rPr>
@@ -11010,7 +11011,7 @@
           <w:lang w:val="uk-UA"/>
         </w:rPr>
         <w:ind w:left="1134" w:hanging="567"/>
-        <w:spacing w:before="120" w:after="0" w:line="240" w:lineRule="auto"/>
+        <w:spacing w:before="120" w:after="0" w:line="276" w:lineRule="auto"/>
       </w:pPr>
       <w:r>
         <w:rPr>
@@ -11055,16 +11056,16 @@
           <w:lang w:val="uk-UA"/>
         </w:rPr>
         <w:ind w:left="1701" w:hanging="567"/>
-        <w:spacing w:before="120" w:after="0" w:line="240" w:lineRule="auto"/>
-      </w:pPr>
-      <w:r>
-        <w:rPr>
-          <w:rFonts w:ascii="Cambria" w:hAnsi="Cambria" w:cs="Cambria"/>
-          <w:sz w:val="22"/>
-          <w:szCs w:val="22"/>
-          <w:lang w:val="uk-UA"/>
-        </w:rPr>
-        <w:t>27/06/2018 — 62 194,33 USD depuis le compte LU563430004750031216 ;</w:t>
+        <w:spacing w:before="120" w:after="0" w:line="276" w:lineRule="auto"/>
+      </w:pPr>
+      <w:r>
+        <w:rPr>
+          <w:rFonts w:ascii="Cambria" w:hAnsi="Cambria" w:cs="Cambria"/>
+          <w:sz w:val="22"/>
+          <w:szCs w:val="22"/>
+          <w:lang w:val="uk-UA"/>
+        </w:rPr>
+        <w:t>27 juin 2018 — 62 194,33 USD depuis le compte LU563430004750031216 ;</w:t>
       </w:r>
       <w:r>
         <w:rPr>
@@ -11092,16 +11093,16 @@
           <w:lang w:val="uk-UA"/>
         </w:rPr>
         <w:ind w:left="1701" w:hanging="567"/>
-        <w:spacing w:before="120" w:after="0" w:line="240" w:lineRule="auto"/>
-      </w:pPr>
-      <w:r>
-        <w:rPr>
-          <w:rFonts w:ascii="Cambria" w:hAnsi="Cambria" w:cs="Cambria"/>
-          <w:sz w:val="22"/>
-          <w:szCs w:val="22"/>
-          <w:lang w:val="uk-UA"/>
-        </w:rPr>
-        <w:t>27/06/2018 — 10 705,94 EUR depuis le compte LU563430004750031313 ;</w:t>
+        <w:spacing w:before="120" w:after="0" w:line="276" w:lineRule="auto"/>
+      </w:pPr>
+      <w:r>
+        <w:rPr>
+          <w:rFonts w:ascii="Cambria" w:hAnsi="Cambria" w:cs="Cambria"/>
+          <w:sz w:val="22"/>
+          <w:szCs w:val="22"/>
+          <w:lang w:val="uk-UA"/>
+        </w:rPr>
+        <w:t>27 juin 2018 — 10 705,94 EUR depuis le compte LU563430004750031313 ;</w:t>
       </w:r>
       <w:r>
         <w:rPr>
@@ -11137,16 +11138,16 @@
           <w:lang w:val="uk-UA"/>
         </w:rPr>
         <w:ind w:left="1701" w:hanging="567"/>
-        <w:spacing w:before="120" w:after="0" w:line="240" w:lineRule="auto"/>
-      </w:pPr>
-      <w:r>
-        <w:rPr>
-          <w:rFonts w:ascii="Cambria" w:hAnsi="Cambria" w:cs="Cambria"/>
-          <w:sz w:val="22"/>
-          <w:szCs w:val="22"/>
-          <w:lang w:val="uk-UA"/>
-        </w:rPr>
-        <w:t>29/06/2018 — 11 669 963,74 GBP depuis le compte LU503430004750031518</w:t>
+        <w:spacing w:before="120" w:after="0" w:line="276" w:lineRule="auto"/>
+      </w:pPr>
+      <w:r>
+        <w:rPr>
+          <w:rFonts w:ascii="Cambria" w:hAnsi="Cambria" w:cs="Cambria"/>
+          <w:sz w:val="22"/>
+          <w:szCs w:val="22"/>
+          <w:lang w:val="uk-UA"/>
+        </w:rPr>
+        <w:t>29 juin 2018 — 11 669 963,74 GBP depuis le compte LU503430004750031518</w:t>
       </w:r>
     </w:p>
     <w:p>
@@ -11168,7 +11169,7 @@
           <w:lang w:val="uk-UA"/>
         </w:rPr>
         <w:ind w:left="567" w:hanging="567"/>
-        <w:spacing w:before="120" w:after="0" w:line="240" w:lineRule="auto"/>
+        <w:spacing w:before="120" w:after="0" w:line="276" w:lineRule="auto"/>
       </w:pPr>
       <w:r>
         <w:rPr>
@@ -11256,7 +11257,7 @@
           <w:lang w:val="uk-UA"/>
         </w:rPr>
         <w:ind w:left="1134" w:hanging="567"/>
-        <w:spacing w:before="120" w:after="0" w:line="240" w:lineRule="auto"/>
+        <w:spacing w:before="120" w:after="0" w:line="276" w:lineRule="auto"/>
       </w:pPr>
       <w:r>
         <w:rPr>
@@ -11338,16 +11339,16 @@
           <w:lang w:val="uk-UA"/>
         </w:rPr>
         <w:ind w:left="1134" w:hanging="567"/>
-        <w:spacing w:before="120" w:after="0" w:line="240" w:lineRule="auto"/>
-      </w:pPr>
-      <w:r>
-        <w:rPr>
-          <w:rFonts w:ascii="Cambria" w:hAnsi="Cambria" w:cs="Cambria"/>
-          <w:sz w:val="22"/>
-          <w:szCs w:val="22"/>
-          <w:lang w:val="uk-UA"/>
-        </w:rPr>
-        <w:t>Compte récepteur : n° 3040771, ouvert le 29/11/2017, clôturé le 25/07/2018</w:t>
+        <w:spacing w:before="120" w:after="0" w:line="276" w:lineRule="auto"/>
+      </w:pPr>
+      <w:r>
+        <w:rPr>
+          <w:rFonts w:ascii="Cambria" w:hAnsi="Cambria" w:cs="Cambria"/>
+          <w:sz w:val="22"/>
+          <w:szCs w:val="22"/>
+          <w:lang w:val="uk-UA"/>
+        </w:rPr>
+        <w:t>Compte récepteur : n° 3040771, ouvert le 29 novembre 2017, clôturé le 25 juillet 2018</w:t>
       </w:r>
       <w:r>
         <w:rPr>
@@ -11400,16 +11401,16 @@
           <w:lang w:val="uk-UA"/>
         </w:rPr>
         <w:ind w:left="1134" w:hanging="567"/>
-        <w:spacing w:before="120" w:after="0" w:line="240" w:lineRule="auto"/>
-      </w:pPr>
-      <w:r>
-        <w:rPr>
-          <w:rFonts w:ascii="Cambria" w:hAnsi="Cambria" w:cs="Cambria"/>
-          <w:sz w:val="22"/>
-          <w:szCs w:val="22"/>
-          <w:lang w:val="uk-UA"/>
-        </w:rPr>
-        <w:t>Virement : 18/12/2017 — 121 028 194,45 USD depuis le compte LU673010987115USD001</w:t>
+        <w:spacing w:before="120" w:after="0" w:line="276" w:lineRule="auto"/>
+      </w:pPr>
+      <w:r>
+        <w:rPr>
+          <w:rFonts w:ascii="Cambria" w:hAnsi="Cambria" w:cs="Cambria"/>
+          <w:sz w:val="22"/>
+          <w:szCs w:val="22"/>
+          <w:lang w:val="uk-UA"/>
+        </w:rPr>
+        <w:t>Virement : 18 décembre 2017 — 121 028 194,45 USD depuis le compte LU673010987115USD001</w:t>
       </w:r>
       <w:r>
         <w:rPr>
@@ -11460,7 +11461,7 @@
           <w:lang w:val="uk-UA"/>
         </w:rPr>
         <w:ind w:left="567" w:hanging="567"/>
-        <w:spacing w:before="120" w:after="0" w:line="240" w:lineRule="auto"/>
+        <w:spacing w:before="120" w:after="0" w:line="276" w:lineRule="auto"/>
       </w:pPr>
       <w:proofErr w:type="spellStart"/>
       <w:r>
@@ -11525,7 +11526,7 @@
           <w:lang w:val="uk-UA"/>
         </w:rPr>
         <w:ind w:left="1134" w:hanging="567"/>
-        <w:spacing w:before="120" w:after="0" w:line="240" w:lineRule="auto"/>
+        <w:spacing w:before="120" w:after="0" w:line="276" w:lineRule="auto"/>
       </w:pPr>
       <w:r>
         <w:rPr>
@@ -11622,16 +11623,16 @@
           <w:lang w:val="uk-UA"/>
         </w:rPr>
         <w:ind w:left="1134" w:hanging="567"/>
-        <w:spacing w:before="120" w:after="0" w:line="240" w:lineRule="auto"/>
-      </w:pPr>
-      <w:r>
-        <w:rPr>
-          <w:rFonts w:ascii="Cambria" w:hAnsi="Cambria" w:cs="Cambria"/>
-          <w:sz w:val="22"/>
-          <w:szCs w:val="22"/>
-          <w:lang w:val="uk-UA"/>
-        </w:rPr>
-        <w:t>Compte récepteur : n° 3038178, ouvert le 16/03/2017, clôturé le 14/08/2018</w:t>
+        <w:spacing w:before="120" w:after="0" w:line="276" w:lineRule="auto"/>
+      </w:pPr>
+      <w:r>
+        <w:rPr>
+          <w:rFonts w:ascii="Cambria" w:hAnsi="Cambria" w:cs="Cambria"/>
+          <w:sz w:val="22"/>
+          <w:szCs w:val="22"/>
+          <w:lang w:val="uk-UA"/>
+        </w:rPr>
+        <w:t>Compte récepteur : n° 3038178, ouvert le 16 mars 2017, clôturé le 14 août 2018</w:t>
       </w:r>
       <w:r>
         <w:rPr>
@@ -11691,7 +11692,7 @@
           <w:lang w:val="uk-UA"/>
         </w:rPr>
         <w:ind w:left="1134" w:hanging="567"/>
-        <w:spacing w:before="120" w:after="0" w:line="240" w:lineRule="auto"/>
+        <w:spacing w:before="120" w:after="0" w:line="276" w:lineRule="auto"/>
       </w:pPr>
       <w:r>
         <w:rPr>
@@ -11728,16 +11729,16 @@
           <w:lang w:val="uk-UA"/>
         </w:rPr>
         <w:ind w:left="1701" w:hanging="567"/>
-        <w:spacing w:before="120" w:after="0" w:line="240" w:lineRule="auto"/>
-      </w:pPr>
-      <w:r>
-        <w:rPr>
-          <w:rFonts w:ascii="Cambria" w:hAnsi="Cambria" w:cs="Cambria"/>
-          <w:sz w:val="22"/>
-          <w:szCs w:val="22"/>
-          <w:lang w:val="uk-UA"/>
-        </w:rPr>
-        <w:t>du 21/03/2017 au 10/10/2017 depuis le compte LU603010987113USD001 pour un montant total de 206 728 884 USD ;</w:t>
+        <w:spacing w:before="120" w:after="0" w:line="276" w:lineRule="auto"/>
+      </w:pPr>
+      <w:r>
+        <w:rPr>
+          <w:rFonts w:ascii="Cambria" w:hAnsi="Cambria" w:cs="Cambria"/>
+          <w:sz w:val="22"/>
+          <w:szCs w:val="22"/>
+          <w:lang w:val="uk-UA"/>
+        </w:rPr>
+        <w:t>du 21 mars 2017 au 10 octobre 2017 depuis le compte LU603010987113USD001 pour un montant total de 206 728 884 USD ;</w:t>
       </w:r>
       <w:r>
         <w:rPr>
@@ -11797,16 +11798,16 @@
           <w:lang w:val="uk-UA"/>
         </w:rPr>
         <w:ind w:left="1701" w:hanging="567"/>
-        <w:spacing w:before="120" w:after="0" w:line="240" w:lineRule="auto"/>
-      </w:pPr>
-      <w:r>
-        <w:rPr>
-          <w:rFonts w:ascii="Cambria" w:hAnsi="Cambria" w:cs="Cambria"/>
-          <w:sz w:val="22"/>
-          <w:szCs w:val="22"/>
-          <w:lang w:val="uk-UA"/>
-        </w:rPr>
-        <w:t>du 27/04/2017 au 18/05/2017 depuis le compte LU083010987113EUR001 pour un montant total de 6 399 900 EUR.</w:t>
+        <w:spacing w:before="120" w:after="0" w:line="276" w:lineRule="auto"/>
+      </w:pPr>
+      <w:r>
+        <w:rPr>
+          <w:rFonts w:ascii="Cambria" w:hAnsi="Cambria" w:cs="Cambria"/>
+          <w:sz w:val="22"/>
+          <w:szCs w:val="22"/>
+          <w:lang w:val="uk-UA"/>
+        </w:rPr>
+        <w:t>du 27 avril 2017 au 18 mai 2017 depuis le compte LU083010987113EUR001 pour un montant total de 6 399 900 EUR.</w:t>
       </w:r>
     </w:p>
     <w:p>
@@ -11825,7 +11826,7 @@
           <w:lang w:val="uk-UA"/>
         </w:rPr>
         <w:ind w:left="567" w:hanging="567"/>
-        <w:spacing w:before="120" w:after="0" w:line="240" w:lineRule="auto"/>
+        <w:spacing w:before="120" w:after="0" w:line="276" w:lineRule="auto"/>
       </w:pPr>
       <w:proofErr w:type="spellStart"/>
       <w:r>
@@ -11931,16 +11932,16 @@
           <w:lang w:val="uk-UA"/>
         </w:rPr>
         <w:ind w:left="1134" w:hanging="567"/>
-        <w:spacing w:before="120" w:after="0" w:line="240" w:lineRule="auto"/>
-      </w:pPr>
-      <w:r>
-        <w:rPr>
-          <w:rFonts w:ascii="Cambria" w:hAnsi="Cambria" w:cs="Cambria"/>
-          <w:sz w:val="22"/>
-          <w:szCs w:val="22"/>
-          <w:lang w:val="uk-UA"/>
-        </w:rPr>
-        <w:t>Compte auprès d'UBP (Monaco), compte n° 3034379, ouvert le 30/12/2015, clôturé le 28/07/2021. Virement : 18/04/2016 — 4 999 962 USD depuis le compte LU463010987012USD001 ;</w:t>
+        <w:spacing w:before="120" w:after="0" w:line="276" w:lineRule="auto"/>
+      </w:pPr>
+      <w:r>
+        <w:rPr>
+          <w:rFonts w:ascii="Cambria" w:hAnsi="Cambria" w:cs="Cambria"/>
+          <w:sz w:val="22"/>
+          <w:szCs w:val="22"/>
+          <w:lang w:val="uk-UA"/>
+        </w:rPr>
+        <w:t>Compte auprès d'UBP (Monaco), compte n° 3034379, ouvert le 30 décembre 2015, clôturé le 28 juillet 2021. Virement : 18 avril 2016 — 4 999 962 USD depuis le compte LU463010987012USD001 ;</w:t>
       </w:r>
       <w:r>
         <w:rPr>
@@ -12045,16 +12046,16 @@
           <w:lang w:val="uk-UA"/>
         </w:rPr>
         <w:ind w:left="1134" w:hanging="567"/>
-        <w:spacing w:before="120" w:after="0" w:line="240" w:lineRule="auto"/>
-      </w:pPr>
-      <w:r>
-        <w:rPr>
-          <w:rFonts w:ascii="Cambria" w:hAnsi="Cambria" w:cs="Cambria"/>
-          <w:sz w:val="22"/>
-          <w:szCs w:val="22"/>
-          <w:lang w:val="uk-UA"/>
-        </w:rPr>
-        <w:t>Compte auprès de Julius Bär (Monaco), compte n° 5188474, ouvert le 21/04/2015, clôturé le 20/07/2018.</w:t>
+        <w:spacing w:before="120" w:after="0" w:line="276" w:lineRule="auto"/>
+      </w:pPr>
+      <w:r>
+        <w:rPr>
+          <w:rFonts w:ascii="Cambria" w:hAnsi="Cambria" w:cs="Cambria"/>
+          <w:sz w:val="22"/>
+          <w:szCs w:val="22"/>
+          <w:lang w:val="uk-UA"/>
+        </w:rPr>
+        <w:t>Compte auprès de Julius Bär (Monaco), compte n° 5188474, ouvert le 21 avril 2015, clôturé le 20 juillet 2018.</w:t>
       </w:r>
       <w:proofErr w:type="spellStart"/>
       <w:r>
@@ -12163,7 +12164,7 @@
           <w:lang w:val="uk-UA"/>
         </w:rPr>
         <w:ind w:left="1134" w:hanging="567"/>
-        <w:spacing w:before="120" w:after="0" w:line="240" w:lineRule="auto"/>
+        <w:spacing w:before="120" w:after="0" w:line="276" w:lineRule="auto"/>
       </w:pPr>
       <w:r>
         <w:rPr>
@@ -12197,16 +12198,16 @@
           <w:lang w:val="uk-UA"/>
         </w:rPr>
         <w:ind w:left="1701" w:hanging="567"/>
-        <w:spacing w:before="120" w:after="0" w:line="240" w:lineRule="auto"/>
-      </w:pPr>
-      <w:r>
-        <w:rPr>
-          <w:rFonts w:ascii="Cambria" w:hAnsi="Cambria" w:cs="Cambria"/>
-          <w:sz w:val="22"/>
-          <w:szCs w:val="22"/>
-          <w:lang w:val="uk-UA"/>
-        </w:rPr>
-        <w:t>11/04/2016 — 2 999 962 USD</w:t>
+        <w:spacing w:before="120" w:after="0" w:line="276" w:lineRule="auto"/>
+      </w:pPr>
+      <w:r>
+        <w:rPr>
+          <w:rFonts w:ascii="Cambria" w:hAnsi="Cambria" w:cs="Cambria"/>
+          <w:sz w:val="22"/>
+          <w:szCs w:val="22"/>
+          <w:lang w:val="uk-UA"/>
+        </w:rPr>
+        <w:t>11 avril 2016 — 2 999 962 USD</w:t>
       </w:r>
     </w:p>
     <w:p>
@@ -12223,16 +12224,16 @@
           <w:lang w:val="uk-UA"/>
         </w:rPr>
         <w:ind w:left="1701" w:hanging="567"/>
-        <w:spacing w:before="120" w:after="0" w:line="240" w:lineRule="auto"/>
-      </w:pPr>
-      <w:r>
-        <w:rPr>
-          <w:rFonts w:ascii="Cambria" w:hAnsi="Cambria" w:cs="Cambria"/>
-          <w:sz w:val="22"/>
-          <w:szCs w:val="22"/>
-          <w:lang w:val="uk-UA"/>
-        </w:rPr>
-        <w:t>31/05/2016 — 2 999 962 USD</w:t>
+        <w:spacing w:before="120" w:after="0" w:line="276" w:lineRule="auto"/>
+      </w:pPr>
+      <w:r>
+        <w:rPr>
+          <w:rFonts w:ascii="Cambria" w:hAnsi="Cambria" w:cs="Cambria"/>
+          <w:sz w:val="22"/>
+          <w:szCs w:val="22"/>
+          <w:lang w:val="uk-UA"/>
+        </w:rPr>
+        <w:t>31 mai 2016 — 2 999 962 USD</w:t>
       </w:r>
     </w:p>
     <w:p>
@@ -12249,16 +12250,16 @@
           <w:lang w:val="uk-UA"/>
         </w:rPr>
         <w:ind w:left="1701" w:hanging="567"/>
-        <w:spacing w:before="120" w:after="0" w:line="240" w:lineRule="auto"/>
-      </w:pPr>
-      <w:r>
-        <w:rPr>
-          <w:rFonts w:ascii="Cambria" w:hAnsi="Cambria" w:cs="Cambria"/>
-          <w:sz w:val="22"/>
-          <w:szCs w:val="22"/>
-          <w:lang w:val="uk-UA"/>
-        </w:rPr>
-        <w:t>06/07/2016 — 2 999 962 USD</w:t>
+        <w:spacing w:before="120" w:after="0" w:line="276" w:lineRule="auto"/>
+      </w:pPr>
+      <w:r>
+        <w:rPr>
+          <w:rFonts w:ascii="Cambria" w:hAnsi="Cambria" w:cs="Cambria"/>
+          <w:sz w:val="22"/>
+          <w:szCs w:val="22"/>
+          <w:lang w:val="uk-UA"/>
+        </w:rPr>
+        <w:t>6 juillet 2016 — 2 999 962 USD</w:t>
       </w:r>
     </w:p>
     <w:p>
@@ -12275,16 +12276,16 @@
           <w:lang w:val="uk-UA"/>
         </w:rPr>
         <w:ind w:left="1701" w:hanging="567"/>
-        <w:spacing w:before="120" w:after="0" w:line="240" w:lineRule="auto"/>
-      </w:pPr>
-      <w:r>
-        <w:rPr>
-          <w:rFonts w:ascii="Cambria" w:hAnsi="Cambria" w:cs="Cambria"/>
-          <w:sz w:val="22"/>
-          <w:szCs w:val="22"/>
-          <w:lang w:val="uk-UA"/>
-        </w:rPr>
-        <w:t>29/07/2016 — 2 999 962 USD</w:t>
+        <w:spacing w:before="120" w:after="0" w:line="276" w:lineRule="auto"/>
+      </w:pPr>
+      <w:r>
+        <w:rPr>
+          <w:rFonts w:ascii="Cambria" w:hAnsi="Cambria" w:cs="Cambria"/>
+          <w:sz w:val="22"/>
+          <w:szCs w:val="22"/>
+          <w:lang w:val="uk-UA"/>
+        </w:rPr>
+        <w:t>29 juillet 2016 — 2 999 962 USD</w:t>
       </w:r>
     </w:p>
     <w:p>
@@ -12301,16 +12302,16 @@
           <w:lang w:val="uk-UA"/>
         </w:rPr>
         <w:ind w:left="1701" w:hanging="567"/>
-        <w:spacing w:before="120" w:after="0" w:line="240" w:lineRule="auto"/>
-      </w:pPr>
-      <w:r>
-        <w:rPr>
-          <w:rFonts w:ascii="Cambria" w:hAnsi="Cambria" w:cs="Cambria"/>
-          <w:sz w:val="22"/>
-          <w:szCs w:val="22"/>
-          <w:lang w:val="uk-UA"/>
-        </w:rPr>
-        <w:t>23/08/2016 — 2 999 962 USD</w:t>
+        <w:spacing w:before="120" w:after="0" w:line="276" w:lineRule="auto"/>
+      </w:pPr>
+      <w:r>
+        <w:rPr>
+          <w:rFonts w:ascii="Cambria" w:hAnsi="Cambria" w:cs="Cambria"/>
+          <w:sz w:val="22"/>
+          <w:szCs w:val="22"/>
+          <w:lang w:val="uk-UA"/>
+        </w:rPr>
+        <w:t>23 août 2016 — 2 999 962 USD</w:t>
       </w:r>
     </w:p>
     <w:p>
@@ -12327,16 +12328,16 @@
           <w:lang w:val="uk-UA"/>
         </w:rPr>
         <w:ind w:left="1701" w:hanging="567"/>
-        <w:spacing w:before="120" w:after="0" w:line="240" w:lineRule="auto"/>
-      </w:pPr>
-      <w:r>
-        <w:rPr>
-          <w:rFonts w:ascii="Cambria" w:hAnsi="Cambria" w:cs="Cambria"/>
-          <w:sz w:val="22"/>
-          <w:szCs w:val="22"/>
-          <w:lang w:val="uk-UA"/>
-        </w:rPr>
-        <w:t>21/09/2016 — 2 999 900 USD</w:t>
+        <w:spacing w:before="120" w:after="0" w:line="276" w:lineRule="auto"/>
+      </w:pPr>
+      <w:r>
+        <w:rPr>
+          <w:rFonts w:ascii="Cambria" w:hAnsi="Cambria" w:cs="Cambria"/>
+          <w:sz w:val="22"/>
+          <w:szCs w:val="22"/>
+          <w:lang w:val="uk-UA"/>
+        </w:rPr>
+        <w:t>21 septembre 2016 — 2 999 900 USD</w:t>
       </w:r>
     </w:p>
     <w:p>
@@ -12353,16 +12354,16 @@
           <w:lang w:val="uk-UA"/>
         </w:rPr>
         <w:ind w:left="1701" w:hanging="567"/>
-        <w:spacing w:before="120" w:after="0" w:line="240" w:lineRule="auto"/>
-      </w:pPr>
-      <w:r>
-        <w:rPr>
-          <w:rFonts w:ascii="Cambria" w:hAnsi="Cambria" w:cs="Cambria"/>
-          <w:sz w:val="22"/>
-          <w:szCs w:val="22"/>
-          <w:lang w:val="uk-UA"/>
-        </w:rPr>
-        <w:t>16/01/2017 — 2 999 900 USD</w:t>
+        <w:spacing w:before="120" w:after="0" w:line="276" w:lineRule="auto"/>
+      </w:pPr>
+      <w:r>
+        <w:rPr>
+          <w:rFonts w:ascii="Cambria" w:hAnsi="Cambria" w:cs="Cambria"/>
+          <w:sz w:val="22"/>
+          <w:szCs w:val="22"/>
+          <w:lang w:val="uk-UA"/>
+        </w:rPr>
+        <w:t>16 janvier 2017 — 2 999 900 USD</w:t>
       </w:r>
     </w:p>
     <w:p>
@@ -12379,16 +12380,16 @@
           <w:lang w:val="uk-UA"/>
         </w:rPr>
         <w:ind w:left="1701" w:hanging="567"/>
-        <w:spacing w:before="120" w:after="0" w:line="240" w:lineRule="auto"/>
-      </w:pPr>
-      <w:r>
-        <w:rPr>
-          <w:rFonts w:ascii="Cambria" w:hAnsi="Cambria" w:cs="Cambria"/>
-          <w:sz w:val="22"/>
-          <w:szCs w:val="22"/>
-          <w:lang w:val="uk-UA"/>
-        </w:rPr>
-        <w:t>27/04/2017 — 2 999 900 USD</w:t>
+        <w:spacing w:before="120" w:after="0" w:line="276" w:lineRule="auto"/>
+      </w:pPr>
+      <w:r>
+        <w:rPr>
+          <w:rFonts w:ascii="Cambria" w:hAnsi="Cambria" w:cs="Cambria"/>
+          <w:sz w:val="22"/>
+          <w:szCs w:val="22"/>
+          <w:lang w:val="uk-UA"/>
+        </w:rPr>
+        <w:t>27 avril 2017 — 2 999 900 USD</w:t>
       </w:r>
     </w:p>
     <w:p>
@@ -12399,7 +12400,7 @@
           <w:lang w:val="uk-UA"/>
         </w:rPr>
         <w:ind w:left="1080"/>
-        <w:spacing w:before="120" w:after="0" w:line="240" w:lineRule="auto"/>
+        <w:spacing w:before="120" w:after="0" w:line="276" w:lineRule="auto"/>
       </w:pPr>
       <w:r>
         <w:rPr>
@@ -12437,7 +12438,7 @@
           <w:lang w:val="uk-UA"/>
         </w:rPr>
         <w:ind w:left="567" w:hanging="567"/>
-        <w:spacing w:before="120" w:after="0" w:line="240" w:lineRule="auto"/>
+        <w:spacing w:before="120" w:after="0" w:line="276" w:lineRule="auto"/>
       </w:pPr>
       <w:proofErr w:type="spellStart"/>
       <w:r>
@@ -12493,7 +12494,7 @@
           <w:lang w:val="uk-UA"/>
         </w:rPr>
         <w:ind w:left="1134" w:hanging="567"/>
-        <w:spacing w:before="120" w:after="0" w:line="240" w:lineRule="auto"/>
+        <w:spacing w:before="120" w:after="0" w:line="276" w:lineRule="auto"/>
       </w:pPr>
       <w:r>
         <w:rPr>
@@ -12611,16 +12612,16 @@
           <w:lang w:val="uk-UA"/>
         </w:rPr>
         <w:ind w:left="1134" w:hanging="567"/>
-        <w:spacing w:before="120" w:after="0" w:line="240" w:lineRule="auto"/>
-      </w:pPr>
-      <w:r>
-        <w:rPr>
-          <w:rFonts w:ascii="Cambria" w:hAnsi="Cambria" w:cs="Cambria"/>
-          <w:sz w:val="22"/>
-          <w:szCs w:val="22"/>
-          <w:lang w:val="uk-UA"/>
-        </w:rPr>
-        <w:t>Compte récepteur : n° 5185358, ouvert le 29/12/2017, clôturé le 25/07/2018</w:t>
+        <w:spacing w:before="120" w:after="0" w:line="276" w:lineRule="auto"/>
+      </w:pPr>
+      <w:r>
+        <w:rPr>
+          <w:rFonts w:ascii="Cambria" w:hAnsi="Cambria" w:cs="Cambria"/>
+          <w:sz w:val="22"/>
+          <w:szCs w:val="22"/>
+          <w:lang w:val="uk-UA"/>
+        </w:rPr>
+        <w:t>Compte récepteur : n° 5185358, ouvert le 29 décembre 2017, clôturé le 25 juillet 2018</w:t>
       </w:r>
       <w:r>
         <w:rPr>
@@ -12681,16 +12682,16 @@
           <w:lang w:val="uk-UA"/>
         </w:rPr>
         <w:ind w:left="1134" w:hanging="567"/>
-        <w:spacing w:before="120" w:after="0" w:line="240" w:lineRule="auto"/>
-      </w:pPr>
-      <w:r>
-        <w:rPr>
-          <w:rFonts w:ascii="Cambria" w:hAnsi="Cambria" w:cs="Cambria"/>
-          <w:sz w:val="22"/>
-          <w:szCs w:val="22"/>
-          <w:lang w:val="uk-UA"/>
-        </w:rPr>
-        <w:t>Virements : du 04/04/2017 au 18/09/2017 depuis le compte LU083010987112USD001 pour un montant total de 112 343 886 USD</w:t>
+        <w:spacing w:before="120" w:after="0" w:line="276" w:lineRule="auto"/>
+      </w:pPr>
+      <w:r>
+        <w:rPr>
+          <w:rFonts w:ascii="Cambria" w:hAnsi="Cambria" w:cs="Cambria"/>
+          <w:sz w:val="22"/>
+          <w:szCs w:val="22"/>
+          <w:lang w:val="uk-UA"/>
+        </w:rPr>
+        <w:t>Virements : du 4 avril 2017 au 18 septembre 2017 depuis le compte LU083010987112USD001 pour un montant total de 112 343 886 USD</w:t>
       </w:r>
       <w:r>
         <w:rPr>
@@ -12803,7 +12804,7 @@
           <w:lang w:val="uk-UA"/>
         </w:rPr>
         <w:ind w:left="0" w:hanging="567"/>
-        <w:spacing w:before="120" w:after="0" w:line="240" w:lineRule="auto"/>
+        <w:spacing w:before="120" w:after="0" w:line="276" w:lineRule="auto"/>
       </w:pPr>
       <w:r>
         <w:rPr>
@@ -12824,7 +12825,7 @@
           <w:szCs w:val="22"/>
           <w:lang w:val="uk-UA"/>
         </w:rPr>
-        <w:spacing w:before="120" w:after="0" w:line="240" w:lineRule="auto"/>
+        <w:spacing w:before="120" w:after="0" w:line="276" w:lineRule="auto"/>
       </w:pPr>
     </w:p>
     <w:p>
@@ -12836,7 +12837,7 @@
           <w:szCs w:val="22"/>
           <w:lang w:val="uk-UA"/>
         </w:rPr>
-        <w:spacing w:before="120" w:after="0" w:line="240" w:lineRule="auto"/>
+        <w:spacing w:before="120" w:after="0" w:line="276" w:lineRule="auto"/>
       </w:pPr>
       <w:r>
         <w:rPr>
@@ -12865,7 +12866,7 @@
           <w:lang w:val="uk-UA"/>
         </w:rPr>
         <w:ind w:left="0" w:hanging="567"/>
-        <w:spacing w:before="120" w:after="0" w:line="240" w:lineRule="auto"/>
+        <w:spacing w:before="120" w:after="0" w:line="276" w:lineRule="auto"/>
       </w:pPr>
       <w:r>
         <w:rPr>
@@ -12907,7 +12908,7 @@
           <w:lang w:val="uk-UA"/>
         </w:rPr>
         <w:ind w:left="567" w:hanging="567"/>
-        <w:spacing w:before="120" w:after="0" w:line="240" w:lineRule="auto"/>
+        <w:spacing w:before="120" w:after="0" w:line="276" w:lineRule="auto"/>
       </w:pPr>
       <w:r>
         <w:rPr>
@@ -12937,7 +12938,7 @@
           <w:lang w:val="uk-UA"/>
         </w:rPr>
         <w:ind w:left="567"/>
-        <w:spacing w:before="120" w:after="0" w:line="240" w:lineRule="auto"/>
+        <w:spacing w:before="120" w:after="0" w:line="276" w:lineRule="auto"/>
       </w:pPr>
       <w:r>
         <w:rPr>
@@ -13025,7 +13026,7 @@
           <w:lang w:val="uk-UA"/>
         </w:rPr>
         <w:ind w:left="567"/>
-        <w:spacing w:before="120" w:after="0" w:line="240" w:lineRule="auto"/>
+        <w:spacing w:before="120" w:after="0" w:line="276" w:lineRule="auto"/>
       </w:pPr>
       <w:r>
         <w:rPr>
@@ -13068,7 +13069,7 @@
           <w:lang w:val="uk-UA"/>
         </w:rPr>
         <w:ind w:left="567"/>
-        <w:spacing w:before="120" w:after="0" w:line="240" w:lineRule="auto"/>
+        <w:spacing w:before="120" w:after="0" w:line="276" w:lineRule="auto"/>
       </w:pPr>
       <w:r>
         <w:rPr>
@@ -13546,7 +13547,7 @@
           <w:lang w:val="uk-UA"/>
         </w:rPr>
         <w:ind w:left="567" w:hanging="567"/>
-        <w:spacing w:before="120" w:after="0" w:line="240" w:lineRule="auto"/>
+        <w:spacing w:before="120" w:after="0" w:line="276" w:lineRule="auto"/>
       </w:pPr>
       <w:r>
         <w:rPr>
@@ -13568,7 +13569,7 @@
           <w:lang w:val="uk-UA"/>
         </w:rPr>
         <w:ind w:left="567"/>
-        <w:spacing w:before="120" w:after="0" w:line="240" w:lineRule="auto"/>
+        <w:spacing w:before="120" w:after="0" w:line="276" w:lineRule="auto"/>
       </w:pPr>
       <w:r>
         <w:rPr>
@@ -13638,7 +13639,7 @@
           <w:lang w:val="uk-UA"/>
         </w:rPr>
         <w:ind w:left="567" w:hanging="567"/>
-        <w:spacing w:before="120" w:after="0" w:line="240" w:lineRule="auto"/>
+        <w:spacing w:before="120" w:after="0" w:line="276" w:lineRule="auto"/>
       </w:pPr>
       <w:r>
         <w:rPr>
@@ -13678,7 +13679,7 @@
           <w:lang w:val="uk-UA"/>
         </w:rPr>
         <w:ind w:left="567"/>
-        <w:spacing w:before="120" w:after="0" w:line="240" w:lineRule="auto"/>
+        <w:spacing w:before="120" w:after="0" w:line="276" w:lineRule="auto"/>
       </w:pPr>
       <w:r>
         <w:rPr>
@@ -13725,7 +13726,7 @@
           <w:szCs w:val="22"/>
           <w:lang w:val="uk-UA"/>
         </w:rPr>
-        <w:spacing w:before="120" w:after="0" w:line="240" w:lineRule="auto"/>
+        <w:spacing w:before="120" w:after="0" w:line="276" w:lineRule="auto"/>
       </w:pPr>
       <w:r>
         <w:rPr>
@@ -13777,7 +13778,7 @@
           <w:szCs w:val="22"/>
           <w:lang w:val="uk-UA"/>
         </w:rPr>
-        <w:spacing w:before="120" w:after="0" w:line="240" w:lineRule="auto"/>
+        <w:spacing w:before="120" w:after="0" w:line="276" w:lineRule="auto"/>
       </w:pPr>
       <w:r>
         <w:rPr>
@@ -13899,7 +13900,7 @@
           <w:lang w:val="uk-UA"/>
         </w:rPr>
         <w:pStyle w:val="a"/>
-        <w:spacing w:before="120" w:after="0" w:line="240" w:lineRule="auto"/>
+        <w:spacing w:before="120" w:after="0" w:line="276" w:lineRule="auto"/>
       </w:pPr>
       <w:r/>
     </w:p>
@@ -13918,10 +13919,10 @@
           <w:lang w:val="uk-UA"/>
         </w:rPr>
         <w:ind w:left="0" w:hanging="567"/>
-        <w:spacing w:before="120" w:after="0" w:line="240" w:lineRule="auto"/>
-      </w:pPr>
-      <w:r>
-        <w:t>Le 30.02.2024 [sic], par ordonnance du tribunal de district Shevchenkivskyi, un accès temporaire aux pièces et documents en possession de l'établissement bancaire EFG Bank (Luxembourg) — ayant droit de la banque agent séquestre UBI Banca International SA — a été accordé.</w:t>
+        <w:spacing w:before="120" w:after="0" w:line="276" w:lineRule="auto"/>
+      </w:pPr>
+      <w:r>
+        <w:t>Le 30 février 2024 [sic], par ordonnance du tribunal de district Shevchenkivskyi, un accès temporaire aux pièces et documents en possession de l'établissement bancaire EFG Bank (Luxembourg) — ayant droit de la banque agent séquestre UBI Banca International SA — a été accordé.</w:t>
       </w:r>
     </w:p>
     <w:p>
@@ -13943,7 +13944,7 @@
           <w:lang w:val="uk-UA"/>
         </w:rPr>
         <w:ind w:left="567" w:hanging="567"/>
-        <w:spacing w:before="120" w:after="0" w:line="240" w:lineRule="auto"/>
+        <w:spacing w:before="120" w:after="0" w:line="276" w:lineRule="auto"/>
       </w:pPr>
       <w:r>
         <w:t>finalité : établir les mouvements de fonds sur les comptes bancaires séquestres et les comptes bancaires ouverts par les sociétés non-résidentes appartenant à AVB.</w:t>
@@ -13968,7 +13969,7 @@
           <w:lang w:val="uk-UA"/>
         </w:rPr>
         <w:ind w:left="567" w:hanging="567"/>
-        <w:spacing w:before="120" w:after="0" w:line="240" w:lineRule="auto"/>
+        <w:spacing w:before="120" w:after="0" w:line="276" w:lineRule="auto"/>
       </w:pPr>
       <w:r>
         <w:t>informations relatives à l'envoi de la demande / à son exécution — absentes.</w:t>
@@ -13985,7 +13986,7 @@
           <w:lang w:val="uk-UA"/>
         </w:rPr>
         <w:ind w:left="567"/>
-        <w:spacing w:before="120" w:after="0" w:line="240" w:lineRule="auto"/>
+        <w:spacing w:before="120" w:after="0" w:line="276" w:lineRule="auto"/>
       </w:pPr>
       <w:r/>
     </w:p>
@@ -14004,7 +14005,7 @@
           <w:lang w:val="uk-UA"/>
         </w:rPr>
         <w:ind w:left="0" w:hanging="567"/>
-        <w:spacing w:before="120" w:after="0" w:line="240" w:lineRule="auto"/>
+        <w:spacing w:before="120" w:after="0" w:line="276" w:lineRule="auto"/>
       </w:pPr>
       <w:r>
         <w:t>Le 25 avril 2025, l'enquêteur de la GSU SBU a émis une demande d'entraide judiciaire internationale vers Monaco aux fins de remise à AVB de la notification des soupçons, de la notice de droits, de convocations à interrogatoire en tant que suspect et de remise d'actes de procédure.</w:t>
@@ -14018,7 +14019,7 @@
           <w:lang w:val="uk-UA"/>
         </w:rPr>
         <w:pStyle w:val="a"/>
-        <w:spacing w:before="120" w:after="0" w:line="240" w:lineRule="auto"/>
+        <w:spacing w:before="120" w:after="0" w:line="276" w:lineRule="auto"/>
       </w:pPr>
       <w:r>
         <w:t>Du 28 au 30 avril 2025, un interrogatoire d'AVB a été mené à Monaco avec la participation de l'officier opérationnel de la direction « I » de la DZND du SBU, Pervak S.</w:t>
@@ -14032,7 +14033,7 @@
           <w:lang w:val="uk-UA"/>
         </w:rPr>
         <w:pStyle w:val="a"/>
-        <w:spacing w:before="120" w:after="0" w:line="240" w:lineRule="auto"/>
+        <w:spacing w:before="120" w:after="0" w:line="276" w:lineRule="auto"/>
       </w:pPr>
       <w:r>
         <w:t>Le 30 avril 2025, exécution par les autorités judiciaires de Monaco de la demande d'entraide judiciaire internationale de la GSU SBU : remise de la notification des soupçons et des convocations à AVB.</w:t>
@@ -14048,7 +14049,7 @@
           <w:lang w:val="uk-UA"/>
         </w:rPr>
         <w:pStyle w:val="a"/>
-        <w:spacing w:before="120" w:after="0" w:line="240" w:lineRule="auto"/>
+        <w:spacing w:before="120" w:after="0" w:line="276" w:lineRule="auto"/>
       </w:pPr>
       <w:r/>
     </w:p>
@@ -14061,7 +14062,7 @@
           <w:szCs w:val="22"/>
           <w:lang w:val="uk-UA"/>
         </w:rPr>
-        <w:spacing w:before="120" w:after="0" w:line="240" w:lineRule="auto"/>
+        <w:spacing w:before="120" w:after="0" w:line="276" w:lineRule="auto"/>
       </w:pPr>
       <w:r>
         <w:rPr>
@@ -14119,7 +14120,7 @@
           <w:lang w:val="uk-UA"/>
         </w:rPr>
         <w:ind w:left="567" w:hanging="567"/>
-        <w:spacing w:before="120" w:after="0" w:line="240" w:lineRule="auto"/>
+        <w:spacing w:before="120" w:after="0" w:line="276" w:lineRule="auto"/>
       </w:pPr>
       <w:r>
         <w:rPr>
@@ -14167,7 +14168,7 @@
           <w:lang w:val="uk-UA"/>
         </w:rPr>
         <w:ind w:left="567"/>
-        <w:spacing w:before="120" w:after="0" w:line="240" w:lineRule="auto"/>
+        <w:spacing w:before="120" w:after="0" w:line="276" w:lineRule="auto"/>
       </w:pPr>
       <w:r>
         <w:rPr>
@@ -14178,7 +14179,7 @@
           <w:szCs w:val="22"/>
           <w:lang w:val="uk-UA"/>
         </w:rPr>
-        <w:t>Interceptions enregistrées : conversations téléphoniques entre V. Boguslayev et P. Kononenko des 22/09/2022, 28/09/2022, 29/09/2022, 04/10/2022.</w:t>
+        <w:t>Interceptions enregistrées : conversations téléphoniques entre V. Boguslayev et P. Kononenko des 22 septembre 2022, 28 septembre 2022, 29 septembre 2022, 4 octobre 2022.</w:t>
       </w:r>
       <w:r>
         <w:rPr>
@@ -14271,7 +14272,7 @@
           <w:lang w:val="uk-UA"/>
         </w:rPr>
         <w:ind w:left="567"/>
-        <w:spacing w:before="120" w:after="0" w:line="240" w:lineRule="auto"/>
+        <w:spacing w:before="120" w:after="0" w:line="276" w:lineRule="auto"/>
       </w:pPr>
       <w:r>
         <w:rPr>
@@ -14307,16 +14308,16 @@
           <w:lang w:val="uk-UA"/>
         </w:rPr>
         <w:ind w:left="567" w:hanging="567"/>
-        <w:spacing w:before="120" w:after="0" w:line="240" w:lineRule="auto"/>
-      </w:pPr>
-      <w:r>
-        <w:rPr>
-          <w:rFonts w:ascii="Cambria" w:hAnsi="Cambria" w:cs="Cambria"/>
-          <w:sz w:val="22"/>
-          <w:szCs w:val="22"/>
-          <w:lang w:val="uk-UA"/>
-        </w:rPr>
-        <w:t>Interrogatoire d'AVB du 28 au 30/04/2025 mené à Monaco avec la participation d'un représentant du SBU.</w:t>
+        <w:spacing w:before="120" w:after="0" w:line="276" w:lineRule="auto"/>
+      </w:pPr>
+      <w:r>
+        <w:rPr>
+          <w:rFonts w:ascii="Cambria" w:hAnsi="Cambria" w:cs="Cambria"/>
+          <w:sz w:val="22"/>
+          <w:szCs w:val="22"/>
+          <w:lang w:val="uk-UA"/>
+        </w:rPr>
+        <w:t>Interrogatoire d'AVB du 28 au 30 avril 2025 mené à Monaco avec la participation d'un représentant du SBU.</w:t>
       </w:r>
       <w:r>
         <w:rPr>
@@ -14363,7 +14364,7 @@
           <w:lang w:val="uk-UA"/>
         </w:rPr>
         <w:ind w:left="567"/>
-        <w:spacing w:before="120" w:after="0" w:line="240" w:lineRule="auto"/>
+        <w:spacing w:before="120" w:after="0" w:line="276" w:lineRule="auto"/>
       </w:pPr>
       <w:r>
         <w:rPr>
@@ -14394,7 +14395,7 @@
           <w:lang w:val="uk-UA"/>
         </w:rPr>
         <w:ind w:left="1134" w:hanging="567"/>
-        <w:spacing w:before="120" w:after="0" w:line="240" w:lineRule="auto"/>
+        <w:spacing w:before="120" w:after="0" w:line="276" w:lineRule="auto"/>
       </w:pPr>
       <w:r>
         <w:rPr>
@@ -14674,7 +14675,7 @@
           <w:lang w:val="uk-UA"/>
         </w:rPr>
         <w:ind w:left="1134" w:hanging="567"/>
-        <w:spacing w:before="120" w:after="0" w:line="240" w:lineRule="auto"/>
+        <w:spacing w:before="120" w:after="0" w:line="276" w:lineRule="auto"/>
       </w:pPr>
       <w:r>
         <w:rPr>
@@ -14718,7 +14719,7 @@
           <w:lang w:val="uk-UA"/>
         </w:rPr>
         <w:ind w:left="1134" w:hanging="567"/>
-        <w:spacing w:before="120" w:after="0" w:line="240" w:lineRule="auto"/>
+        <w:spacing w:before="120" w:after="0" w:line="276" w:lineRule="auto"/>
       </w:pPr>
       <w:r>
         <w:rPr>
@@ -14745,7 +14746,7 @@
           <w:lang w:val="uk-UA"/>
         </w:rPr>
         <w:ind w:left="1134" w:hanging="567"/>
-        <w:spacing w:before="120" w:after="0" w:line="240" w:lineRule="auto"/>
+        <w:spacing w:before="120" w:after="0" w:line="276" w:lineRule="auto"/>
       </w:pPr>
       <w:r>
         <w:rPr>
@@ -14790,7 +14791,7 @@
           <w:lang w:val="uk-UA"/>
         </w:rPr>
         <w:ind w:left="1134" w:hanging="567"/>
-        <w:spacing w:before="120" w:after="0" w:line="240" w:lineRule="auto"/>
+        <w:spacing w:before="120" w:after="0" w:line="276" w:lineRule="auto"/>
       </w:pPr>
       <w:r>
         <w:rPr>
@@ -14822,7 +14823,7 @@
           <w:lang w:val="uk-UA"/>
         </w:rPr>
         <w:ind w:left="1134" w:hanging="567"/>
-        <w:spacing w:before="120" w:after="0" w:line="240" w:lineRule="auto"/>
+        <w:spacing w:before="120" w:after="0" w:line="276" w:lineRule="auto"/>
       </w:pPr>
       <w:r>
         <w:rPr>
@@ -14877,7 +14878,7 @@
           <w:lang w:val="uk-UA"/>
         </w:rPr>
         <w:ind w:left="1134" w:hanging="567"/>
-        <w:spacing w:before="120" w:after="0" w:line="240" w:lineRule="auto"/>
+        <w:spacing w:before="120" w:after="0" w:line="276" w:lineRule="auto"/>
       </w:pPr>
       <w:r>
         <w:rPr>
@@ -14947,16 +14948,16 @@
           <w:lang w:val="uk-UA"/>
         </w:rPr>
         <w:ind w:left="567" w:hanging="567"/>
-        <w:spacing w:before="120" w:after="0" w:line="240" w:lineRule="auto"/>
-      </w:pPr>
-      <w:r>
-        <w:rPr>
-          <w:rFonts w:ascii="Cambria" w:hAnsi="Cambria" w:cs="Cambria"/>
-          <w:sz w:val="22"/>
-          <w:szCs w:val="22"/>
-          <w:lang w:val="uk-UA"/>
-        </w:rPr>
-        <w:t>Audition du témoin Sushchenko L.V. (mandataire de Granum Corp., Laterson Management Group, Business House Helena A.G., Tabernus Corp.) du 21/01/2025 :</w:t>
+        <w:spacing w:before="120" w:after="0" w:line="276" w:lineRule="auto"/>
+      </w:pPr>
+      <w:r>
+        <w:rPr>
+          <w:rFonts w:ascii="Cambria" w:hAnsi="Cambria" w:cs="Cambria"/>
+          <w:sz w:val="22"/>
+          <w:szCs w:val="22"/>
+          <w:lang w:val="uk-UA"/>
+        </w:rPr>
+        <w:t>Audition du témoin Sushchenko L.V. (mandataire de Granum Corp., Laterson Management Group, Business House Helena A.G., Tabernus Corp.) du 21 janvier 2025 :</w:t>
       </w:r>
       <w:proofErr w:type="spellStart"/>
       <w:r>
@@ -15169,7 +15170,7 @@
           <w:lang w:val="uk-UA"/>
         </w:rPr>
         <w:ind w:left="567"/>
-        <w:spacing w:before="120" w:after="0" w:line="240" w:lineRule="auto"/>
+        <w:spacing w:before="120" w:after="0" w:line="276" w:lineRule="auto"/>
       </w:pPr>
       <w:r>
         <w:rPr>
@@ -15200,7 +15201,7 @@
           <w:lang w:val="uk-UA"/>
         </w:rPr>
         <w:ind w:left="1134" w:hanging="567"/>
-        <w:spacing w:before="120" w:after="0" w:line="240" w:lineRule="auto"/>
+        <w:spacing w:before="120" w:after="0" w:line="276" w:lineRule="auto"/>
       </w:pPr>
       <w:r>
         <w:rPr>
@@ -15337,7 +15338,7 @@
           <w:lang w:val="uk-UA"/>
         </w:rPr>
         <w:ind w:left="1134" w:hanging="567"/>
-        <w:spacing w:before="120" w:after="0" w:line="240" w:lineRule="auto"/>
+        <w:spacing w:before="120" w:after="0" w:line="276" w:lineRule="auto"/>
       </w:pPr>
       <w:r>
         <w:rPr>
@@ -15543,7 +15544,7 @@
           <w:lang w:val="uk-UA"/>
         </w:rPr>
         <w:ind w:left="567" w:hanging="567"/>
-        <w:spacing w:before="120" w:after="0" w:line="240" w:lineRule="auto"/>
+        <w:spacing w:before="120" w:after="0" w:line="276" w:lineRule="auto"/>
       </w:pPr>
       <w:r>
         <w:rPr>
@@ -15583,7 +15584,7 @@
           <w:lang w:val="uk-UA"/>
         </w:rPr>
         <w:ind w:left="567"/>
-        <w:spacing w:before="120" w:after="0" w:line="240" w:lineRule="auto"/>
+        <w:spacing w:before="120" w:after="0" w:line="276" w:lineRule="auto"/>
       </w:pPr>
       <w:r>
         <w:rPr>
@@ -15611,7 +15612,7 @@
           <w:lang w:val="uk-UA"/>
         </w:rPr>
         <w:ind w:left="1134" w:hanging="567"/>
-        <w:spacing w:before="120" w:after="0" w:line="240" w:lineRule="auto"/>
+        <w:spacing w:before="120" w:after="0" w:line="276" w:lineRule="auto"/>
       </w:pPr>
       <w:r>
         <w:rPr>
@@ -15727,7 +15728,7 @@
           <w:lang w:val="uk-UA"/>
         </w:rPr>
         <w:ind w:left="1134" w:hanging="567"/>
-        <w:spacing w:before="120" w:after="0" w:line="240" w:lineRule="auto"/>
+        <w:spacing w:before="120" w:after="0" w:line="276" w:lineRule="auto"/>
       </w:pPr>
       <w:r>
         <w:rPr>
@@ -15843,16 +15844,16 @@
           <w:lang w:val="uk-UA"/>
         </w:rPr>
         <w:ind w:left="567" w:hanging="567"/>
-        <w:spacing w:before="120" w:after="0" w:line="240" w:lineRule="auto"/>
-      </w:pPr>
-      <w:r>
-        <w:rPr>
-          <w:rFonts w:ascii="Cambria" w:hAnsi="Cambria" w:cs="Cambria"/>
-          <w:sz w:val="22"/>
-          <w:szCs w:val="22"/>
-          <w:lang w:val="uk-UA"/>
-        </w:rPr>
-        <w:t>Audition du témoin Arkatova I.V. (détentrice nominale de Waldo Trade Ltd) du 27/01/2025 :</w:t>
+        <w:spacing w:before="120" w:after="0" w:line="276" w:lineRule="auto"/>
+      </w:pPr>
+      <w:r>
+        <w:rPr>
+          <w:rFonts w:ascii="Cambria" w:hAnsi="Cambria" w:cs="Cambria"/>
+          <w:sz w:val="22"/>
+          <w:szCs w:val="22"/>
+          <w:lang w:val="uk-UA"/>
+        </w:rPr>
+        <w:t>Audition du témoin Arkatova I.V. (détentrice nominale de Waldo Trade Ltd) du 27 janvier 2025 :</w:t>
       </w:r>
       <w:proofErr w:type="spellStart"/>
       <w:r>
@@ -15937,7 +15938,7 @@
           <w:lang w:val="uk-UA"/>
         </w:rPr>
         <w:ind w:left="567"/>
-        <w:spacing w:before="120" w:after="0" w:line="240" w:lineRule="auto"/>
+        <w:spacing w:before="120" w:after="0" w:line="276" w:lineRule="auto"/>
       </w:pPr>
       <w:r>
         <w:rPr>
@@ -15965,7 +15966,7 @@
           <w:lang w:val="uk-UA"/>
         </w:rPr>
         <w:ind w:left="1134" w:hanging="567"/>
-        <w:spacing w:before="120" w:after="0" w:line="240" w:lineRule="auto"/>
+        <w:spacing w:before="120" w:after="0" w:line="276" w:lineRule="auto"/>
       </w:pPr>
       <w:r>
         <w:rPr>
@@ -15991,7 +15992,7 @@
           <w:lang w:val="uk-UA"/>
         </w:rPr>
         <w:ind w:left="1134" w:hanging="567"/>
-        <w:spacing w:before="120" w:after="0" w:line="240" w:lineRule="auto"/>
+        <w:spacing w:before="120" w:after="0" w:line="276" w:lineRule="auto"/>
       </w:pPr>
       <w:r>
         <w:rPr>
@@ -16161,7 +16162,7 @@
           <w:lang w:val="uk-UA"/>
         </w:rPr>
         <w:ind w:left="1134" w:hanging="567"/>
-        <w:spacing w:before="120" w:after="0" w:line="240" w:lineRule="auto"/>
+        <w:spacing w:before="120" w:after="0" w:line="276" w:lineRule="auto"/>
       </w:pPr>
       <w:r>
         <w:rPr>
@@ -16259,7 +16260,7 @@
           <w:lang w:val="uk-UA"/>
         </w:rPr>
         <w:ind w:left="1134" w:hanging="567"/>
-        <w:spacing w:before="120" w:after="0" w:line="240" w:lineRule="auto"/>
+        <w:spacing w:before="120" w:after="0" w:line="276" w:lineRule="auto"/>
       </w:pPr>
       <w:r>
         <w:rPr>
@@ -16339,16 +16340,16 @@
           <w:lang w:val="uk-UA"/>
         </w:rPr>
         <w:ind w:left="567" w:hanging="567"/>
-        <w:spacing w:before="120" w:after="0" w:line="240" w:lineRule="auto"/>
-      </w:pPr>
-      <w:r>
-        <w:rPr>
-          <w:rFonts w:ascii="Cambria" w:hAnsi="Cambria" w:cs="Cambria"/>
-          <w:sz w:val="22"/>
-          <w:szCs w:val="22"/>
-          <w:lang w:val="uk-UA"/>
-        </w:rPr>
-        <w:t>Audition du témoin Trufanova L.S. (mandataire de Geoford LLP) du 20/01/2025 :</w:t>
+        <w:spacing w:before="120" w:after="0" w:line="276" w:lineRule="auto"/>
+      </w:pPr>
+      <w:r>
+        <w:rPr>
+          <w:rFonts w:ascii="Cambria" w:hAnsi="Cambria" w:cs="Cambria"/>
+          <w:sz w:val="22"/>
+          <w:szCs w:val="22"/>
+          <w:lang w:val="uk-UA"/>
+        </w:rPr>
+        <w:t>Audition du témoin Trufanova L.S. (mandataire de Geoford LLP) du 20 janvier 2025 :</w:t>
       </w:r>
       <w:proofErr w:type="spellStart"/>
       <w:r>
@@ -16415,7 +16416,7 @@
           <w:lang w:val="uk-UA"/>
         </w:rPr>
         <w:ind w:left="567"/>
-        <w:spacing w:before="120" w:after="0" w:line="240" w:lineRule="auto"/>
+        <w:spacing w:before="120" w:after="0" w:line="276" w:lineRule="auto"/>
       </w:pPr>
       <w:r>
         <w:rPr>
@@ -16443,7 +16444,7 @@
           <w:lang w:val="uk-UA"/>
         </w:rPr>
         <w:ind w:left="1134" w:hanging="567"/>
-        <w:spacing w:before="120" w:after="0" w:line="240" w:lineRule="auto"/>
+        <w:spacing w:before="120" w:after="0" w:line="276" w:lineRule="auto"/>
       </w:pPr>
       <w:r>
         <w:rPr>
@@ -16685,7 +16686,7 @@
           <w:lang w:val="uk-UA"/>
         </w:rPr>
         <w:ind w:left="1134" w:hanging="567"/>
-        <w:spacing w:before="120" w:after="0" w:line="240" w:lineRule="auto"/>
+        <w:spacing w:before="120" w:after="0" w:line="276" w:lineRule="auto"/>
       </w:pPr>
       <w:r>
         <w:rPr>
@@ -16729,7 +16730,7 @@
           <w:lang w:val="uk-UA"/>
         </w:rPr>
         <w:ind w:left="567" w:hanging="567"/>
-        <w:spacing w:before="120" w:after="0" w:line="240" w:lineRule="auto"/>
+        <w:spacing w:before="120" w:after="0" w:line="276" w:lineRule="auto"/>
       </w:pPr>
       <w:r>
         <w:rPr>
@@ -16812,16 +16813,16 @@
           <w:szCs w:val="22"/>
         </w:rPr>
         <w:ind w:left="1062" w:hanging="567"/>
-        <w:spacing w:before="120" w:after="0" w:line="240" w:lineRule="auto"/>
-      </w:pPr>
-      <w:proofErr w:type="spellStart"/>
-      <w:r>
-        <w:rPr>
-          <w:rFonts w:ascii="Cambria" w:hAnsi="Cambria" w:cs="Cambria"/>
-          <w:sz w:val="22"/>
-          <w:szCs w:val="22"/>
-        </w:rPr>
-        <w:t>Putiy M. du 14/07/2017 (directeur de la sécurité économique) ;</w:t>
+        <w:spacing w:before="120" w:after="0" w:line="276" w:lineRule="auto"/>
+      </w:pPr>
+      <w:proofErr w:type="spellStart"/>
+      <w:r>
+        <w:rPr>
+          <w:rFonts w:ascii="Cambria" w:hAnsi="Cambria" w:cs="Cambria"/>
+          <w:sz w:val="22"/>
+          <w:szCs w:val="22"/>
+        </w:rPr>
+        <w:t>Putiy M. du 14 juillet 2017 (directeur de la sécurité économique) ;</w:t>
       </w:r>
       <w:proofErr w:type="spellEnd"/>
       <w:r>
@@ -16893,16 +16894,16 @@
           <w:szCs w:val="22"/>
         </w:rPr>
         <w:ind w:left="1062" w:hanging="567"/>
-        <w:spacing w:before="120" w:after="0" w:line="240" w:lineRule="auto"/>
-      </w:pPr>
-      <w:proofErr w:type="spellStart"/>
-      <w:r>
-        <w:rPr>
-          <w:rFonts w:ascii="Cambria" w:hAnsi="Cambria" w:cs="Cambria"/>
-          <w:sz w:val="22"/>
-          <w:szCs w:val="22"/>
-        </w:rPr>
-        <w:t>Berezovskyi M. du 14/07/2017 (directeur de la construction) ;</w:t>
+        <w:spacing w:before="120" w:after="0" w:line="276" w:lineRule="auto"/>
+      </w:pPr>
+      <w:proofErr w:type="spellStart"/>
+      <w:r>
+        <w:rPr>
+          <w:rFonts w:ascii="Cambria" w:hAnsi="Cambria" w:cs="Cambria"/>
+          <w:sz w:val="22"/>
+          <w:szCs w:val="22"/>
+        </w:rPr>
+        <w:t>Berezovskyi M. du 14 juillet 2017 (directeur de la construction) ;</w:t>
       </w:r>
       <w:proofErr w:type="spellEnd"/>
       <w:r>
@@ -16958,16 +16959,16 @@
           <w:szCs w:val="22"/>
         </w:rPr>
         <w:ind w:left="1062" w:hanging="567"/>
-        <w:spacing w:before="120" w:after="0" w:line="240" w:lineRule="auto"/>
-      </w:pPr>
-      <w:proofErr w:type="spellStart"/>
-      <w:r>
-        <w:rPr>
-          <w:rFonts w:ascii="Cambria" w:hAnsi="Cambria" w:cs="Cambria"/>
-          <w:sz w:val="22"/>
-          <w:szCs w:val="22"/>
-        </w:rPr>
-        <w:t>Lunin V. du 14/07/2017 (directeur financier) ;</w:t>
+        <w:spacing w:before="120" w:after="0" w:line="276" w:lineRule="auto"/>
+      </w:pPr>
+      <w:proofErr w:type="spellStart"/>
+      <w:r>
+        <w:rPr>
+          <w:rFonts w:ascii="Cambria" w:hAnsi="Cambria" w:cs="Cambria"/>
+          <w:sz w:val="22"/>
+          <w:szCs w:val="22"/>
+        </w:rPr>
+        <w:t>Lunin V. du 14 juillet 2017 (directeur financier) ;</w:t>
       </w:r>
       <w:proofErr w:type="spellEnd"/>
       <w:r>
@@ -17023,16 +17024,16 @@
           <w:szCs w:val="22"/>
         </w:rPr>
         <w:ind w:left="1062" w:hanging="567"/>
-        <w:spacing w:before="120" w:after="0" w:line="240" w:lineRule="auto"/>
-      </w:pPr>
-      <w:proofErr w:type="spellStart"/>
-      <w:r>
-        <w:rPr>
-          <w:rFonts w:ascii="Cambria" w:hAnsi="Cambria" w:cs="Cambria"/>
-          <w:sz w:val="22"/>
-          <w:szCs w:val="22"/>
-        </w:rPr>
-        <w:t>Mozgovyi V.F. du 14/07/2017 (technologue) ;</w:t>
+        <w:spacing w:before="120" w:after="0" w:line="276" w:lineRule="auto"/>
+      </w:pPr>
+      <w:proofErr w:type="spellStart"/>
+      <w:r>
+        <w:rPr>
+          <w:rFonts w:ascii="Cambria" w:hAnsi="Cambria" w:cs="Cambria"/>
+          <w:sz w:val="22"/>
+          <w:szCs w:val="22"/>
+        </w:rPr>
+        <w:t>Mozgovyi V.F. du 14 juillet 2017 (technologue) ;</w:t>
       </w:r>
       <w:proofErr w:type="spellEnd"/>
       <w:r>
@@ -17072,16 +17073,16 @@
           <w:szCs w:val="22"/>
         </w:rPr>
         <w:ind w:left="1062" w:hanging="567"/>
-        <w:spacing w:before="120" w:after="0" w:line="240" w:lineRule="auto"/>
-      </w:pPr>
-      <w:proofErr w:type="spellStart"/>
-      <w:r>
-        <w:rPr>
-          <w:rFonts w:ascii="Cambria" w:hAnsi="Cambria" w:cs="Cambria"/>
-          <w:sz w:val="22"/>
-          <w:szCs w:val="22"/>
-        </w:rPr>
-        <w:t>Khvostak V. du 09/04/2025 (ingénieur) ;</w:t>
+        <w:spacing w:before="120" w:after="0" w:line="276" w:lineRule="auto"/>
+      </w:pPr>
+      <w:proofErr w:type="spellStart"/>
+      <w:r>
+        <w:rPr>
+          <w:rFonts w:ascii="Cambria" w:hAnsi="Cambria" w:cs="Cambria"/>
+          <w:sz w:val="22"/>
+          <w:szCs w:val="22"/>
+        </w:rPr>
+        <w:t>Khvostak V. du 9 avril 2025 (ingénieur) ;</w:t>
       </w:r>
       <w:proofErr w:type="spellEnd"/>
       <w:r>
@@ -17137,16 +17138,16 @@
           <w:szCs w:val="22"/>
         </w:rPr>
         <w:ind w:left="1062" w:hanging="567"/>
-        <w:spacing w:before="120" w:after="0" w:line="240" w:lineRule="auto"/>
-      </w:pPr>
-      <w:proofErr w:type="spellStart"/>
-      <w:r>
-        <w:rPr>
-          <w:rFonts w:ascii="Cambria" w:hAnsi="Cambria" w:cs="Cambria"/>
-          <w:sz w:val="22"/>
-          <w:szCs w:val="22"/>
-        </w:rPr>
-        <w:t>Bezkhlibnyi D. du 10/04/2025 (chef du service export) ;</w:t>
+        <w:spacing w:before="120" w:after="0" w:line="276" w:lineRule="auto"/>
+      </w:pPr>
+      <w:proofErr w:type="spellStart"/>
+      <w:r>
+        <w:rPr>
+          <w:rFonts w:ascii="Cambria" w:hAnsi="Cambria" w:cs="Cambria"/>
+          <w:sz w:val="22"/>
+          <w:szCs w:val="22"/>
+        </w:rPr>
+        <w:t>Bezkhlibnyi D. du 10 avril 2025 (chef du service export) ;</w:t>
       </w:r>
       <w:proofErr w:type="spellEnd"/>
       <w:r>
@@ -17218,15 +17219,15 @@
           <w:szCs w:val="22"/>
         </w:rPr>
         <w:ind w:left="1062" w:hanging="567"/>
-        <w:spacing w:before="120" w:after="0" w:line="240" w:lineRule="auto"/>
-      </w:pPr>
-      <w:r>
-        <w:rPr>
-          <w:rFonts w:ascii="Cambria" w:hAnsi="Cambria" w:cs="Cambria"/>
-          <w:sz w:val="22"/>
-          <w:szCs w:val="22"/>
-        </w:rPr>
-        <w:t>Voitenko S. du 10/04/2025 (ancien directeur de la fabrication des moteurs).</w:t>
+        <w:spacing w:before="120" w:after="0" w:line="276" w:lineRule="auto"/>
+      </w:pPr>
+      <w:r>
+        <w:rPr>
+          <w:rFonts w:ascii="Cambria" w:hAnsi="Cambria" w:cs="Cambria"/>
+          <w:sz w:val="22"/>
+          <w:szCs w:val="22"/>
+        </w:rPr>
+        <w:t>Voitenko S. du 10 avril 2025 (ancien directeur de la fabrication des moteurs).</w:t>
       </w:r>
       <w:proofErr w:type="spellStart"/>
       <w:r>
@@ -17309,7 +17310,7 @@
           <w:szCs w:val="22"/>
         </w:rPr>
         <w:ind w:left="567" w:hanging="567"/>
-        <w:spacing w:before="120" w:after="0" w:line="240" w:lineRule="auto"/>
+        <w:spacing w:before="120" w:after="0" w:line="276" w:lineRule="auto"/>
       </w:pPr>
       <w:proofErr w:type="spellStart"/>
       <w:r>
@@ -17397,7 +17398,7 @@
           <w:szCs w:val="22"/>
         </w:rPr>
         <w:ind w:left="1062" w:hanging="567"/>
-        <w:spacing w:before="120" w:after="0" w:line="240" w:lineRule="auto"/>
+        <w:spacing w:before="120" w:after="0" w:line="276" w:lineRule="auto"/>
       </w:pPr>
       <w:proofErr w:type="spellStart"/>
       <w:r>
@@ -17446,15 +17447,15 @@
           <w:szCs w:val="22"/>
         </w:rPr>
         <w:ind w:left="1062" w:hanging="567"/>
-        <w:spacing w:before="120" w:after="0" w:line="240" w:lineRule="auto"/>
-      </w:pPr>
-      <w:r>
-        <w:rPr>
-          <w:rFonts w:ascii="Cambria" w:hAnsi="Cambria" w:cs="Cambria"/>
-          <w:sz w:val="22"/>
-          <w:szCs w:val="22"/>
-        </w:rPr>
-        <w:t>Golubchyk S. du 13/09/2017 (directeur adjoint de la surveillance financière / LCB-FT) ;</w:t>
+        <w:spacing w:before="120" w:after="0" w:line="276" w:lineRule="auto"/>
+      </w:pPr>
+      <w:r>
+        <w:rPr>
+          <w:rFonts w:ascii="Cambria" w:hAnsi="Cambria" w:cs="Cambria"/>
+          <w:sz w:val="22"/>
+          <w:szCs w:val="22"/>
+        </w:rPr>
+        <w:t>Golubchyk S. du 13 septembre 2017 (directeur adjoint de la surveillance financière / LCB-FT) ;</w:t>
       </w:r>
       <w:proofErr w:type="spellStart"/>
       <w:r>
@@ -17502,16 +17503,16 @@
           <w:szCs w:val="22"/>
         </w:rPr>
         <w:ind w:left="1062" w:hanging="567"/>
-        <w:spacing w:before="120" w:after="0" w:line="240" w:lineRule="auto"/>
-      </w:pPr>
-      <w:proofErr w:type="spellStart"/>
-      <w:r>
-        <w:rPr>
-          <w:rFonts w:ascii="Cambria" w:hAnsi="Cambria" w:cs="Cambria"/>
-          <w:sz w:val="22"/>
-          <w:szCs w:val="22"/>
-        </w:rPr>
-        <w:t>Matsuyev D. du 11/09/2017 (directeur) ;</w:t>
+        <w:spacing w:before="120" w:after="0" w:line="276" w:lineRule="auto"/>
+      </w:pPr>
+      <w:proofErr w:type="spellStart"/>
+      <w:r>
+        <w:rPr>
+          <w:rFonts w:ascii="Cambria" w:hAnsi="Cambria" w:cs="Cambria"/>
+          <w:sz w:val="22"/>
+          <w:szCs w:val="22"/>
+        </w:rPr>
+        <w:t>Matsuyev D. du 11 septembre 2017 (directeur) ;</w:t>
       </w:r>
       <w:proofErr w:type="spellEnd"/>
       <w:r>
@@ -17551,7 +17552,7 @@
           <w:szCs w:val="22"/>
         </w:rPr>
         <w:ind w:left="567" w:hanging="567"/>
-        <w:spacing w:before="120" w:after="0" w:line="240" w:lineRule="auto"/>
+        <w:spacing w:before="120" w:after="0" w:line="276" w:lineRule="auto"/>
       </w:pPr>
       <w:proofErr w:type="spellStart"/>
       <w:r>
@@ -17616,16 +17617,16 @@
           <w:szCs w:val="22"/>
         </w:rPr>
         <w:ind w:left="1062" w:hanging="567"/>
-        <w:spacing w:before="120" w:after="0" w:line="240" w:lineRule="auto"/>
-      </w:pPr>
-      <w:proofErr w:type="spellStart"/>
-      <w:r>
-        <w:rPr>
-          <w:rFonts w:ascii="Cambria" w:hAnsi="Cambria" w:cs="Cambria"/>
-          <w:sz w:val="22"/>
-          <w:szCs w:val="22"/>
-        </w:rPr>
-        <w:t>Pryazhenkov A. du 04/09/2017 (officier opérationnel ayant constaté l'infraction) ;</w:t>
+        <w:spacing w:before="120" w:after="0" w:line="276" w:lineRule="auto"/>
+      </w:pPr>
+      <w:proofErr w:type="spellStart"/>
+      <w:r>
+        <w:rPr>
+          <w:rFonts w:ascii="Cambria" w:hAnsi="Cambria" w:cs="Cambria"/>
+          <w:sz w:val="22"/>
+          <w:szCs w:val="22"/>
+        </w:rPr>
+        <w:t>Pryazhenkov A. du 4 septembre 2017 (officier opérationnel ayant constaté l'infraction) ;</w:t>
       </w:r>
       <w:proofErr w:type="spellEnd"/>
       <w:r>
@@ -17729,16 +17730,16 @@
           <w:szCs w:val="22"/>
         </w:rPr>
         <w:ind w:left="1062" w:hanging="567"/>
-        <w:spacing w:before="120" w:after="0" w:line="240" w:lineRule="auto"/>
-      </w:pPr>
-      <w:proofErr w:type="spellStart"/>
-      <w:r>
-        <w:rPr>
-          <w:rFonts w:ascii="Cambria" w:hAnsi="Cambria" w:cs="Cambria"/>
-          <w:sz w:val="22"/>
-          <w:szCs w:val="22"/>
-        </w:rPr>
-        <w:t>Lishchyna V. du 11/04/2025 (chef de la division de production de JSC « Ivchenko-Progress », ancien ajusteur de Motor Sich) ;</w:t>
+        <w:spacing w:before="120" w:after="0" w:line="276" w:lineRule="auto"/>
+      </w:pPr>
+      <w:proofErr w:type="spellStart"/>
+      <w:r>
+        <w:rPr>
+          <w:rFonts w:ascii="Cambria" w:hAnsi="Cambria" w:cs="Cambria"/>
+          <w:sz w:val="22"/>
+          <w:szCs w:val="22"/>
+        </w:rPr>
+        <w:t>Lishchyna V. du 11 avril 2025 (chef de la division de production de JSC « Ivchenko-Progress », ancien ajusteur de Motor Sich) ;</w:t>
       </w:r>
       <w:proofErr w:type="spellEnd"/>
       <w:r>
@@ -17842,7 +17843,7 @@
           <w:szCs w:val="22"/>
         </w:rPr>
         <w:ind w:left="1062" w:hanging="567"/>
-        <w:spacing w:before="120" w:after="0" w:line="240" w:lineRule="auto"/>
+        <w:spacing w:before="120" w:after="0" w:line="276" w:lineRule="auto"/>
       </w:pPr>
       <w:r>
         <w:rPr>
@@ -17899,16 +17900,16 @@
           <w:lang w:val="uk-UA"/>
         </w:rPr>
         <w:ind w:left="567" w:hanging="567"/>
-        <w:spacing w:before="120" w:after="0" w:line="240" w:lineRule="auto"/>
-      </w:pPr>
-      <w:r>
-        <w:rPr>
-          <w:rFonts w:ascii="Cambria" w:hAnsi="Cambria" w:cs="Cambria"/>
-          <w:sz w:val="22"/>
-          <w:szCs w:val="22"/>
-          <w:lang w:val="uk-UA"/>
-        </w:rPr>
-        <w:t>Audition du suspect Zaruba P. (directeur adjoint du département du commerce extérieur de Motor Sich) du 10/03/2023 :</w:t>
+        <w:spacing w:before="120" w:after="0" w:line="276" w:lineRule="auto"/>
+      </w:pPr>
+      <w:r>
+        <w:rPr>
+          <w:rFonts w:ascii="Cambria" w:hAnsi="Cambria" w:cs="Cambria"/>
+          <w:sz w:val="22"/>
+          <w:szCs w:val="22"/>
+          <w:lang w:val="uk-UA"/>
+        </w:rPr>
+        <w:t>Audition du suspect Zaruba P. (directeur adjoint du département du commerce extérieur de Motor Sich) du 10 mars 2023 :</w:t>
       </w:r>
       <w:proofErr w:type="spellStart"/>
       <w:r>
@@ -17987,7 +17988,7 @@
           <w:lang w:val="uk-UA"/>
         </w:rPr>
         <w:ind w:left="567"/>
-        <w:spacing w:before="120" w:after="0" w:line="240" w:lineRule="auto"/>
+        <w:spacing w:before="120" w:after="0" w:line="276" w:lineRule="auto"/>
       </w:pPr>
       <w:r>
         <w:rPr>
@@ -18049,16 +18050,16 @@
           <w:lang w:val="uk-UA"/>
         </w:rPr>
         <w:ind w:left="567" w:hanging="567"/>
-        <w:spacing w:before="120" w:after="0" w:line="240" w:lineRule="auto"/>
-      </w:pPr>
-      <w:r>
-        <w:rPr>
-          <w:rFonts w:ascii="Cambria" w:hAnsi="Cambria" w:cs="Cambria"/>
-          <w:sz w:val="22"/>
-          <w:szCs w:val="22"/>
-          <w:lang w:val="uk-UA"/>
-        </w:rPr>
-        <w:t>Rapport des spécialistes du DASU du 16/03/2021 relatif aux irrégularités lors de la privatisation des actions de Motor Sich et au préjudice causé à l'État.</w:t>
+        <w:spacing w:before="120" w:after="0" w:line="276" w:lineRule="auto"/>
+      </w:pPr>
+      <w:r>
+        <w:rPr>
+          <w:rFonts w:ascii="Cambria" w:hAnsi="Cambria" w:cs="Cambria"/>
+          <w:sz w:val="22"/>
+          <w:szCs w:val="22"/>
+          <w:lang w:val="uk-UA"/>
+        </w:rPr>
+        <w:t>Rapport des spécialistes du DASU du 16 mars 2021 relatif aux irrégularités lors de la privatisation des actions de Motor Sich et au préjudice causé à l'État.</w:t>
       </w:r>
     </w:p>
     <w:p>
@@ -18071,7 +18072,7 @@
           <w:lang w:val="uk-UA"/>
         </w:rPr>
         <w:ind w:left="567"/>
-        <w:spacing w:before="120" w:after="0" w:line="240" w:lineRule="auto"/>
+        <w:spacing w:before="120" w:after="0" w:line="276" w:lineRule="auto"/>
       </w:pPr>
       <w:r>
         <w:rPr>
@@ -18157,7 +18158,7 @@
           <w:lang w:val="uk-UA"/>
         </w:rPr>
         <w:ind w:left="567"/>
-        <w:spacing w:before="120" w:after="0" w:line="240" w:lineRule="auto"/>
+        <w:spacing w:before="120" w:after="0" w:line="276" w:lineRule="auto"/>
       </w:pPr>
       <w:r>
         <w:rPr>
@@ -18168,7 +18169,7 @@
           <w:szCs w:val="22"/>
           <w:lang w:val="uk-UA"/>
         </w:rPr>
-        <w:t>Fondement : saisine de la GSU SBU ordonnant la désignation de spécialistes dans le cadre du dossier pénal n° 4201708000000002509 du 09/02/2021.</w:t>
+        <w:t>Fondement : saisine de la GSU SBU ordonnant la désignation de spécialistes dans le cadre du dossier pénal n° 4201708000000002509 du 9 février 2021.</w:t>
       </w:r>
       <w:r>
         <w:rPr>
@@ -18191,7 +18192,7 @@
           <w:lang w:val="uk-UA"/>
         </w:rPr>
         <w:ind w:left="567"/>
-        <w:spacing w:before="120" w:after="0" w:line="240" w:lineRule="auto"/>
+        <w:spacing w:before="120" w:after="0" w:line="276" w:lineRule="auto"/>
       </w:pPr>
       <w:r>
         <w:rPr>
@@ -18219,7 +18220,7 @@
           <w:lang w:val="uk-UA"/>
         </w:rPr>
         <w:ind w:left="1134" w:hanging="567"/>
-        <w:spacing w:before="120" w:after="0" w:line="240" w:lineRule="auto"/>
+        <w:spacing w:before="120" w:after="0" w:line="276" w:lineRule="auto"/>
       </w:pPr>
       <w:r>
         <w:rPr>
@@ -18245,7 +18246,7 @@
           <w:lang w:val="uk-UA"/>
         </w:rPr>
         <w:ind w:left="1134" w:hanging="567"/>
-        <w:spacing w:before="120" w:after="0" w:line="240" w:lineRule="auto"/>
+        <w:spacing w:before="120" w:after="0" w:line="276" w:lineRule="auto"/>
       </w:pPr>
       <w:r>
         <w:rPr>
@@ -18271,7 +18272,7 @@
           <w:lang w:val="uk-UA"/>
         </w:rPr>
         <w:ind w:left="1134" w:hanging="567"/>
-        <w:spacing w:before="120" w:after="0" w:line="240" w:lineRule="auto"/>
+        <w:spacing w:before="120" w:after="0" w:line="276" w:lineRule="auto"/>
       </w:pPr>
       <w:r>
         <w:rPr>
@@ -18297,7 +18298,7 @@
           <w:lang w:val="uk-UA"/>
         </w:rPr>
         <w:ind w:left="1134" w:hanging="567"/>
-        <w:spacing w:before="120" w:after="0" w:line="240" w:lineRule="auto"/>
+        <w:spacing w:before="120" w:after="0" w:line="276" w:lineRule="auto"/>
       </w:pPr>
       <w:r>
         <w:rPr>
@@ -18323,7 +18324,7 @@
           <w:lang w:val="uk-UA"/>
         </w:rPr>
         <w:ind w:left="1134" w:hanging="567"/>
-        <w:spacing w:before="120" w:after="0" w:line="240" w:lineRule="auto"/>
+        <w:spacing w:before="120" w:after="0" w:line="276" w:lineRule="auto"/>
       </w:pPr>
       <w:r>
         <w:rPr>
@@ -18367,7 +18368,7 @@
           <w:lang w:val="uk-UA"/>
         </w:rPr>
         <w:ind w:left="1134" w:hanging="567"/>
-        <w:spacing w:before="120" w:after="0" w:line="240" w:lineRule="auto"/>
+        <w:spacing w:before="120" w:after="0" w:line="276" w:lineRule="auto"/>
       </w:pPr>
       <w:r>
         <w:rPr>
@@ -18393,7 +18394,7 @@
           <w:lang w:val="uk-UA"/>
         </w:rPr>
         <w:ind w:left="1134" w:hanging="567"/>
-        <w:spacing w:before="120" w:after="0" w:line="240" w:lineRule="auto"/>
+        <w:spacing w:before="120" w:after="0" w:line="276" w:lineRule="auto"/>
       </w:pPr>
       <w:r>
         <w:rPr>
@@ -18419,7 +18420,7 @@
           <w:lang w:val="uk-UA"/>
         </w:rPr>
         <w:ind w:left="1134" w:hanging="567"/>
-        <w:spacing w:before="120" w:after="0" w:line="240" w:lineRule="auto"/>
+        <w:spacing w:before="120" w:after="0" w:line="276" w:lineRule="auto"/>
       </w:pPr>
       <w:r>
         <w:rPr>
@@ -18445,7 +18446,7 @@
           <w:lang w:val="uk-UA"/>
         </w:rPr>
         <w:ind w:left="1134" w:hanging="567"/>
-        <w:spacing w:before="120" w:after="0" w:line="240" w:lineRule="auto"/>
+        <w:spacing w:before="120" w:after="0" w:line="276" w:lineRule="auto"/>
       </w:pPr>
       <w:r>
         <w:rPr>
@@ -18471,7 +18472,7 @@
           <w:lang w:val="uk-UA"/>
         </w:rPr>
         <w:ind w:left="1134" w:hanging="567"/>
-        <w:spacing w:before="120" w:after="0" w:line="240" w:lineRule="auto"/>
+        <w:spacing w:before="120" w:after="0" w:line="276" w:lineRule="auto"/>
       </w:pPr>
       <w:r>
         <w:rPr>
@@ -18515,7 +18516,7 @@
           <w:lang w:val="uk-UA"/>
         </w:rPr>
         <w:ind w:left="567" w:hanging="567"/>
-        <w:spacing w:before="120" w:after="0" w:line="240" w:lineRule="auto"/>
+        <w:spacing w:before="120" w:after="0" w:line="276" w:lineRule="auto"/>
       </w:pPr>
       <w:r>
         <w:rPr>
@@ -18539,7 +18540,7 @@
           <w:lang w:val="uk-UA"/>
         </w:rPr>
         <w:ind w:left="567"/>
-        <w:spacing w:before="120" w:after="0" w:line="240" w:lineRule="auto"/>
+        <w:spacing w:before="120" w:after="0" w:line="276" w:lineRule="auto"/>
       </w:pPr>
       <w:r>
         <w:rPr>
@@ -18571,7 +18572,7 @@
           <w:lang w:val="uk-UA"/>
         </w:rPr>
         <w:ind w:left="567"/>
-        <w:spacing w:before="120" w:after="0" w:line="240" w:lineRule="auto"/>
+        <w:spacing w:before="120" w:after="0" w:line="276" w:lineRule="auto"/>
       </w:pPr>
       <w:r>
         <w:rPr>
@@ -18582,7 +18583,7 @@
           <w:szCs w:val="22"/>
           <w:lang w:val="uk-UA"/>
         </w:rPr>
-        <w:t>Fondement : Ordonnance de commission d'expert de la GSU SBU en date du 16/03/2021 dans le dossier n° 4201708000000002509.</w:t>
+        <w:t>Fondement : Ordonnance de commission d'expert de la GSU SBU en date du 16 mars 2021 dans le dossier n° 4201708000000002509.</w:t>
       </w:r>
       <w:r>
         <w:rPr>
@@ -18603,7 +18604,7 @@
           <w:lang w:val="uk-UA"/>
         </w:rPr>
         <w:ind w:left="567"/>
-        <w:spacing w:before="120" w:after="0" w:line="240" w:lineRule="auto"/>
+        <w:spacing w:before="120" w:after="0" w:line="276" w:lineRule="auto"/>
       </w:pPr>
       <w:r>
         <w:rPr>
@@ -18614,7 +18615,7 @@
           <w:szCs w:val="22"/>
           <w:lang w:val="uk-UA"/>
         </w:rPr>
-        <w:t>Conclusions : le montant des pertes subies par l'État par suite du manque à gagner lors de la privatisation des biens de Motor Sich en raison du défaut d'indexation des immobilisations corporelles au 01/08/1993 (constaté par le DASU) est confirmé à :</w:t>
+        <w:t>Conclusions : le montant des pertes subies par l'État par suite du manque à gagner lors de la privatisation des biens de Motor Sich en raison du défaut d'indexation des immobilisations corporelles au 1er août 1993 (constaté par le DASU) est confirmé à :</w:t>
       </w:r>
       <w:r>
         <w:rPr>
@@ -18639,16 +18640,16 @@
           <w:lang w:val="uk-UA"/>
         </w:rPr>
         <w:ind w:left="1134" w:hanging="567"/>
-        <w:spacing w:before="120" w:after="0" w:line="240" w:lineRule="auto"/>
-      </w:pPr>
-      <w:r>
-        <w:rPr>
-          <w:rFonts w:ascii="Cambria" w:hAnsi="Cambria" w:cs="Cambria"/>
-          <w:sz w:val="22"/>
-          <w:szCs w:val="22"/>
-          <w:lang w:val="uk-UA"/>
-        </w:rPr>
-        <w:t>93 528 150 UAH au 17/06/1994 ;</w:t>
+        <w:spacing w:before="120" w:after="0" w:line="276" w:lineRule="auto"/>
+      </w:pPr>
+      <w:r>
+        <w:rPr>
+          <w:rFonts w:ascii="Cambria" w:hAnsi="Cambria" w:cs="Cambria"/>
+          <w:sz w:val="22"/>
+          <w:szCs w:val="22"/>
+          <w:lang w:val="uk-UA"/>
+        </w:rPr>
+        <w:t>93 528 150 UAH au 17 juin 1994 ;</w:t>
       </w:r>
     </w:p>
     <w:p>
@@ -18665,16 +18666,16 @@
           <w:lang w:val="uk-UA"/>
         </w:rPr>
         <w:ind w:left="1134" w:hanging="567"/>
-        <w:spacing w:before="120" w:after="0" w:line="240" w:lineRule="auto"/>
-      </w:pPr>
-      <w:r>
-        <w:rPr>
-          <w:rFonts w:ascii="Cambria" w:hAnsi="Cambria" w:cs="Cambria"/>
-          <w:sz w:val="22"/>
-          <w:szCs w:val="22"/>
-          <w:lang w:val="uk-UA"/>
-        </w:rPr>
-        <w:t>18 054 252 860 UAH au 16/03/2021 (avec prise en compte des indices des prix à la consommation entre le 01/07/1994 et le 28/02/2021).</w:t>
+        <w:spacing w:before="120" w:after="0" w:line="276" w:lineRule="auto"/>
+      </w:pPr>
+      <w:r>
+        <w:rPr>
+          <w:rFonts w:ascii="Cambria" w:hAnsi="Cambria" w:cs="Cambria"/>
+          <w:sz w:val="22"/>
+          <w:szCs w:val="22"/>
+          <w:lang w:val="uk-UA"/>
+        </w:rPr>
+        <w:t>18 054 252 860 UAH au 16 mars 2021 (avec prise en compte des indices des prix à la consommation entre le 1er juillet 1994 et le 28 février 2021).</w:t>
       </w:r>
     </w:p>
     <w:p>
@@ -18691,7 +18692,7 @@
           <w:lang w:val="uk-UA"/>
         </w:rPr>
         <w:ind w:left="567" w:hanging="567"/>
-        <w:spacing w:before="120" w:after="0" w:line="240" w:lineRule="auto"/>
+        <w:spacing w:before="120" w:after="0" w:line="276" w:lineRule="auto"/>
       </w:pPr>
       <w:r>
         <w:rPr>
@@ -18721,7 +18722,7 @@
           <w:lang w:val="uk-UA"/>
         </w:rPr>
         <w:ind w:left="567"/>
-        <w:spacing w:before="120" w:after="0" w:line="240" w:lineRule="auto"/>
+        <w:spacing w:before="120" w:after="0" w:line="276" w:lineRule="auto"/>
       </w:pPr>
       <w:r>
         <w:rPr>
@@ -18829,16 +18830,16 @@
           <w:lang w:val="uk-UA"/>
         </w:rPr>
         <w:ind w:left="567" w:hanging="567"/>
-        <w:spacing w:before="120" w:after="0" w:line="240" w:lineRule="auto"/>
-      </w:pPr>
-      <w:r>
-        <w:rPr>
-          <w:rFonts w:ascii="Cambria" w:hAnsi="Cambria" w:cs="Cambria"/>
-          <w:sz w:val="22"/>
-          <w:szCs w:val="22"/>
-          <w:lang w:val="uk-UA"/>
-        </w:rPr>
-        <w:t>Procès-verbal d'examen d'un support flash par la Direction générale du SBU en date du 01/02/2025</w:t>
+        <w:spacing w:before="120" w:after="0" w:line="276" w:lineRule="auto"/>
+      </w:pPr>
+      <w:r>
+        <w:rPr>
+          <w:rFonts w:ascii="Cambria" w:hAnsi="Cambria" w:cs="Cambria"/>
+          <w:sz w:val="22"/>
+          <w:szCs w:val="22"/>
+          <w:lang w:val="uk-UA"/>
+        </w:rPr>
+        <w:t>Procès-verbal d'examen d'un support flash par la Direction générale du SBU en date du 1er février 2025</w:t>
       </w:r>
     </w:p>
     <w:p>
@@ -18851,7 +18852,7 @@
           <w:lang w:val="uk-UA"/>
         </w:rPr>
         <w:ind w:left="567"/>
-        <w:spacing w:before="120" w:after="0" w:line="240" w:lineRule="auto"/>
+        <w:spacing w:before="120" w:after="0" w:line="276" w:lineRule="auto"/>
       </w:pPr>
       <w:r>
         <w:rPr>
@@ -18961,7 +18962,7 @@
           <w:lang w:val="uk-UA"/>
         </w:rPr>
         <w:ind w:left="567"/>
-        <w:spacing w:before="120" w:after="0" w:line="240" w:lineRule="auto"/>
+        <w:spacing w:before="120" w:after="0" w:line="276" w:lineRule="auto"/>
       </w:pPr>
       <w:r>
         <w:rPr>
@@ -18989,7 +18990,7 @@
           <w:lang w:val="uk-UA"/>
         </w:rPr>
         <w:ind w:left="1134" w:hanging="567"/>
-        <w:spacing w:before="120" w:after="0" w:line="240" w:lineRule="auto"/>
+        <w:spacing w:before="120" w:after="0" w:line="276" w:lineRule="auto"/>
       </w:pPr>
       <w:r>
         <w:rPr>
@@ -19051,7 +19052,7 @@
           <w:lang w:val="uk-UA"/>
         </w:rPr>
         <w:ind w:left="1134" w:hanging="567"/>
-        <w:spacing w:before="120" w:after="0" w:line="240" w:lineRule="auto"/>
+        <w:spacing w:before="120" w:after="0" w:line="276" w:lineRule="auto"/>
       </w:pPr>
       <w:r>
         <w:rPr>
@@ -19077,7 +19078,7 @@
           <w:lang w:val="uk-UA"/>
         </w:rPr>
         <w:ind w:left="1134" w:hanging="567"/>
-        <w:spacing w:before="120" w:after="0" w:line="240" w:lineRule="auto"/>
+        <w:spacing w:before="120" w:after="0" w:line="276" w:lineRule="auto"/>
       </w:pPr>
       <w:r>
         <w:rPr>
@@ -19103,7 +19104,7 @@
           <w:lang w:val="uk-UA"/>
         </w:rPr>
         <w:ind w:hanging="513"/>
-        <w:spacing w:before="120" w:after="0" w:line="240" w:lineRule="auto"/>
+        <w:spacing w:before="120" w:after="0" w:line="276" w:lineRule="auto"/>
       </w:pPr>
       <w:r>
         <w:rPr>
@@ -19381,7 +19382,7 @@
           <w:lang w:val="uk-UA"/>
         </w:rPr>
         <w:ind w:hanging="513"/>
-        <w:spacing w:before="120" w:after="0" w:line="240" w:lineRule="auto"/>
+        <w:spacing w:before="120" w:after="0" w:line="276" w:lineRule="auto"/>
       </w:pPr>
       <w:r>
         <w:rPr>
@@ -19587,7 +19588,7 @@
           <w:lang w:val="uk-UA"/>
         </w:rPr>
         <w:ind w:hanging="513"/>
-        <w:spacing w:before="120" w:after="0" w:line="240" w:lineRule="auto"/>
+        <w:spacing w:before="120" w:after="0" w:line="276" w:lineRule="auto"/>
       </w:pPr>
       <w:r>
         <w:rPr>
@@ -19793,7 +19794,7 @@
           <w:lang w:val="uk-UA"/>
         </w:rPr>
         <w:ind w:hanging="513"/>
-        <w:spacing w:before="120" w:after="0" w:line="240" w:lineRule="auto"/>
+        <w:spacing w:before="120" w:after="0" w:line="276" w:lineRule="auto"/>
       </w:pPr>
       <w:r>
         <w:rPr>
@@ -19854,7 +19855,7 @@
           <w:szCs w:val="22"/>
           <w:lang w:val="uk-UA"/>
         </w:rPr>
-        <w:spacing w:before="120" w:after="0" w:line="240" w:lineRule="auto"/>
+        <w:spacing w:before="120" w:after="0" w:line="276" w:lineRule="auto"/>
       </w:pPr>
       <w:r>
         <w:rPr>
@@ -19933,7 +19934,7 @@
           <w:szCs w:val="22"/>
           <w:lang w:val="uk-UA"/>
         </w:rPr>
-        <w:spacing w:before="120" w:after="0" w:line="240" w:lineRule="auto"/>
+        <w:spacing w:before="120" w:after="0" w:line="276" w:lineRule="auto"/>
       </w:pPr>
       <w:r>
         <w:rPr>
@@ -20048,7 +20049,7 @@
           <w:szCs w:val="22"/>
           <w:lang w:val="uk-UA"/>
         </w:rPr>
-        <w:spacing w:before="120" w:after="0" w:line="240" w:lineRule="auto"/>
+        <w:spacing w:before="120" w:after="0" w:line="276" w:lineRule="auto"/>
       </w:pPr>
       <w:r>
         <w:rPr>
@@ -20523,7 +20524,7 @@
           <w:szCs w:val="22"/>
           <w:lang w:val="uk-UA"/>
         </w:rPr>
-        <w:spacing w:before="120" w:after="0" w:line="240" w:lineRule="auto"/>
+        <w:spacing w:before="120" w:after="0" w:line="276" w:lineRule="auto"/>
       </w:pPr>
       <w:r>
         <w:rPr>
@@ -20567,7 +20568,7 @@
           <w:lang w:val="uk-UA"/>
         </w:rPr>
         <w:ind w:hanging="513"/>
-        <w:spacing w:before="120" w:after="0" w:line="240" w:lineRule="auto"/>
+        <w:spacing w:before="120" w:after="0" w:line="276" w:lineRule="auto"/>
       </w:pPr>
       <w:r>
         <w:rPr>
@@ -20647,7 +20648,7 @@
           <w:lang w:val="uk-UA"/>
         </w:rPr>
         <w:ind w:hanging="513"/>
-        <w:spacing w:before="120" w:after="0" w:line="240" w:lineRule="auto"/>
+        <w:spacing w:before="120" w:after="0" w:line="276" w:lineRule="auto"/>
       </w:pPr>
       <w:r>
         <w:rPr>
@@ -20709,7 +20710,7 @@
           <w:lang w:val="uk-UA"/>
         </w:rPr>
         <w:ind w:hanging="513"/>
-        <w:spacing w:before="120" w:after="0" w:line="240" w:lineRule="auto"/>
+        <w:spacing w:before="120" w:after="0" w:line="276" w:lineRule="auto"/>
       </w:pPr>
       <w:r>
         <w:rPr>
@@ -20807,16 +20808,16 @@
           <w:lang w:val="uk-UA"/>
         </w:rPr>
         <w:ind w:left="567" w:hanging="567"/>
-        <w:spacing w:before="120" w:after="0" w:line="240" w:lineRule="auto"/>
-      </w:pPr>
-      <w:r>
-        <w:rPr>
-          <w:rFonts w:ascii="Cambria" w:hAnsi="Cambria" w:cs="Cambria"/>
-          <w:sz w:val="22"/>
-          <w:szCs w:val="22"/>
-          <w:lang w:val="uk-UA"/>
-        </w:rPr>
-        <w:t>Procès-verbal d'examen de pièces par l'enquêteur du SBU en date du 05/05/2025</w:t>
+        <w:spacing w:before="120" w:after="0" w:line="276" w:lineRule="auto"/>
+      </w:pPr>
+      <w:r>
+        <w:rPr>
+          <w:rFonts w:ascii="Cambria" w:hAnsi="Cambria" w:cs="Cambria"/>
+          <w:sz w:val="22"/>
+          <w:szCs w:val="22"/>
+          <w:lang w:val="uk-UA"/>
+        </w:rPr>
+        <w:t>Procès-verbal d'examen de pièces par l'enquêteur du SBU en date du 5 mai 2025</w:t>
       </w:r>
     </w:p>
     <w:p>
@@ -20829,7 +20830,7 @@
           <w:lang w:val="uk-UA"/>
         </w:rPr>
         <w:ind w:left="567"/>
-        <w:spacing w:before="120" w:after="0" w:line="240" w:lineRule="auto"/>
+        <w:spacing w:before="120" w:after="0" w:line="276" w:lineRule="auto"/>
       </w:pPr>
       <w:r>
         <w:rPr>
@@ -20905,7 +20906,7 @@
           <w:lang w:val="uk-UA"/>
         </w:rPr>
         <w:ind w:left="567"/>
-        <w:spacing w:before="120" w:after="0" w:line="240" w:lineRule="auto"/>
+        <w:spacing w:before="120" w:after="0" w:line="276" w:lineRule="auto"/>
       </w:pPr>
       <w:r>
         <w:rPr>
@@ -20941,7 +20942,7 @@
           <w:lang w:val="uk-UA"/>
         </w:rPr>
         <w:ind w:left="1134" w:hanging="567"/>
-        <w:spacing w:before="120" w:after="0" w:line="240" w:lineRule="auto"/>
+        <w:spacing w:before="120" w:after="0" w:line="276" w:lineRule="auto"/>
       </w:pPr>
       <w:r>
         <w:rPr>
@@ -21039,7 +21040,7 @@
           <w:lang w:val="uk-UA"/>
         </w:rPr>
         <w:ind w:left="1134" w:hanging="567"/>
-        <w:spacing w:before="120" w:after="0" w:line="240" w:lineRule="auto"/>
+        <w:spacing w:before="120" w:after="0" w:line="276" w:lineRule="auto"/>
       </w:pPr>
       <w:r>
         <w:rPr>
@@ -21065,7 +21066,7 @@
           <w:lang w:val="uk-UA"/>
         </w:rPr>
         <w:ind w:left="1134" w:hanging="567"/>
-        <w:spacing w:before="120" w:after="0" w:line="240" w:lineRule="auto"/>
+        <w:spacing w:before="120" w:after="0" w:line="276" w:lineRule="auto"/>
       </w:pPr>
       <w:r>
         <w:rPr>
@@ -21091,7 +21092,7 @@
           <w:lang w:val="uk-UA"/>
         </w:rPr>
         <w:ind w:left="1134" w:hanging="567"/>
-        <w:spacing w:before="120" w:after="0" w:line="240" w:lineRule="auto"/>
+        <w:spacing w:before="120" w:after="0" w:line="276" w:lineRule="auto"/>
       </w:pPr>
       <w:r>
         <w:rPr>
@@ -21189,7 +21190,7 @@
           <w:lang w:val="uk-UA"/>
         </w:rPr>
         <w:ind w:left="1134" w:hanging="567"/>
-        <w:spacing w:before="120" w:after="0" w:line="240" w:lineRule="auto"/>
+        <w:spacing w:before="120" w:after="0" w:line="276" w:lineRule="auto"/>
       </w:pPr>
       <w:r>
         <w:rPr>
@@ -21341,7 +21342,7 @@
           <w:lang w:val="uk-UA"/>
         </w:rPr>
         <w:ind w:left="567" w:hanging="567"/>
-        <w:spacing w:before="120" w:after="0" w:line="240" w:lineRule="auto"/>
+        <w:spacing w:before="120" w:after="0" w:line="276" w:lineRule="auto"/>
       </w:pPr>
       <w:r>
         <w:rPr>
@@ -21385,7 +21386,7 @@
           <w:lang w:val="uk-UA"/>
         </w:rPr>
         <w:ind w:left="567" w:hanging="567"/>
-        <w:spacing w:before="120" w:after="0" w:line="240" w:lineRule="auto"/>
+        <w:spacing w:before="120" w:after="0" w:line="276" w:lineRule="auto"/>
       </w:pPr>
       <w:r>
         <w:rPr>
@@ -21411,7 +21412,7 @@
           <w:lang w:val="uk-UA"/>
         </w:rPr>
         <w:ind w:left="567" w:hanging="567"/>
-        <w:spacing w:before="120" w:after="0" w:line="240" w:lineRule="auto"/>
+        <w:spacing w:before="120" w:after="0" w:line="276" w:lineRule="auto"/>
       </w:pPr>
       <w:r>
         <w:rPr>
@@ -21437,7 +21438,7 @@
           <w:lang w:val="uk-UA"/>
         </w:rPr>
         <w:ind w:left="1134" w:hanging="425"/>
-        <w:spacing w:before="120" w:after="0" w:line="240" w:lineRule="auto"/>
+        <w:spacing w:before="120" w:after="0" w:line="276" w:lineRule="auto"/>
       </w:pPr>
       <w:proofErr w:type="spellStart"/>
       <w:r>
@@ -21712,7 +21713,7 @@
           <w:lang w:val="uk-UA"/>
         </w:rPr>
         <w:ind w:left="1134" w:hanging="425"/>
-        <w:spacing w:before="120" w:after="0" w:line="240" w:lineRule="auto"/>
+        <w:spacing w:before="120" w:after="0" w:line="276" w:lineRule="auto"/>
       </w:pPr>
       <w:proofErr w:type="spellStart"/>
       <w:r>
@@ -21982,7 +21983,7 @@
           <w:szCs w:val="22"/>
           <w:lang w:val="uk-UA"/>
         </w:rPr>
-        <w:spacing w:before="120" w:after="0" w:line="240" w:lineRule="auto"/>
+        <w:spacing w:before="120" w:after="0" w:line="276" w:lineRule="auto"/>
       </w:pPr>
     </w:p>
     <w:p>
@@ -21995,7 +21996,7 @@
           <w:szCs w:val="22"/>
           <w:lang w:val="uk-UA"/>
         </w:rPr>
-        <w:spacing w:before="120" w:after="0" w:line="240" w:lineRule="auto"/>
+        <w:spacing w:before="120" w:after="0" w:line="276" w:lineRule="auto"/>
       </w:pPr>
       <w:r>
         <w:rPr>
@@ -22023,7 +22024,7 @@
           <w:lang w:val="uk-UA"/>
         </w:rPr>
         <w:ind w:left="567" w:hanging="567"/>
-        <w:spacing w:before="120" w:after="0" w:line="240" w:lineRule="auto"/>
+        <w:spacing w:before="120" w:after="0" w:line="276" w:lineRule="auto"/>
       </w:pPr>
       <w:r>
         <w:rPr>
@@ -22049,7 +22050,7 @@
           <w:lang w:val="uk-UA"/>
         </w:rPr>
         <w:ind w:left="567" w:hanging="567"/>
-        <w:spacing w:before="120" w:after="0" w:line="240" w:lineRule="auto"/>
+        <w:spacing w:before="120" w:after="0" w:line="276" w:lineRule="auto"/>
       </w:pPr>
       <w:r>
         <w:rPr>
@@ -22089,7 +22090,7 @@
           <w:lang w:val="uk-UA"/>
         </w:rPr>
         <w:ind w:left="567"/>
-        <w:spacing w:before="120" w:after="0" w:line="240" w:lineRule="auto"/>
+        <w:spacing w:before="120" w:after="0" w:line="276" w:lineRule="auto"/>
       </w:pPr>
       <w:r>
         <w:rPr>
@@ -22125,7 +22126,7 @@
           <w:lang w:val="uk-UA"/>
         </w:rPr>
         <w:ind w:left="1134" w:hanging="567"/>
-        <w:spacing w:before="120" w:after="0" w:line="240" w:lineRule="auto"/>
+        <w:spacing w:before="120" w:after="0" w:line="276" w:lineRule="auto"/>
       </w:pPr>
       <w:r>
         <w:rPr>
@@ -22349,7 +22350,7 @@
           <w:lang w:val="uk-UA"/>
         </w:rPr>
         <w:ind w:left="1134" w:hanging="567"/>
-        <w:spacing w:before="120" w:after="0" w:line="240" w:lineRule="auto"/>
+        <w:spacing w:before="120" w:after="0" w:line="276" w:lineRule="auto"/>
       </w:pPr>
       <w:r>
         <w:rPr>
@@ -22375,7 +22376,7 @@
           <w:lang w:val="uk-UA"/>
         </w:rPr>
         <w:ind w:left="1134" w:hanging="567"/>
-        <w:spacing w:before="120" w:after="0" w:line="240" w:lineRule="auto"/>
+        <w:spacing w:before="120" w:after="0" w:line="276" w:lineRule="auto"/>
       </w:pPr>
       <w:r>
         <w:rPr>
@@ -22653,7 +22654,7 @@
           <w:lang w:val="uk-UA"/>
         </w:rPr>
         <w:ind w:left="567" w:hanging="567"/>
-        <w:spacing w:before="120" w:after="0" w:line="240" w:lineRule="auto"/>
+        <w:spacing w:before="120" w:after="0" w:line="276" w:lineRule="auto"/>
       </w:pPr>
       <w:r>
         <w:rPr>
@@ -22705,7 +22706,7 @@
           <w:lang w:val="uk-UA"/>
         </w:rPr>
         <w:ind w:left="567" w:hanging="567"/>
-        <w:spacing w:before="120" w:after="0" w:line="240" w:lineRule="auto"/>
+        <w:spacing w:before="120" w:after="0" w:line="276" w:lineRule="auto"/>
       </w:pPr>
       <w:r>
         <w:rPr>
@@ -22749,7 +22750,7 @@
           <w:lang w:val="uk-UA"/>
         </w:rPr>
         <w:ind w:left="1134" w:hanging="567"/>
-        <w:spacing w:before="120" w:after="0" w:line="240" w:lineRule="auto"/>
+        <w:spacing w:before="120" w:after="0" w:line="276" w:lineRule="auto"/>
       </w:pPr>
       <w:r>
         <w:rPr>
@@ -22793,7 +22794,7 @@
           <w:lang w:val="uk-UA"/>
         </w:rPr>
         <w:ind w:left="1134" w:hanging="567"/>
-        <w:spacing w:before="120" w:after="0" w:line="240" w:lineRule="auto"/>
+        <w:spacing w:before="120" w:after="0" w:line="276" w:lineRule="auto"/>
       </w:pPr>
       <w:r>
         <w:rPr>
@@ -22819,7 +22820,7 @@
           <w:lang w:val="uk-UA"/>
         </w:rPr>
         <w:ind w:left="426" w:hanging="426"/>
-        <w:spacing w:before="120" w:after="0" w:line="240" w:lineRule="auto"/>
+        <w:spacing w:before="120" w:after="0" w:line="276" w:lineRule="auto"/>
       </w:pPr>
       <w:r>
         <w:rPr>
@@ -22841,7 +22842,7 @@
           <w:lang w:val="uk-UA"/>
         </w:rPr>
         <w:ind w:left="426"/>
-        <w:spacing w:before="120" w:after="0" w:line="240" w:lineRule="auto"/>
+        <w:spacing w:before="120" w:after="0" w:line="276" w:lineRule="auto"/>
       </w:pPr>
       <w:r>
         <w:rPr>
@@ -22877,7 +22878,7 @@
           <w:lang w:val="uk-UA"/>
         </w:rPr>
         <w:ind w:left="1134" w:hanging="567"/>
-        <w:spacing w:before="120" w:after="0" w:line="240" w:lineRule="auto"/>
+        <w:spacing w:before="120" w:after="0" w:line="276" w:lineRule="auto"/>
       </w:pPr>
       <w:r>
         <w:rPr>
@@ -22911,7 +22912,7 @@
           <w:lang w:val="uk-UA"/>
         </w:rPr>
         <w:ind w:left="1134" w:hanging="567"/>
-        <w:spacing w:before="120" w:after="0" w:line="240" w:lineRule="auto"/>
+        <w:spacing w:before="120" w:after="0" w:line="276" w:lineRule="auto"/>
       </w:pPr>
       <w:r>
         <w:rPr>
@@ -22955,7 +22956,7 @@
           <w:lang w:val="uk-UA"/>
         </w:rPr>
         <w:ind w:left="1134" w:hanging="567"/>
-        <w:spacing w:before="120" w:after="0" w:line="240" w:lineRule="auto"/>
+        <w:spacing w:before="120" w:after="0" w:line="276" w:lineRule="auto"/>
       </w:pPr>
       <w:r>
         <w:rPr>
@@ -22981,7 +22982,7 @@
           <w:lang w:val="uk-UA"/>
         </w:rPr>
         <w:ind w:left="567" w:hanging="567"/>
-        <w:spacing w:before="120" w:after="0" w:line="240" w:lineRule="auto"/>
+        <w:spacing w:before="120" w:after="0" w:line="276" w:lineRule="auto"/>
       </w:pPr>
       <w:r>
         <w:rPr>
@@ -23017,11 +23018,12 @@
           <w:lang w:val="uk-UA"/>
         </w:rPr>
         <w:ind w:left="567"/>
-        <w:spacing w:before="120" w:after="0" w:line="240" w:lineRule="auto"/>
+        <w:spacing w:before="120" w:after="0" w:line="276" w:lineRule="auto"/>
       </w:pPr>
     </w:p>
     <w:sectPr>
       <w:footerReference w:type="default" r:id="rId15"/>
+      <w:headerReference w:type="default" r:id="rId18"/>
       <w:pgSz w:w="11906" w:h="16838"/>
       <w:pgMar w:top="567" w:right="1134" w:bottom="1134" w:left="2126" w:header="709" w:footer="709" w:gutter="0"/>
       <w:cols w:space="708"/>
@@ -23125,6 +23127,16 @@
     </w:p>
   </w:footnote>
 </w:footnotes>
+</file>
+
+<file path=word/header1.xml><?xml version="1.0" encoding="utf-8"?>
+<w:hdr xmlns:m="http://schemas.openxmlformats.org/officeDocument/2006/math" xmlns:mc="http://schemas.openxmlformats.org/markup-compatibility/2006" xmlns:mo="http://schemas.microsoft.com/office/mac/office/2008/main" xmlns:mv="urn:schemas-microsoft-com:mac:vml" xmlns:o="urn:schemas-microsoft-com:office:office" xmlns:r="http://schemas.openxmlformats.org/officeDocument/2006/relationships" xmlns:v="urn:schemas-microsoft-com:vml" xmlns:w10="urn:schemas-microsoft-com:office:word" xmlns:w14="http://schemas.microsoft.com/office/word/2010/wordml" xmlns:w="http://schemas.openxmlformats.org/wordprocessingml/2006/main" xmlns:wne="http://schemas.microsoft.com/office/word/2006/wordml" xmlns:wp14="http://schemas.microsoft.com/office/word/2010/wordprocessingDrawing" xmlns:wp="http://schemas.openxmlformats.org/drawingml/2006/wordprocessingDrawing" xmlns:wpc="http://schemas.microsoft.com/office/word/2010/wordprocessingCanvas" xmlns:wpg="http://schemas.microsoft.com/office/word/2010/wordprocessingGroup" xmlns:wpi="http://schemas.microsoft.com/office/word/2010/wordprocessingInk" xmlns:wps="http://schemas.microsoft.com/office/word/2010/wordprocessingShape" mc:Ignorable="w14 wp14">
+  <w:p>
+    <w:pPr>
+      <w:pStyle w:val="Header"/>
+    </w:pPr>
+  </w:p>
+</w:hdr>
 </file>
 
 <file path=word/numbering.xml><?xml version="1.0" encoding="utf-8"?>
@@ -30421,7 +30433,7 @@
     <w:qFormat/>
     <w:rsid w:val="00C54299"/>
     <w:pPr>
-      <w:spacing w:before="120" w:after="0" w:line="240" w:lineRule="auto"/>
+      <w:spacing w:before="120" w:after="0" w:line="276" w:lineRule="auto"/>
     </w:pPr>
     <w:rPr>
       <w:rFonts w:ascii="Cambria" w:hAnsi="Cambria" w:cstheme="majorBidi"/>
@@ -30574,7 +30586,7 @@
     <w:pPr>
       <w:ind w:left="720"/>
       <w:contextualSpacing/>
-      <w:spacing w:before="120" w:after="0" w:line="240" w:lineRule="auto"/>
+      <w:spacing w:before="120" w:after="0" w:line="276" w:lineRule="auto"/>
     </w:pPr>
     <w:rPr>
       <w:rFonts w:ascii="Cambria" w:hAnsi="Cambria"/>

</xml_diff>